<commit_message>
added versin change to SDD
</commit_message>
<xml_diff>
--- a/Documentation/Phase 2/CS 401 - Group 2 - SDD Doc.docx
+++ b/Documentation/Phase 2/CS 401 - Group 2 - SDD Doc.docx
@@ -953,6 +953,13 @@
                 <w:u w:val="single"/>
               </w:rPr>
             </w:pPr>
+            <w:r>
+              <w:rPr>
+                <w:color w:val="000000"/>
+                <w:u w:val="single"/>
+              </w:rPr>
+              <w:t>4/08/2026</w:t>
+            </w:r>
           </w:p>
         </w:tc>
         <w:tc>
@@ -973,6 +980,12 @@
                 <w:color w:val="000000"/>
               </w:rPr>
             </w:pPr>
+            <w:r>
+              <w:rPr>
+                <w:color w:val="000000"/>
+              </w:rPr>
+              <w:t>1.6</w:t>
+            </w:r>
           </w:p>
         </w:tc>
         <w:tc>
@@ -993,6 +1006,12 @@
                 <w:color w:val="000000"/>
               </w:rPr>
             </w:pPr>
+            <w:r>
+              <w:rPr>
+                <w:color w:val="000000"/>
+              </w:rPr>
+              <w:t>Completed Architecture section</w:t>
+            </w:r>
           </w:p>
         </w:tc>
         <w:tc>
@@ -1014,6 +1033,12 @@
                 <w:color w:val="000000"/>
               </w:rPr>
             </w:pPr>
+            <w:r>
+              <w:rPr>
+                <w:color w:val="000000"/>
+              </w:rPr>
+              <w:t>Paul Cooper</w:t>
+            </w:r>
           </w:p>
         </w:tc>
       </w:tr>
@@ -2484,21 +2509,7 @@
         <w:rPr>
           <w:color w:val="000000"/>
         </w:rPr>
-        <w:t xml:space="preserve">This software design document provides </w:t>
-      </w:r>
-      <w:proofErr w:type="gramStart"/>
-      <w:r>
-        <w:rPr>
-          <w:color w:val="000000"/>
-        </w:rPr>
-        <w:t>a</w:t>
-      </w:r>
-      <w:proofErr w:type="gramEnd"/>
-      <w:r>
-        <w:rPr>
-          <w:color w:val="000000"/>
-        </w:rPr>
-        <w:t xml:space="preserve"> architectural overview for the Blackjack Handling System (BHS).</w:t>
+        <w:t>This software design document provides a architectural overview for the Blackjack Handling System (BHS).</w:t>
       </w:r>
     </w:p>
     <w:p>
@@ -2582,21 +2593,7 @@
         <w:rPr>
           <w:color w:val="000000"/>
         </w:rPr>
-        <w:t xml:space="preserve">Dealer: A specialized user role with the added ability to operate as a dealer for the games and the configurator of game parameters when creating joinable tables for blackjack, deals cards in accordance </w:t>
-      </w:r>
-      <w:proofErr w:type="gramStart"/>
-      <w:r>
-        <w:rPr>
-          <w:color w:val="000000"/>
-        </w:rPr>
-        <w:t>to</w:t>
-      </w:r>
-      <w:proofErr w:type="gramEnd"/>
-      <w:r>
-        <w:rPr>
-          <w:color w:val="000000"/>
-        </w:rPr>
-        <w:t xml:space="preserve"> standard blackjack rules</w:t>
+        <w:t>Dealer: A specialized user role with the added ability to operate as a dealer for the games and the configurator of game parameters when creating joinable tables for blackjack, deals cards in accordance to standard blackjack rules</w:t>
       </w:r>
     </w:p>
     <w:p>
@@ -2761,21 +2758,7 @@
         <w:rPr>
           <w:color w:val="000000"/>
         </w:rPr>
-        <w:t xml:space="preserve">Bet: </w:t>
-      </w:r>
-      <w:proofErr w:type="gramStart"/>
-      <w:r>
-        <w:rPr>
-          <w:color w:val="000000"/>
-        </w:rPr>
-        <w:t>A number of</w:t>
-      </w:r>
-      <w:proofErr w:type="gramEnd"/>
-      <w:r>
-        <w:rPr>
-          <w:color w:val="000000"/>
-        </w:rPr>
-        <w:t xml:space="preserve"> credits submitted by a player before being dealt hands to start playing the game</w:t>
+        <w:t>Bet: A number of credits submitted by a player before being dealt hands to start playing the game</w:t>
       </w:r>
     </w:p>
     <w:p>
@@ -2790,35 +2773,7 @@
         <w:rPr>
           <w:color w:val="000000"/>
         </w:rPr>
-        <w:t xml:space="preserve">Timer: A countdown for the time players </w:t>
-      </w:r>
-      <w:proofErr w:type="gramStart"/>
-      <w:r>
-        <w:rPr>
-          <w:color w:val="000000"/>
-        </w:rPr>
-        <w:t>have</w:t>
-      </w:r>
-      <w:proofErr w:type="gramEnd"/>
-      <w:r>
-        <w:rPr>
-          <w:color w:val="000000"/>
-        </w:rPr>
-        <w:t xml:space="preserve"> to </w:t>
-      </w:r>
-      <w:proofErr w:type="gramStart"/>
-      <w:r>
-        <w:rPr>
-          <w:color w:val="000000"/>
-        </w:rPr>
-        <w:t>take action</w:t>
-      </w:r>
-      <w:proofErr w:type="gramEnd"/>
-      <w:r>
-        <w:rPr>
-          <w:color w:val="000000"/>
-        </w:rPr>
-        <w:t xml:space="preserve"> in a round of the game</w:t>
+        <w:t>Timer: A countdown for the time players have to take action in a round of the game</w:t>
       </w:r>
     </w:p>
     <w:p>
@@ -2939,21 +2894,7 @@
         <w:rPr>
           <w:color w:val="000000"/>
         </w:rPr>
-        <w:t xml:space="preserve">Stand: When a player </w:t>
-      </w:r>
-      <w:proofErr w:type="gramStart"/>
-      <w:r>
-        <w:rPr>
-          <w:color w:val="000000"/>
-        </w:rPr>
-        <w:t>signals</w:t>
-      </w:r>
-      <w:proofErr w:type="gramEnd"/>
-      <w:r>
-        <w:rPr>
-          <w:color w:val="000000"/>
-        </w:rPr>
-        <w:t xml:space="preserve"> they don’t want any additional cards dealt to them during the current round.</w:t>
+        <w:t>Stand: When a player signals they don’t want any additional cards dealt to them during the current round.</w:t>
       </w:r>
     </w:p>
     <w:p>
@@ -2983,35 +2924,7 @@
         <w:rPr>
           <w:color w:val="000000"/>
         </w:rPr>
-        <w:t xml:space="preserve">Split: When a player has matching cards, they can pay to have their hand divided into two separate hands. The dealer will then </w:t>
-      </w:r>
-      <w:proofErr w:type="gramStart"/>
-      <w:r>
-        <w:rPr>
-          <w:color w:val="000000"/>
-        </w:rPr>
-        <w:t>deal</w:t>
-      </w:r>
-      <w:proofErr w:type="gramEnd"/>
-      <w:r>
-        <w:rPr>
-          <w:color w:val="000000"/>
-        </w:rPr>
-        <w:t xml:space="preserve"> each </w:t>
-      </w:r>
-      <w:proofErr w:type="gramStart"/>
-      <w:r>
-        <w:rPr>
-          <w:color w:val="000000"/>
-        </w:rPr>
-        <w:t>hand</w:t>
-      </w:r>
-      <w:proofErr w:type="gramEnd"/>
-      <w:r>
-        <w:rPr>
-          <w:color w:val="000000"/>
-        </w:rPr>
-        <w:t xml:space="preserve"> an additional card to bring the total cards in each hand to two.</w:t>
+        <w:t>Split: When a player has matching cards, they can pay to have their hand divided into two separate hands. The dealer will then deal each hand an additional card to bring the total cards in each hand to two.</w:t>
       </w:r>
     </w:p>
     <w:p>
@@ -3116,21 +3029,7 @@
         <w:rPr>
           <w:color w:val="000000"/>
         </w:rPr>
-        <w:t xml:space="preserve">Shuffling: when the order of the cards in the shoe </w:t>
-      </w:r>
-      <w:proofErr w:type="gramStart"/>
-      <w:r>
-        <w:rPr>
-          <w:color w:val="000000"/>
-        </w:rPr>
-        <w:t>are</w:t>
-      </w:r>
-      <w:proofErr w:type="gramEnd"/>
-      <w:r>
-        <w:rPr>
-          <w:color w:val="000000"/>
-        </w:rPr>
-        <w:t xml:space="preserve"> randomized.</w:t>
+        <w:t>Shuffling: when the order of the cards in the shoe are randomized.</w:t>
       </w:r>
     </w:p>
     <w:p>
@@ -3537,21 +3436,7 @@
         <w:rPr>
           <w:color w:val="000000"/>
         </w:rPr>
-        <w:t xml:space="preserve">Each table will be given a unique ID. It will also have a unique dealer, and a list of payer ID that can constantly change ass players join and leave the table. Each table will have specific in-game settings that the dealer sets up as the table is created. These include the minimum and maximum bets, the game timer that limits how long each play </w:t>
-      </w:r>
-      <w:proofErr w:type="gramStart"/>
-      <w:r>
-        <w:rPr>
-          <w:color w:val="000000"/>
-        </w:rPr>
-        <w:t>has to</w:t>
-      </w:r>
-      <w:proofErr w:type="gramEnd"/>
-      <w:r>
-        <w:rPr>
-          <w:color w:val="000000"/>
-        </w:rPr>
-        <w:t xml:space="preserve"> perform an action during their turn, and the number of decks the shoe will contain for that table.</w:t>
+        <w:t>Each table will be given a unique ID. It will also have a unique dealer, and a list of payer ID that can constantly change ass players join and leave the table. Each table will have specific in-game settings that the dealer sets up as the table is created. These include the minimum and maximum bets, the game timer that limits how long each play has to perform an action during their turn, and the number of decks the shoe will contain for that table.</w:t>
       </w:r>
     </w:p>
     <w:p>
@@ -3598,35 +3483,7 @@
         <w:rPr>
           <w:color w:val="000000"/>
         </w:rPr>
-        <w:t xml:space="preserve">The game will contain the shoe. Depending on how many decks the shoe contains, it will start with a shuffled list of cards equal to the number of decks times 52. The cards are </w:t>
-      </w:r>
-      <w:proofErr w:type="gramStart"/>
-      <w:r>
-        <w:rPr>
-          <w:color w:val="000000"/>
-        </w:rPr>
-        <w:t>dealt</w:t>
-      </w:r>
-      <w:proofErr w:type="gramEnd"/>
-      <w:r>
-        <w:rPr>
-          <w:color w:val="000000"/>
-        </w:rPr>
-        <w:t xml:space="preserve"> one at a time to each player as called for depending on the current in-game state and player or dealer requests. When a card is </w:t>
-      </w:r>
-      <w:proofErr w:type="gramStart"/>
-      <w:r>
-        <w:rPr>
-          <w:color w:val="000000"/>
-        </w:rPr>
-        <w:t>dealt</w:t>
-      </w:r>
-      <w:proofErr w:type="gramEnd"/>
-      <w:r>
-        <w:rPr>
-          <w:color w:val="000000"/>
-        </w:rPr>
-        <w:t>, it is removed from the shoe and added to one of the active hands. One the round is completed, all cards in any hand are discarded and a new set of cards is dealt from the shoe. When the shoe has only 60 cards remaining in it, the current round of hands is completed and then all discarded cards are returned to the shoe and the shoe is shuffled.</w:t>
+        <w:t>The game will contain the shoe. Depending on how many decks the shoe contains, it will start with a shuffled list of cards equal to the number of decks times 52. The cards are dealt one at a time to each player as called for depending on the current in-game state and player or dealer requests. When a card is dealt, it is removed from the shoe and added to one of the active hands. One the round is completed, all cards in any hand are discarded and a new set of cards is dealt from the shoe. When the shoe has only 60 cards remaining in it, the current round of hands is completed and then all discarded cards are returned to the shoe and the shoe is shuffled.</w:t>
       </w:r>
     </w:p>
     <w:p>
@@ -4077,21 +3934,7 @@
           <w:color w:val="000000"/>
         </w:rPr>
         <w:br/>
-        <w:t xml:space="preserve">The GUI dynamically adjusts available controls and views depending on whether the user is a player or dealer. This ensures users only see relevant actions and </w:t>
-      </w:r>
-      <w:proofErr w:type="gramStart"/>
-      <w:r>
-        <w:rPr>
-          <w:color w:val="000000"/>
-        </w:rPr>
-        <w:t>reduces</w:t>
-      </w:r>
-      <w:proofErr w:type="gramEnd"/>
-      <w:r>
-        <w:rPr>
-          <w:color w:val="000000"/>
-        </w:rPr>
-        <w:t xml:space="preserve"> complexity during interaction. </w:t>
+        <w:t xml:space="preserve">The GUI dynamically adjusts available controls and views depending on whether the user is a player or dealer. This ensures users only see relevant actions and reduces complexity during interaction. </w:t>
       </w:r>
     </w:p>
     <w:p>
@@ -4665,19 +4508,11 @@
           <w:color w:val="000000"/>
         </w:rPr>
       </w:pPr>
-      <w:proofErr w:type="gramStart"/>
-      <w:r>
-        <w:rPr>
-          <w:color w:val="000000"/>
-        </w:rPr>
-        <w:t>Allows</w:t>
-      </w:r>
-      <w:proofErr w:type="gramEnd"/>
-      <w:r>
-        <w:rPr>
-          <w:color w:val="000000"/>
-        </w:rPr>
-        <w:t xml:space="preserve"> players to join tables or navigate to other system features </w:t>
+      <w:r>
+        <w:rPr>
+          <w:color w:val="000000"/>
+        </w:rPr>
+        <w:t xml:space="preserve">Allows players to join tables or navigate to other system features </w:t>
       </w:r>
     </w:p>
     <w:p>
@@ -5194,21 +5029,7 @@
         <w:rPr>
           <w:color w:val="000000"/>
         </w:rPr>
-        <w:t xml:space="preserve">The layout mirrors a real blackjack table, with player positioning indicating turn order and interaction flow. The difference for the dealer-sided flow of logging in is that they will immediately </w:t>
-      </w:r>
-      <w:proofErr w:type="gramStart"/>
-      <w:r>
-        <w:rPr>
-          <w:color w:val="000000"/>
-        </w:rPr>
-        <w:t>be met</w:t>
-      </w:r>
-      <w:proofErr w:type="gramEnd"/>
-      <w:r>
-        <w:rPr>
-          <w:color w:val="000000"/>
-        </w:rPr>
-        <w:t xml:space="preserve"> with the table screen, first in a settings configuration setup with adjustable parameters, then as a table upon completing the configuration.</w:t>
+        <w:t>The layout mirrors a real blackjack table, with player positioning indicating turn order and interaction flow. The difference for the dealer-sided flow of logging in is that they will immediately be met with the table screen, first in a settings configuration setup with adjustable parameters, then as a table upon completing the configuration.</w:t>
       </w:r>
     </w:p>
     <w:p>
@@ -5323,21 +5144,7 @@
           <w:color w:val="000000"/>
         </w:rPr>
         <w:tab/>
-        <w:t xml:space="preserve">The graphical user interface is organized using a modular, panel-based structure that supports dynamic content updates and separation of concerns between different functional areas. Each primary screen (login, lobby, and table) is composed of reusable interface regions that can be updated or replaced without requiring a full screen transition. This allows the client to respond efficiently to real-time updates from the server while maintaining </w:t>
-      </w:r>
-      <w:proofErr w:type="gramStart"/>
-      <w:r>
-        <w:rPr>
-          <w:color w:val="000000"/>
-        </w:rPr>
-        <w:t>a consistent</w:t>
-      </w:r>
-      <w:proofErr w:type="gramEnd"/>
-      <w:r>
-        <w:rPr>
-          <w:color w:val="000000"/>
-        </w:rPr>
-        <w:t xml:space="preserve"> user experience.</w:t>
+        <w:t>The graphical user interface is organized using a modular, panel-based structure that supports dynamic content updates and separation of concerns between different functional areas. Each primary screen (login, lobby, and table) is composed of reusable interface regions that can be updated or replaced without requiring a full screen transition. This allows the client to respond efficiently to real-time updates from the server while maintaining a consistent user experience.</w:t>
       </w:r>
     </w:p>
     <w:p>
@@ -5754,17 +5561,8 @@
                               <w:rStyle w:val="PageNumber"/>
                               <w:color w:val="000000"/>
                             </w:rPr>
-                            <w:t>i</w:t>
+                            <w:t>ii</w:t>
                           </w:r>
-                          <w:proofErr w:type="spellStart"/>
-                          <w:r>
-                            <w:rPr>
-                              <w:rStyle w:val="PageNumber"/>
-                              <w:color w:val="000000"/>
-                            </w:rPr>
-                            <w:t>i</w:t>
-                          </w:r>
-                          <w:proofErr w:type="spellEnd"/>
                           <w:r>
                             <w:rPr>
                               <w:rStyle w:val="PageNumber"/>
@@ -5819,17 +5617,8 @@
                         <w:rStyle w:val="PageNumber"/>
                         <w:color w:val="000000"/>
                       </w:rPr>
-                      <w:t>i</w:t>
+                      <w:t>ii</w:t>
                     </w:r>
-                    <w:proofErr w:type="spellStart"/>
-                    <w:r>
-                      <w:rPr>
-                        <w:rStyle w:val="PageNumber"/>
-                        <w:color w:val="000000"/>
-                      </w:rPr>
-                      <w:t>i</w:t>
-                    </w:r>
-                    <w:proofErr w:type="spellEnd"/>
                     <w:r>
                       <w:rPr>
                         <w:rStyle w:val="PageNumber"/>
@@ -5937,17 +5726,8 @@
                               <w:rStyle w:val="PageNumber"/>
                               <w:color w:val="000000"/>
                             </w:rPr>
-                            <w:t>i</w:t>
+                            <w:t>ii</w:t>
                           </w:r>
-                          <w:proofErr w:type="spellStart"/>
-                          <w:r>
-                            <w:rPr>
-                              <w:rStyle w:val="PageNumber"/>
-                              <w:color w:val="000000"/>
-                            </w:rPr>
-                            <w:t>i</w:t>
-                          </w:r>
-                          <w:proofErr w:type="spellEnd"/>
                           <w:r>
                             <w:rPr>
                               <w:rStyle w:val="PageNumber"/>
@@ -6002,17 +5782,8 @@
                         <w:rStyle w:val="PageNumber"/>
                         <w:color w:val="000000"/>
                       </w:rPr>
-                      <w:t>i</w:t>
+                      <w:t>ii</w:t>
                     </w:r>
-                    <w:proofErr w:type="spellStart"/>
-                    <w:r>
-                      <w:rPr>
-                        <w:rStyle w:val="PageNumber"/>
-                        <w:color w:val="000000"/>
-                      </w:rPr>
-                      <w:t>i</w:t>
-                    </w:r>
-                    <w:proofErr w:type="spellEnd"/>
                     <w:r>
                       <w:rPr>
                         <w:rStyle w:val="PageNumber"/>
@@ -6313,16 +6084,8 @@
       <w:rPr>
         <w:rStyle w:val="PageNumber"/>
       </w:rPr>
-      <w:t>ii</w:t>
+      <w:t>iii</w:t>
     </w:r>
-    <w:proofErr w:type="spellStart"/>
-    <w:r>
-      <w:rPr>
-        <w:rStyle w:val="PageNumber"/>
-      </w:rPr>
-      <w:t>i</w:t>
-    </w:r>
-    <w:proofErr w:type="spellEnd"/>
     <w:r>
       <w:rPr>
         <w:rStyle w:val="PageNumber"/>

</xml_diff>

<commit_message>
fixed more formatting issues
</commit_message>
<xml_diff>
--- a/Documentation/Phase 2/CS 401 - Group 2 - SDD Doc.docx
+++ b/Documentation/Phase 2/CS 401 - Group 2 - SDD Doc.docx
@@ -2047,6 +2047,7 @@
               <w:rFonts w:asciiTheme="minorHAnsi" w:eastAsiaTheme="minorEastAsia" w:hAnsiTheme="minorHAnsi" w:cstheme="minorBidi"/>
               <w:b w:val="0"/>
               <w:caps w:val="0"/>
+              <w:noProof/>
               <w:kern w:val="2"/>
               <w:sz w:val="24"/>
               <w:szCs w:val="24"/>
@@ -2071,20 +2072,21 @@
             </w:rPr>
             <w:fldChar w:fldCharType="separate"/>
           </w:r>
-          <w:hyperlink w:anchor="_Toc226573989">
-            <w:r>
-              <w:rPr>
-                <w:rStyle w:val="IndexLink"/>
+          <w:hyperlink w:anchor="_Toc226576867" w:history="1">
+            <w:r>
+              <w:rPr>
+                <w:rStyle w:val="Hyperlink"/>
+                <w:noProof/>
                 <w:lang w:bidi="en-US"/>
               </w:rPr>
               <w:t>1.</w:t>
             </w:r>
             <w:r>
               <w:rPr>
-                <w:rStyle w:val="IndexLink"/>
                 <w:rFonts w:asciiTheme="minorHAnsi" w:eastAsiaTheme="minorEastAsia" w:hAnsiTheme="minorHAnsi" w:cstheme="minorBidi"/>
                 <w:b w:val="0"/>
                 <w:caps w:val="0"/>
+                <w:noProof/>
                 <w:kern w:val="2"/>
                 <w:sz w:val="24"/>
                 <w:szCs w:val="24"/>
@@ -2095,43 +2097,2003 @@
             </w:r>
             <w:r>
               <w:rPr>
-                <w:webHidden/>
+                <w:rStyle w:val="Hyperlink"/>
+                <w:noProof/>
+              </w:rPr>
+              <w:t>Introduction</w:t>
+            </w:r>
+            <w:r>
+              <w:rPr>
+                <w:noProof/>
+              </w:rPr>
+              <w:tab/>
+            </w:r>
+            <w:r>
+              <w:rPr>
+                <w:noProof/>
               </w:rPr>
               <w:fldChar w:fldCharType="begin"/>
             </w:r>
             <w:r>
               <w:rPr>
-                <w:webHidden/>
-              </w:rPr>
-              <w:instrText>PAGEREF _Toc226573989 \h</w:instrText>
-            </w:r>
-            <w:r>
-              <w:rPr>
-                <w:webHidden/>
-              </w:rPr>
-            </w:r>
-            <w:r>
-              <w:rPr>
-                <w:webHidden/>
+                <w:noProof/>
+              </w:rPr>
+              <w:instrText xml:space="preserve"> PAGEREF _Toc226576867 \h </w:instrText>
+            </w:r>
+            <w:r>
+              <w:rPr>
+                <w:noProof/>
+              </w:rPr>
+            </w:r>
+            <w:r>
+              <w:rPr>
+                <w:noProof/>
               </w:rPr>
               <w:fldChar w:fldCharType="separate"/>
             </w:r>
             <w:r>
               <w:rPr>
-                <w:rStyle w:val="IndexLink"/>
-              </w:rPr>
-              <w:t>Introduction</w:t>
-            </w:r>
-            <w:r>
-              <w:rPr>
-                <w:rStyle w:val="IndexLink"/>
+                <w:noProof/>
+              </w:rPr>
+              <w:t>iv</w:t>
+            </w:r>
+            <w:r>
+              <w:rPr>
+                <w:noProof/>
+              </w:rPr>
+              <w:fldChar w:fldCharType="end"/>
+            </w:r>
+          </w:hyperlink>
+        </w:p>
+        <w:p>
+          <w:pPr>
+            <w:pStyle w:val="TOC2"/>
+            <w:tabs>
+              <w:tab w:val="left" w:pos="800"/>
+            </w:tabs>
+            <w:rPr>
+              <w:rFonts w:asciiTheme="minorHAnsi" w:eastAsiaTheme="minorEastAsia" w:hAnsiTheme="minorHAnsi" w:cstheme="minorBidi"/>
+              <w:smallCaps w:val="0"/>
+              <w:noProof/>
+              <w:kern w:val="2"/>
+              <w:sz w:val="24"/>
+              <w:szCs w:val="24"/>
+              <w:lang w:eastAsia="en-US"/>
+              <w14:ligatures w14:val="standardContextual"/>
+            </w:rPr>
+          </w:pPr>
+          <w:hyperlink w:anchor="_Toc226576868" w:history="1">
+            <w:r>
+              <w:rPr>
+                <w:rStyle w:val="Hyperlink"/>
+                <w:noProof/>
+              </w:rPr>
+              <w:t>1.1.</w:t>
+            </w:r>
+            <w:r>
+              <w:rPr>
+                <w:rFonts w:asciiTheme="minorHAnsi" w:eastAsiaTheme="minorEastAsia" w:hAnsiTheme="minorHAnsi" w:cstheme="minorBidi"/>
+                <w:smallCaps w:val="0"/>
+                <w:noProof/>
+                <w:kern w:val="2"/>
+                <w:sz w:val="24"/>
+                <w:szCs w:val="24"/>
+                <w:lang w:eastAsia="en-US"/>
+                <w14:ligatures w14:val="standardContextual"/>
               </w:rPr>
               <w:tab/>
+            </w:r>
+            <w:r>
+              <w:rPr>
+                <w:rStyle w:val="Hyperlink"/>
+                <w:noProof/>
+              </w:rPr>
+              <w:t>Scope</w:t>
+            </w:r>
+            <w:r>
+              <w:rPr>
+                <w:noProof/>
+              </w:rPr>
+              <w:tab/>
+            </w:r>
+            <w:r>
+              <w:rPr>
+                <w:noProof/>
+              </w:rPr>
+              <w:fldChar w:fldCharType="begin"/>
+            </w:r>
+            <w:r>
+              <w:rPr>
+                <w:noProof/>
+              </w:rPr>
+              <w:instrText xml:space="preserve"> PAGEREF _Toc226576868 \h </w:instrText>
+            </w:r>
+            <w:r>
+              <w:rPr>
+                <w:noProof/>
+              </w:rPr>
+            </w:r>
+            <w:r>
+              <w:rPr>
+                <w:noProof/>
+              </w:rPr>
+              <w:fldChar w:fldCharType="separate"/>
+            </w:r>
+            <w:r>
+              <w:rPr>
+                <w:noProof/>
+              </w:rPr>
               <w:t>iv</w:t>
             </w:r>
             <w:r>
               <w:rPr>
-                <w:webHidden/>
+                <w:noProof/>
+              </w:rPr>
+              <w:fldChar w:fldCharType="end"/>
+            </w:r>
+          </w:hyperlink>
+        </w:p>
+        <w:p>
+          <w:pPr>
+            <w:pStyle w:val="TOC2"/>
+            <w:tabs>
+              <w:tab w:val="left" w:pos="800"/>
+            </w:tabs>
+            <w:rPr>
+              <w:rFonts w:asciiTheme="minorHAnsi" w:eastAsiaTheme="minorEastAsia" w:hAnsiTheme="minorHAnsi" w:cstheme="minorBidi"/>
+              <w:smallCaps w:val="0"/>
+              <w:noProof/>
+              <w:kern w:val="2"/>
+              <w:sz w:val="24"/>
+              <w:szCs w:val="24"/>
+              <w:lang w:eastAsia="en-US"/>
+              <w14:ligatures w14:val="standardContextual"/>
+            </w:rPr>
+          </w:pPr>
+          <w:hyperlink w:anchor="_Toc226576869" w:history="1">
+            <w:r>
+              <w:rPr>
+                <w:rStyle w:val="Hyperlink"/>
+                <w:noProof/>
+              </w:rPr>
+              <w:t>1.1.</w:t>
+            </w:r>
+            <w:r>
+              <w:rPr>
+                <w:rFonts w:asciiTheme="minorHAnsi" w:eastAsiaTheme="minorEastAsia" w:hAnsiTheme="minorHAnsi" w:cstheme="minorBidi"/>
+                <w:smallCaps w:val="0"/>
+                <w:noProof/>
+                <w:kern w:val="2"/>
+                <w:sz w:val="24"/>
+                <w:szCs w:val="24"/>
+                <w:lang w:eastAsia="en-US"/>
+                <w14:ligatures w14:val="standardContextual"/>
+              </w:rPr>
+              <w:tab/>
+            </w:r>
+            <w:r>
+              <w:rPr>
+                <w:rStyle w:val="Hyperlink"/>
+                <w:noProof/>
+              </w:rPr>
+              <w:t>Definitions, Acronyms, Abbreviations</w:t>
+            </w:r>
+            <w:r>
+              <w:rPr>
+                <w:noProof/>
+              </w:rPr>
+              <w:tab/>
+            </w:r>
+            <w:r>
+              <w:rPr>
+                <w:noProof/>
+              </w:rPr>
+              <w:fldChar w:fldCharType="begin"/>
+            </w:r>
+            <w:r>
+              <w:rPr>
+                <w:noProof/>
+              </w:rPr>
+              <w:instrText xml:space="preserve"> PAGEREF _Toc226576869 \h </w:instrText>
+            </w:r>
+            <w:r>
+              <w:rPr>
+                <w:noProof/>
+              </w:rPr>
+            </w:r>
+            <w:r>
+              <w:rPr>
+                <w:noProof/>
+              </w:rPr>
+              <w:fldChar w:fldCharType="separate"/>
+            </w:r>
+            <w:r>
+              <w:rPr>
+                <w:noProof/>
+              </w:rPr>
+              <w:t>iv</w:t>
+            </w:r>
+            <w:r>
+              <w:rPr>
+                <w:noProof/>
+              </w:rPr>
+              <w:fldChar w:fldCharType="end"/>
+            </w:r>
+          </w:hyperlink>
+        </w:p>
+        <w:p>
+          <w:pPr>
+            <w:pStyle w:val="TOC2"/>
+            <w:tabs>
+              <w:tab w:val="left" w:pos="800"/>
+            </w:tabs>
+            <w:rPr>
+              <w:rFonts w:asciiTheme="minorHAnsi" w:eastAsiaTheme="minorEastAsia" w:hAnsiTheme="minorHAnsi" w:cstheme="minorBidi"/>
+              <w:smallCaps w:val="0"/>
+              <w:noProof/>
+              <w:kern w:val="2"/>
+              <w:sz w:val="24"/>
+              <w:szCs w:val="24"/>
+              <w:lang w:eastAsia="en-US"/>
+              <w14:ligatures w14:val="standardContextual"/>
+            </w:rPr>
+          </w:pPr>
+          <w:hyperlink w:anchor="_Toc226576870" w:history="1">
+            <w:r>
+              <w:rPr>
+                <w:rStyle w:val="Hyperlink"/>
+                <w:noProof/>
+              </w:rPr>
+              <w:t>1.2.</w:t>
+            </w:r>
+            <w:r>
+              <w:rPr>
+                <w:rFonts w:asciiTheme="minorHAnsi" w:eastAsiaTheme="minorEastAsia" w:hAnsiTheme="minorHAnsi" w:cstheme="minorBidi"/>
+                <w:smallCaps w:val="0"/>
+                <w:noProof/>
+                <w:kern w:val="2"/>
+                <w:sz w:val="24"/>
+                <w:szCs w:val="24"/>
+                <w:lang w:eastAsia="en-US"/>
+                <w14:ligatures w14:val="standardContextual"/>
+              </w:rPr>
+              <w:tab/>
+            </w:r>
+            <w:r>
+              <w:rPr>
+                <w:rStyle w:val="Hyperlink"/>
+                <w:noProof/>
+              </w:rPr>
+              <w:t>Overview</w:t>
+            </w:r>
+            <w:r>
+              <w:rPr>
+                <w:noProof/>
+              </w:rPr>
+              <w:tab/>
+            </w:r>
+            <w:r>
+              <w:rPr>
+                <w:noProof/>
+              </w:rPr>
+              <w:fldChar w:fldCharType="begin"/>
+            </w:r>
+            <w:r>
+              <w:rPr>
+                <w:noProof/>
+              </w:rPr>
+              <w:instrText xml:space="preserve"> PAGEREF _Toc226576870 \h </w:instrText>
+            </w:r>
+            <w:r>
+              <w:rPr>
+                <w:noProof/>
+              </w:rPr>
+            </w:r>
+            <w:r>
+              <w:rPr>
+                <w:noProof/>
+              </w:rPr>
+              <w:fldChar w:fldCharType="separate"/>
+            </w:r>
+            <w:r>
+              <w:rPr>
+                <w:noProof/>
+              </w:rPr>
+              <w:t>v</w:t>
+            </w:r>
+            <w:r>
+              <w:rPr>
+                <w:noProof/>
+              </w:rPr>
+              <w:fldChar w:fldCharType="end"/>
+            </w:r>
+          </w:hyperlink>
+        </w:p>
+        <w:p>
+          <w:pPr>
+            <w:pStyle w:val="TOC1"/>
+            <w:tabs>
+              <w:tab w:val="left" w:pos="400"/>
+            </w:tabs>
+            <w:rPr>
+              <w:rFonts w:asciiTheme="minorHAnsi" w:eastAsiaTheme="minorEastAsia" w:hAnsiTheme="minorHAnsi" w:cstheme="minorBidi"/>
+              <w:b w:val="0"/>
+              <w:caps w:val="0"/>
+              <w:noProof/>
+              <w:kern w:val="2"/>
+              <w:sz w:val="24"/>
+              <w:szCs w:val="24"/>
+              <w:lang w:eastAsia="en-US"/>
+              <w14:ligatures w14:val="standardContextual"/>
+            </w:rPr>
+          </w:pPr>
+          <w:hyperlink w:anchor="_Toc226576871" w:history="1">
+            <w:r>
+              <w:rPr>
+                <w:rStyle w:val="Hyperlink"/>
+                <w:noProof/>
+                <w:lang w:bidi="en-US"/>
+              </w:rPr>
+              <w:t>2.</w:t>
+            </w:r>
+            <w:r>
+              <w:rPr>
+                <w:rFonts w:asciiTheme="minorHAnsi" w:eastAsiaTheme="minorEastAsia" w:hAnsiTheme="minorHAnsi" w:cstheme="minorBidi"/>
+                <w:b w:val="0"/>
+                <w:caps w:val="0"/>
+                <w:noProof/>
+                <w:kern w:val="2"/>
+                <w:sz w:val="24"/>
+                <w:szCs w:val="24"/>
+                <w:lang w:eastAsia="en-US"/>
+                <w14:ligatures w14:val="standardContextual"/>
+              </w:rPr>
+              <w:tab/>
+            </w:r>
+            <w:r>
+              <w:rPr>
+                <w:rStyle w:val="Hyperlink"/>
+                <w:noProof/>
+              </w:rPr>
+              <w:t>Architecture</w:t>
+            </w:r>
+            <w:r>
+              <w:rPr>
+                <w:noProof/>
+              </w:rPr>
+              <w:tab/>
+            </w:r>
+            <w:r>
+              <w:rPr>
+                <w:noProof/>
+              </w:rPr>
+              <w:fldChar w:fldCharType="begin"/>
+            </w:r>
+            <w:r>
+              <w:rPr>
+                <w:noProof/>
+              </w:rPr>
+              <w:instrText xml:space="preserve"> PAGEREF _Toc226576871 \h </w:instrText>
+            </w:r>
+            <w:r>
+              <w:rPr>
+                <w:noProof/>
+              </w:rPr>
+            </w:r>
+            <w:r>
+              <w:rPr>
+                <w:noProof/>
+              </w:rPr>
+              <w:fldChar w:fldCharType="separate"/>
+            </w:r>
+            <w:r>
+              <w:rPr>
+                <w:noProof/>
+              </w:rPr>
+              <w:t>vi</w:t>
+            </w:r>
+            <w:r>
+              <w:rPr>
+                <w:noProof/>
+              </w:rPr>
+              <w:fldChar w:fldCharType="end"/>
+            </w:r>
+          </w:hyperlink>
+        </w:p>
+        <w:p>
+          <w:pPr>
+            <w:pStyle w:val="TOC2"/>
+            <w:tabs>
+              <w:tab w:val="left" w:pos="800"/>
+            </w:tabs>
+            <w:rPr>
+              <w:rFonts w:asciiTheme="minorHAnsi" w:eastAsiaTheme="minorEastAsia" w:hAnsiTheme="minorHAnsi" w:cstheme="minorBidi"/>
+              <w:smallCaps w:val="0"/>
+              <w:noProof/>
+              <w:kern w:val="2"/>
+              <w:sz w:val="24"/>
+              <w:szCs w:val="24"/>
+              <w:lang w:eastAsia="en-US"/>
+              <w14:ligatures w14:val="standardContextual"/>
+            </w:rPr>
+          </w:pPr>
+          <w:hyperlink w:anchor="_Toc226576872" w:history="1">
+            <w:r>
+              <w:rPr>
+                <w:rStyle w:val="Hyperlink"/>
+                <w:noProof/>
+              </w:rPr>
+              <w:t>2.1.</w:t>
+            </w:r>
+            <w:r>
+              <w:rPr>
+                <w:rFonts w:asciiTheme="minorHAnsi" w:eastAsiaTheme="minorEastAsia" w:hAnsiTheme="minorHAnsi" w:cstheme="minorBidi"/>
+                <w:smallCaps w:val="0"/>
+                <w:noProof/>
+                <w:kern w:val="2"/>
+                <w:sz w:val="24"/>
+                <w:szCs w:val="24"/>
+                <w:lang w:eastAsia="en-US"/>
+                <w14:ligatures w14:val="standardContextual"/>
+              </w:rPr>
+              <w:tab/>
+            </w:r>
+            <w:r>
+              <w:rPr>
+                <w:rStyle w:val="Hyperlink"/>
+                <w:noProof/>
+              </w:rPr>
+              <w:t>Overview</w:t>
+            </w:r>
+            <w:r>
+              <w:rPr>
+                <w:noProof/>
+              </w:rPr>
+              <w:tab/>
+            </w:r>
+            <w:r>
+              <w:rPr>
+                <w:noProof/>
+              </w:rPr>
+              <w:fldChar w:fldCharType="begin"/>
+            </w:r>
+            <w:r>
+              <w:rPr>
+                <w:noProof/>
+              </w:rPr>
+              <w:instrText xml:space="preserve"> PAGEREF _Toc226576872 \h </w:instrText>
+            </w:r>
+            <w:r>
+              <w:rPr>
+                <w:noProof/>
+              </w:rPr>
+            </w:r>
+            <w:r>
+              <w:rPr>
+                <w:noProof/>
+              </w:rPr>
+              <w:fldChar w:fldCharType="separate"/>
+            </w:r>
+            <w:r>
+              <w:rPr>
+                <w:noProof/>
+              </w:rPr>
+              <w:t>vi</w:t>
+            </w:r>
+            <w:r>
+              <w:rPr>
+                <w:noProof/>
+              </w:rPr>
+              <w:fldChar w:fldCharType="end"/>
+            </w:r>
+          </w:hyperlink>
+        </w:p>
+        <w:p>
+          <w:pPr>
+            <w:pStyle w:val="TOC2"/>
+            <w:tabs>
+              <w:tab w:val="left" w:pos="800"/>
+            </w:tabs>
+            <w:rPr>
+              <w:rFonts w:asciiTheme="minorHAnsi" w:eastAsiaTheme="minorEastAsia" w:hAnsiTheme="minorHAnsi" w:cstheme="minorBidi"/>
+              <w:smallCaps w:val="0"/>
+              <w:noProof/>
+              <w:kern w:val="2"/>
+              <w:sz w:val="24"/>
+              <w:szCs w:val="24"/>
+              <w:lang w:eastAsia="en-US"/>
+              <w14:ligatures w14:val="standardContextual"/>
+            </w:rPr>
+          </w:pPr>
+          <w:hyperlink w:anchor="_Toc226576873" w:history="1">
+            <w:r>
+              <w:rPr>
+                <w:rStyle w:val="Hyperlink"/>
+                <w:noProof/>
+              </w:rPr>
+              <w:t>2.2.</w:t>
+            </w:r>
+            <w:r>
+              <w:rPr>
+                <w:rFonts w:asciiTheme="minorHAnsi" w:eastAsiaTheme="minorEastAsia" w:hAnsiTheme="minorHAnsi" w:cstheme="minorBidi"/>
+                <w:smallCaps w:val="0"/>
+                <w:noProof/>
+                <w:kern w:val="2"/>
+                <w:sz w:val="24"/>
+                <w:szCs w:val="24"/>
+                <w:lang w:eastAsia="en-US"/>
+                <w14:ligatures w14:val="standardContextual"/>
+              </w:rPr>
+              <w:tab/>
+            </w:r>
+            <w:r>
+              <w:rPr>
+                <w:rStyle w:val="Hyperlink"/>
+                <w:noProof/>
+              </w:rPr>
+              <w:t>Networking</w:t>
+            </w:r>
+            <w:r>
+              <w:rPr>
+                <w:noProof/>
+              </w:rPr>
+              <w:tab/>
+            </w:r>
+            <w:r>
+              <w:rPr>
+                <w:noProof/>
+              </w:rPr>
+              <w:fldChar w:fldCharType="begin"/>
+            </w:r>
+            <w:r>
+              <w:rPr>
+                <w:noProof/>
+              </w:rPr>
+              <w:instrText xml:space="preserve"> PAGEREF _Toc226576873 \h </w:instrText>
+            </w:r>
+            <w:r>
+              <w:rPr>
+                <w:noProof/>
+              </w:rPr>
+            </w:r>
+            <w:r>
+              <w:rPr>
+                <w:noProof/>
+              </w:rPr>
+              <w:fldChar w:fldCharType="separate"/>
+            </w:r>
+            <w:r>
+              <w:rPr>
+                <w:noProof/>
+              </w:rPr>
+              <w:t>vi</w:t>
+            </w:r>
+            <w:r>
+              <w:rPr>
+                <w:noProof/>
+              </w:rPr>
+              <w:fldChar w:fldCharType="end"/>
+            </w:r>
+          </w:hyperlink>
+        </w:p>
+        <w:p>
+          <w:pPr>
+            <w:pStyle w:val="TOC2"/>
+            <w:tabs>
+              <w:tab w:val="left" w:pos="800"/>
+            </w:tabs>
+            <w:rPr>
+              <w:rFonts w:asciiTheme="minorHAnsi" w:eastAsiaTheme="minorEastAsia" w:hAnsiTheme="minorHAnsi" w:cstheme="minorBidi"/>
+              <w:smallCaps w:val="0"/>
+              <w:noProof/>
+              <w:kern w:val="2"/>
+              <w:sz w:val="24"/>
+              <w:szCs w:val="24"/>
+              <w:lang w:eastAsia="en-US"/>
+              <w14:ligatures w14:val="standardContextual"/>
+            </w:rPr>
+          </w:pPr>
+          <w:hyperlink w:anchor="_Toc226576874" w:history="1">
+            <w:r>
+              <w:rPr>
+                <w:rStyle w:val="Hyperlink"/>
+                <w:noProof/>
+              </w:rPr>
+              <w:t>2.3.</w:t>
+            </w:r>
+            <w:r>
+              <w:rPr>
+                <w:rFonts w:asciiTheme="minorHAnsi" w:eastAsiaTheme="minorEastAsia" w:hAnsiTheme="minorHAnsi" w:cstheme="minorBidi"/>
+                <w:smallCaps w:val="0"/>
+                <w:noProof/>
+                <w:kern w:val="2"/>
+                <w:sz w:val="24"/>
+                <w:szCs w:val="24"/>
+                <w:lang w:eastAsia="en-US"/>
+                <w14:ligatures w14:val="standardContextual"/>
+              </w:rPr>
+              <w:tab/>
+            </w:r>
+            <w:r>
+              <w:rPr>
+                <w:rStyle w:val="Hyperlink"/>
+                <w:noProof/>
+              </w:rPr>
+              <w:t>Messaging</w:t>
+            </w:r>
+            <w:r>
+              <w:rPr>
+                <w:noProof/>
+              </w:rPr>
+              <w:tab/>
+            </w:r>
+            <w:r>
+              <w:rPr>
+                <w:noProof/>
+              </w:rPr>
+              <w:fldChar w:fldCharType="begin"/>
+            </w:r>
+            <w:r>
+              <w:rPr>
+                <w:noProof/>
+              </w:rPr>
+              <w:instrText xml:space="preserve"> PAGEREF _Toc226576874 \h </w:instrText>
+            </w:r>
+            <w:r>
+              <w:rPr>
+                <w:noProof/>
+              </w:rPr>
+            </w:r>
+            <w:r>
+              <w:rPr>
+                <w:noProof/>
+              </w:rPr>
+              <w:fldChar w:fldCharType="separate"/>
+            </w:r>
+            <w:r>
+              <w:rPr>
+                <w:noProof/>
+              </w:rPr>
+              <w:t>vi</w:t>
+            </w:r>
+            <w:r>
+              <w:rPr>
+                <w:noProof/>
+              </w:rPr>
+              <w:fldChar w:fldCharType="end"/>
+            </w:r>
+          </w:hyperlink>
+        </w:p>
+        <w:p>
+          <w:pPr>
+            <w:pStyle w:val="TOC2"/>
+            <w:tabs>
+              <w:tab w:val="left" w:pos="800"/>
+            </w:tabs>
+            <w:rPr>
+              <w:rFonts w:asciiTheme="minorHAnsi" w:eastAsiaTheme="minorEastAsia" w:hAnsiTheme="minorHAnsi" w:cstheme="minorBidi"/>
+              <w:smallCaps w:val="0"/>
+              <w:noProof/>
+              <w:kern w:val="2"/>
+              <w:sz w:val="24"/>
+              <w:szCs w:val="24"/>
+              <w:lang w:eastAsia="en-US"/>
+              <w14:ligatures w14:val="standardContextual"/>
+            </w:rPr>
+          </w:pPr>
+          <w:hyperlink w:anchor="_Toc226576875" w:history="1">
+            <w:r>
+              <w:rPr>
+                <w:rStyle w:val="Hyperlink"/>
+                <w:noProof/>
+              </w:rPr>
+              <w:t>2.4.</w:t>
+            </w:r>
+            <w:r>
+              <w:rPr>
+                <w:rFonts w:asciiTheme="minorHAnsi" w:eastAsiaTheme="minorEastAsia" w:hAnsiTheme="minorHAnsi" w:cstheme="minorBidi"/>
+                <w:smallCaps w:val="0"/>
+                <w:noProof/>
+                <w:kern w:val="2"/>
+                <w:sz w:val="24"/>
+                <w:szCs w:val="24"/>
+                <w:lang w:eastAsia="en-US"/>
+                <w14:ligatures w14:val="standardContextual"/>
+              </w:rPr>
+              <w:tab/>
+            </w:r>
+            <w:r>
+              <w:rPr>
+                <w:rStyle w:val="Hyperlink"/>
+                <w:noProof/>
+              </w:rPr>
+              <w:t>Server</w:t>
+            </w:r>
+            <w:r>
+              <w:rPr>
+                <w:noProof/>
+              </w:rPr>
+              <w:tab/>
+            </w:r>
+            <w:r>
+              <w:rPr>
+                <w:noProof/>
+              </w:rPr>
+              <w:fldChar w:fldCharType="begin"/>
+            </w:r>
+            <w:r>
+              <w:rPr>
+                <w:noProof/>
+              </w:rPr>
+              <w:instrText xml:space="preserve"> PAGEREF _Toc226576875 \h </w:instrText>
+            </w:r>
+            <w:r>
+              <w:rPr>
+                <w:noProof/>
+              </w:rPr>
+            </w:r>
+            <w:r>
+              <w:rPr>
+                <w:noProof/>
+              </w:rPr>
+              <w:fldChar w:fldCharType="separate"/>
+            </w:r>
+            <w:r>
+              <w:rPr>
+                <w:noProof/>
+              </w:rPr>
+              <w:t>vi</w:t>
+            </w:r>
+            <w:r>
+              <w:rPr>
+                <w:noProof/>
+              </w:rPr>
+              <w:fldChar w:fldCharType="end"/>
+            </w:r>
+          </w:hyperlink>
+        </w:p>
+        <w:p>
+          <w:pPr>
+            <w:pStyle w:val="TOC2"/>
+            <w:tabs>
+              <w:tab w:val="left" w:pos="800"/>
+            </w:tabs>
+            <w:rPr>
+              <w:rFonts w:asciiTheme="minorHAnsi" w:eastAsiaTheme="minorEastAsia" w:hAnsiTheme="minorHAnsi" w:cstheme="minorBidi"/>
+              <w:smallCaps w:val="0"/>
+              <w:noProof/>
+              <w:kern w:val="2"/>
+              <w:sz w:val="24"/>
+              <w:szCs w:val="24"/>
+              <w:lang w:eastAsia="en-US"/>
+              <w14:ligatures w14:val="standardContextual"/>
+            </w:rPr>
+          </w:pPr>
+          <w:hyperlink w:anchor="_Toc226576876" w:history="1">
+            <w:r>
+              <w:rPr>
+                <w:rStyle w:val="Hyperlink"/>
+                <w:noProof/>
+              </w:rPr>
+              <w:t>2.5.</w:t>
+            </w:r>
+            <w:r>
+              <w:rPr>
+                <w:rFonts w:asciiTheme="minorHAnsi" w:eastAsiaTheme="minorEastAsia" w:hAnsiTheme="minorHAnsi" w:cstheme="minorBidi"/>
+                <w:smallCaps w:val="0"/>
+                <w:noProof/>
+                <w:kern w:val="2"/>
+                <w:sz w:val="24"/>
+                <w:szCs w:val="24"/>
+                <w:lang w:eastAsia="en-US"/>
+                <w14:ligatures w14:val="standardContextual"/>
+              </w:rPr>
+              <w:tab/>
+            </w:r>
+            <w:r>
+              <w:rPr>
+                <w:rStyle w:val="Hyperlink"/>
+                <w:noProof/>
+              </w:rPr>
+              <w:t>Client</w:t>
+            </w:r>
+            <w:r>
+              <w:rPr>
+                <w:noProof/>
+              </w:rPr>
+              <w:tab/>
+            </w:r>
+            <w:r>
+              <w:rPr>
+                <w:noProof/>
+              </w:rPr>
+              <w:fldChar w:fldCharType="begin"/>
+            </w:r>
+            <w:r>
+              <w:rPr>
+                <w:noProof/>
+              </w:rPr>
+              <w:instrText xml:space="preserve"> PAGEREF _Toc226576876 \h </w:instrText>
+            </w:r>
+            <w:r>
+              <w:rPr>
+                <w:noProof/>
+              </w:rPr>
+            </w:r>
+            <w:r>
+              <w:rPr>
+                <w:noProof/>
+              </w:rPr>
+              <w:fldChar w:fldCharType="separate"/>
+            </w:r>
+            <w:r>
+              <w:rPr>
+                <w:noProof/>
+              </w:rPr>
+              <w:t>vii</w:t>
+            </w:r>
+            <w:r>
+              <w:rPr>
+                <w:noProof/>
+              </w:rPr>
+              <w:fldChar w:fldCharType="end"/>
+            </w:r>
+          </w:hyperlink>
+        </w:p>
+        <w:p>
+          <w:pPr>
+            <w:pStyle w:val="TOC1"/>
+            <w:tabs>
+              <w:tab w:val="left" w:pos="400"/>
+            </w:tabs>
+            <w:rPr>
+              <w:rFonts w:asciiTheme="minorHAnsi" w:eastAsiaTheme="minorEastAsia" w:hAnsiTheme="minorHAnsi" w:cstheme="minorBidi"/>
+              <w:b w:val="0"/>
+              <w:caps w:val="0"/>
+              <w:noProof/>
+              <w:kern w:val="2"/>
+              <w:sz w:val="24"/>
+              <w:szCs w:val="24"/>
+              <w:lang w:eastAsia="en-US"/>
+              <w14:ligatures w14:val="standardContextual"/>
+            </w:rPr>
+          </w:pPr>
+          <w:hyperlink w:anchor="_Toc226576877" w:history="1">
+            <w:r>
+              <w:rPr>
+                <w:rStyle w:val="Hyperlink"/>
+                <w:noProof/>
+                <w:lang w:bidi="en-US"/>
+              </w:rPr>
+              <w:t>3.</w:t>
+            </w:r>
+            <w:r>
+              <w:rPr>
+                <w:rFonts w:asciiTheme="minorHAnsi" w:eastAsiaTheme="minorEastAsia" w:hAnsiTheme="minorHAnsi" w:cstheme="minorBidi"/>
+                <w:b w:val="0"/>
+                <w:caps w:val="0"/>
+                <w:noProof/>
+                <w:kern w:val="2"/>
+                <w:sz w:val="24"/>
+                <w:szCs w:val="24"/>
+                <w:lang w:eastAsia="en-US"/>
+                <w14:ligatures w14:val="standardContextual"/>
+              </w:rPr>
+              <w:tab/>
+            </w:r>
+            <w:r>
+              <w:rPr>
+                <w:rStyle w:val="Hyperlink"/>
+                <w:noProof/>
+              </w:rPr>
+              <w:t>System Interface Design</w:t>
+            </w:r>
+            <w:r>
+              <w:rPr>
+                <w:noProof/>
+              </w:rPr>
+              <w:tab/>
+            </w:r>
+            <w:r>
+              <w:rPr>
+                <w:noProof/>
+              </w:rPr>
+              <w:fldChar w:fldCharType="begin"/>
+            </w:r>
+            <w:r>
+              <w:rPr>
+                <w:noProof/>
+              </w:rPr>
+              <w:instrText xml:space="preserve"> PAGEREF _Toc226576877 \h </w:instrText>
+            </w:r>
+            <w:r>
+              <w:rPr>
+                <w:noProof/>
+              </w:rPr>
+            </w:r>
+            <w:r>
+              <w:rPr>
+                <w:noProof/>
+              </w:rPr>
+              <w:fldChar w:fldCharType="separate"/>
+            </w:r>
+            <w:r>
+              <w:rPr>
+                <w:noProof/>
+              </w:rPr>
+              <w:t>ix</w:t>
+            </w:r>
+            <w:r>
+              <w:rPr>
+                <w:noProof/>
+              </w:rPr>
+              <w:fldChar w:fldCharType="end"/>
+            </w:r>
+          </w:hyperlink>
+        </w:p>
+        <w:p>
+          <w:pPr>
+            <w:pStyle w:val="TOC2"/>
+            <w:tabs>
+              <w:tab w:val="left" w:pos="800"/>
+            </w:tabs>
+            <w:rPr>
+              <w:rFonts w:asciiTheme="minorHAnsi" w:eastAsiaTheme="minorEastAsia" w:hAnsiTheme="minorHAnsi" w:cstheme="minorBidi"/>
+              <w:smallCaps w:val="0"/>
+              <w:noProof/>
+              <w:kern w:val="2"/>
+              <w:sz w:val="24"/>
+              <w:szCs w:val="24"/>
+              <w:lang w:eastAsia="en-US"/>
+              <w14:ligatures w14:val="standardContextual"/>
+            </w:rPr>
+          </w:pPr>
+          <w:hyperlink w:anchor="_Toc226576878" w:history="1">
+            <w:r>
+              <w:rPr>
+                <w:rStyle w:val="Hyperlink"/>
+                <w:noProof/>
+              </w:rPr>
+              <w:t>3.1.</w:t>
+            </w:r>
+            <w:r>
+              <w:rPr>
+                <w:rFonts w:asciiTheme="minorHAnsi" w:eastAsiaTheme="minorEastAsia" w:hAnsiTheme="minorHAnsi" w:cstheme="minorBidi"/>
+                <w:smallCaps w:val="0"/>
+                <w:noProof/>
+                <w:kern w:val="2"/>
+                <w:sz w:val="24"/>
+                <w:szCs w:val="24"/>
+                <w:lang w:eastAsia="en-US"/>
+                <w14:ligatures w14:val="standardContextual"/>
+              </w:rPr>
+              <w:tab/>
+            </w:r>
+            <w:r>
+              <w:rPr>
+                <w:rStyle w:val="Hyperlink"/>
+                <w:noProof/>
+              </w:rPr>
+              <w:t>Application Overview</w:t>
+            </w:r>
+            <w:r>
+              <w:rPr>
+                <w:noProof/>
+              </w:rPr>
+              <w:tab/>
+            </w:r>
+            <w:r>
+              <w:rPr>
+                <w:noProof/>
+              </w:rPr>
+              <w:fldChar w:fldCharType="begin"/>
+            </w:r>
+            <w:r>
+              <w:rPr>
+                <w:noProof/>
+              </w:rPr>
+              <w:instrText xml:space="preserve"> PAGEREF _Toc226576878 \h </w:instrText>
+            </w:r>
+            <w:r>
+              <w:rPr>
+                <w:noProof/>
+              </w:rPr>
+            </w:r>
+            <w:r>
+              <w:rPr>
+                <w:noProof/>
+              </w:rPr>
+              <w:fldChar w:fldCharType="separate"/>
+            </w:r>
+            <w:r>
+              <w:rPr>
+                <w:noProof/>
+              </w:rPr>
+              <w:t>ix</w:t>
+            </w:r>
+            <w:r>
+              <w:rPr>
+                <w:noProof/>
+              </w:rPr>
+              <w:fldChar w:fldCharType="end"/>
+            </w:r>
+          </w:hyperlink>
+        </w:p>
+        <w:p>
+          <w:pPr>
+            <w:pStyle w:val="TOC3"/>
+            <w:tabs>
+              <w:tab w:val="left" w:pos="1200"/>
+            </w:tabs>
+            <w:rPr>
+              <w:rFonts w:asciiTheme="minorHAnsi" w:eastAsiaTheme="minorEastAsia" w:hAnsiTheme="minorHAnsi" w:cstheme="minorBidi"/>
+              <w:i w:val="0"/>
+              <w:noProof/>
+              <w:kern w:val="2"/>
+              <w:sz w:val="24"/>
+              <w:szCs w:val="24"/>
+              <w:lang w:eastAsia="en-US"/>
+              <w14:ligatures w14:val="standardContextual"/>
+            </w:rPr>
+          </w:pPr>
+          <w:hyperlink w:anchor="_Toc226576879" w:history="1">
+            <w:r>
+              <w:rPr>
+                <w:rStyle w:val="Hyperlink"/>
+                <w:noProof/>
+              </w:rPr>
+              <w:t>3.1.1.</w:t>
+            </w:r>
+            <w:r>
+              <w:rPr>
+                <w:rFonts w:asciiTheme="minorHAnsi" w:eastAsiaTheme="minorEastAsia" w:hAnsiTheme="minorHAnsi" w:cstheme="minorBidi"/>
+                <w:i w:val="0"/>
+                <w:noProof/>
+                <w:kern w:val="2"/>
+                <w:sz w:val="24"/>
+                <w:szCs w:val="24"/>
+                <w:lang w:eastAsia="en-US"/>
+                <w14:ligatures w14:val="standardContextual"/>
+              </w:rPr>
+              <w:tab/>
+            </w:r>
+            <w:r>
+              <w:rPr>
+                <w:rStyle w:val="Hyperlink"/>
+                <w:noProof/>
+              </w:rPr>
+              <w:t>Design Outlook</w:t>
+            </w:r>
+            <w:r>
+              <w:rPr>
+                <w:noProof/>
+              </w:rPr>
+              <w:tab/>
+            </w:r>
+            <w:r>
+              <w:rPr>
+                <w:noProof/>
+              </w:rPr>
+              <w:fldChar w:fldCharType="begin"/>
+            </w:r>
+            <w:r>
+              <w:rPr>
+                <w:noProof/>
+              </w:rPr>
+              <w:instrText xml:space="preserve"> PAGEREF _Toc226576879 \h </w:instrText>
+            </w:r>
+            <w:r>
+              <w:rPr>
+                <w:noProof/>
+              </w:rPr>
+            </w:r>
+            <w:r>
+              <w:rPr>
+                <w:noProof/>
+              </w:rPr>
+              <w:fldChar w:fldCharType="separate"/>
+            </w:r>
+            <w:r>
+              <w:rPr>
+                <w:noProof/>
+              </w:rPr>
+              <w:t>ix</w:t>
+            </w:r>
+            <w:r>
+              <w:rPr>
+                <w:noProof/>
+              </w:rPr>
+              <w:fldChar w:fldCharType="end"/>
+            </w:r>
+          </w:hyperlink>
+        </w:p>
+        <w:p>
+          <w:pPr>
+            <w:pStyle w:val="TOC2"/>
+            <w:tabs>
+              <w:tab w:val="left" w:pos="800"/>
+            </w:tabs>
+            <w:rPr>
+              <w:rFonts w:asciiTheme="minorHAnsi" w:eastAsiaTheme="minorEastAsia" w:hAnsiTheme="minorHAnsi" w:cstheme="minorBidi"/>
+              <w:smallCaps w:val="0"/>
+              <w:noProof/>
+              <w:kern w:val="2"/>
+              <w:sz w:val="24"/>
+              <w:szCs w:val="24"/>
+              <w:lang w:eastAsia="en-US"/>
+              <w14:ligatures w14:val="standardContextual"/>
+            </w:rPr>
+          </w:pPr>
+          <w:hyperlink w:anchor="_Toc226576880" w:history="1">
+            <w:r>
+              <w:rPr>
+                <w:rStyle w:val="Hyperlink"/>
+                <w:noProof/>
+              </w:rPr>
+              <w:t>3.2.</w:t>
+            </w:r>
+            <w:r>
+              <w:rPr>
+                <w:rFonts w:asciiTheme="minorHAnsi" w:eastAsiaTheme="minorEastAsia" w:hAnsiTheme="minorHAnsi" w:cstheme="minorBidi"/>
+                <w:smallCaps w:val="0"/>
+                <w:noProof/>
+                <w:kern w:val="2"/>
+                <w:sz w:val="24"/>
+                <w:szCs w:val="24"/>
+                <w:lang w:eastAsia="en-US"/>
+                <w14:ligatures w14:val="standardContextual"/>
+              </w:rPr>
+              <w:tab/>
+            </w:r>
+            <w:r>
+              <w:rPr>
+                <w:rStyle w:val="Hyperlink"/>
+                <w:noProof/>
+              </w:rPr>
+              <w:t>GUI Diagrams</w:t>
+            </w:r>
+            <w:r>
+              <w:rPr>
+                <w:noProof/>
+              </w:rPr>
+              <w:tab/>
+            </w:r>
+            <w:r>
+              <w:rPr>
+                <w:noProof/>
+              </w:rPr>
+              <w:fldChar w:fldCharType="begin"/>
+            </w:r>
+            <w:r>
+              <w:rPr>
+                <w:noProof/>
+              </w:rPr>
+              <w:instrText xml:space="preserve"> PAGEREF _Toc226576880 \h </w:instrText>
+            </w:r>
+            <w:r>
+              <w:rPr>
+                <w:noProof/>
+              </w:rPr>
+            </w:r>
+            <w:r>
+              <w:rPr>
+                <w:noProof/>
+              </w:rPr>
+              <w:fldChar w:fldCharType="separate"/>
+            </w:r>
+            <w:r>
+              <w:rPr>
+                <w:noProof/>
+              </w:rPr>
+              <w:t>x</w:t>
+            </w:r>
+            <w:r>
+              <w:rPr>
+                <w:noProof/>
+              </w:rPr>
+              <w:fldChar w:fldCharType="end"/>
+            </w:r>
+          </w:hyperlink>
+        </w:p>
+        <w:p>
+          <w:pPr>
+            <w:pStyle w:val="TOC2"/>
+            <w:tabs>
+              <w:tab w:val="left" w:pos="800"/>
+            </w:tabs>
+            <w:rPr>
+              <w:rFonts w:asciiTheme="minorHAnsi" w:eastAsiaTheme="minorEastAsia" w:hAnsiTheme="minorHAnsi" w:cstheme="minorBidi"/>
+              <w:smallCaps w:val="0"/>
+              <w:noProof/>
+              <w:kern w:val="2"/>
+              <w:sz w:val="24"/>
+              <w:szCs w:val="24"/>
+              <w:lang w:eastAsia="en-US"/>
+              <w14:ligatures w14:val="standardContextual"/>
+            </w:rPr>
+          </w:pPr>
+          <w:hyperlink w:anchor="_Toc226576881" w:history="1">
+            <w:r>
+              <w:rPr>
+                <w:rStyle w:val="Hyperlink"/>
+                <w:noProof/>
+              </w:rPr>
+              <w:t>3.3.</w:t>
+            </w:r>
+            <w:r>
+              <w:rPr>
+                <w:rFonts w:asciiTheme="minorHAnsi" w:eastAsiaTheme="minorEastAsia" w:hAnsiTheme="minorHAnsi" w:cstheme="minorBidi"/>
+                <w:smallCaps w:val="0"/>
+                <w:noProof/>
+                <w:kern w:val="2"/>
+                <w:sz w:val="24"/>
+                <w:szCs w:val="24"/>
+                <w:lang w:eastAsia="en-US"/>
+                <w14:ligatures w14:val="standardContextual"/>
+              </w:rPr>
+              <w:tab/>
+            </w:r>
+            <w:r>
+              <w:rPr>
+                <w:rStyle w:val="Hyperlink"/>
+                <w:noProof/>
+              </w:rPr>
+              <w:t>Layout and Structure</w:t>
+            </w:r>
+            <w:r>
+              <w:rPr>
+                <w:noProof/>
+              </w:rPr>
+              <w:tab/>
+            </w:r>
+            <w:r>
+              <w:rPr>
+                <w:noProof/>
+              </w:rPr>
+              <w:fldChar w:fldCharType="begin"/>
+            </w:r>
+            <w:r>
+              <w:rPr>
+                <w:noProof/>
+              </w:rPr>
+              <w:instrText xml:space="preserve"> PAGEREF _Toc226576881 \h </w:instrText>
+            </w:r>
+            <w:r>
+              <w:rPr>
+                <w:noProof/>
+              </w:rPr>
+            </w:r>
+            <w:r>
+              <w:rPr>
+                <w:noProof/>
+              </w:rPr>
+              <w:fldChar w:fldCharType="separate"/>
+            </w:r>
+            <w:r>
+              <w:rPr>
+                <w:noProof/>
+              </w:rPr>
+              <w:t>xii</w:t>
+            </w:r>
+            <w:r>
+              <w:rPr>
+                <w:noProof/>
+              </w:rPr>
+              <w:fldChar w:fldCharType="end"/>
+            </w:r>
+          </w:hyperlink>
+        </w:p>
+        <w:p>
+          <w:pPr>
+            <w:pStyle w:val="TOC1"/>
+            <w:tabs>
+              <w:tab w:val="left" w:pos="400"/>
+            </w:tabs>
+            <w:rPr>
+              <w:rFonts w:asciiTheme="minorHAnsi" w:eastAsiaTheme="minorEastAsia" w:hAnsiTheme="minorHAnsi" w:cstheme="minorBidi"/>
+              <w:b w:val="0"/>
+              <w:caps w:val="0"/>
+              <w:noProof/>
+              <w:kern w:val="2"/>
+              <w:sz w:val="24"/>
+              <w:szCs w:val="24"/>
+              <w:lang w:eastAsia="en-US"/>
+              <w14:ligatures w14:val="standardContextual"/>
+            </w:rPr>
+          </w:pPr>
+          <w:hyperlink w:anchor="_Toc226576882" w:history="1">
+            <w:r>
+              <w:rPr>
+                <w:rStyle w:val="Hyperlink"/>
+                <w:noProof/>
+                <w:lang w:bidi="en-US"/>
+              </w:rPr>
+              <w:t>4.</w:t>
+            </w:r>
+            <w:r>
+              <w:rPr>
+                <w:rFonts w:asciiTheme="minorHAnsi" w:eastAsiaTheme="minorEastAsia" w:hAnsiTheme="minorHAnsi" w:cstheme="minorBidi"/>
+                <w:b w:val="0"/>
+                <w:caps w:val="0"/>
+                <w:noProof/>
+                <w:kern w:val="2"/>
+                <w:sz w:val="24"/>
+                <w:szCs w:val="24"/>
+                <w:lang w:eastAsia="en-US"/>
+                <w14:ligatures w14:val="standardContextual"/>
+              </w:rPr>
+              <w:tab/>
+            </w:r>
+            <w:r>
+              <w:rPr>
+                <w:rStyle w:val="Hyperlink"/>
+                <w:noProof/>
+              </w:rPr>
+              <w:t>Use-Cases and Common Flows</w:t>
+            </w:r>
+            <w:r>
+              <w:rPr>
+                <w:noProof/>
+              </w:rPr>
+              <w:tab/>
+            </w:r>
+            <w:r>
+              <w:rPr>
+                <w:noProof/>
+              </w:rPr>
+              <w:fldChar w:fldCharType="begin"/>
+            </w:r>
+            <w:r>
+              <w:rPr>
+                <w:noProof/>
+              </w:rPr>
+              <w:instrText xml:space="preserve"> PAGEREF _Toc226576882 \h </w:instrText>
+            </w:r>
+            <w:r>
+              <w:rPr>
+                <w:noProof/>
+              </w:rPr>
+            </w:r>
+            <w:r>
+              <w:rPr>
+                <w:noProof/>
+              </w:rPr>
+              <w:fldChar w:fldCharType="separate"/>
+            </w:r>
+            <w:r>
+              <w:rPr>
+                <w:noProof/>
+              </w:rPr>
+              <w:t>xiii</w:t>
+            </w:r>
+            <w:r>
+              <w:rPr>
+                <w:noProof/>
+              </w:rPr>
+              <w:fldChar w:fldCharType="end"/>
+            </w:r>
+          </w:hyperlink>
+        </w:p>
+        <w:p>
+          <w:pPr>
+            <w:pStyle w:val="TOC2"/>
+            <w:tabs>
+              <w:tab w:val="left" w:pos="800"/>
+            </w:tabs>
+            <w:rPr>
+              <w:rFonts w:asciiTheme="minorHAnsi" w:eastAsiaTheme="minorEastAsia" w:hAnsiTheme="minorHAnsi" w:cstheme="minorBidi"/>
+              <w:smallCaps w:val="0"/>
+              <w:noProof/>
+              <w:kern w:val="2"/>
+              <w:sz w:val="24"/>
+              <w:szCs w:val="24"/>
+              <w:lang w:eastAsia="en-US"/>
+              <w14:ligatures w14:val="standardContextual"/>
+            </w:rPr>
+          </w:pPr>
+          <w:hyperlink w:anchor="_Toc226576883" w:history="1">
+            <w:r>
+              <w:rPr>
+                <w:rStyle w:val="Hyperlink"/>
+                <w:noProof/>
+              </w:rPr>
+              <w:t>4.1.</w:t>
+            </w:r>
+            <w:r>
+              <w:rPr>
+                <w:rFonts w:asciiTheme="minorHAnsi" w:eastAsiaTheme="minorEastAsia" w:hAnsiTheme="minorHAnsi" w:cstheme="minorBidi"/>
+                <w:smallCaps w:val="0"/>
+                <w:noProof/>
+                <w:kern w:val="2"/>
+                <w:sz w:val="24"/>
+                <w:szCs w:val="24"/>
+                <w:lang w:eastAsia="en-US"/>
+                <w14:ligatures w14:val="standardContextual"/>
+              </w:rPr>
+              <w:tab/>
+            </w:r>
+            <w:r>
+              <w:rPr>
+                <w:rStyle w:val="Hyperlink"/>
+                <w:noProof/>
+              </w:rPr>
+              <w:t>Use-Case Diagrams</w:t>
+            </w:r>
+            <w:r>
+              <w:rPr>
+                <w:noProof/>
+              </w:rPr>
+              <w:tab/>
+            </w:r>
+            <w:r>
+              <w:rPr>
+                <w:noProof/>
+              </w:rPr>
+              <w:fldChar w:fldCharType="begin"/>
+            </w:r>
+            <w:r>
+              <w:rPr>
+                <w:noProof/>
+              </w:rPr>
+              <w:instrText xml:space="preserve"> PAGEREF _Toc226576883 \h </w:instrText>
+            </w:r>
+            <w:r>
+              <w:rPr>
+                <w:noProof/>
+              </w:rPr>
+            </w:r>
+            <w:r>
+              <w:rPr>
+                <w:noProof/>
+              </w:rPr>
+              <w:fldChar w:fldCharType="separate"/>
+            </w:r>
+            <w:r>
+              <w:rPr>
+                <w:noProof/>
+              </w:rPr>
+              <w:t>xiii</w:t>
+            </w:r>
+            <w:r>
+              <w:rPr>
+                <w:noProof/>
+              </w:rPr>
+              <w:fldChar w:fldCharType="end"/>
+            </w:r>
+          </w:hyperlink>
+        </w:p>
+        <w:p>
+          <w:pPr>
+            <w:pStyle w:val="TOC2"/>
+            <w:tabs>
+              <w:tab w:val="left" w:pos="800"/>
+            </w:tabs>
+            <w:rPr>
+              <w:rFonts w:asciiTheme="minorHAnsi" w:eastAsiaTheme="minorEastAsia" w:hAnsiTheme="minorHAnsi" w:cstheme="minorBidi"/>
+              <w:smallCaps w:val="0"/>
+              <w:noProof/>
+              <w:kern w:val="2"/>
+              <w:sz w:val="24"/>
+              <w:szCs w:val="24"/>
+              <w:lang w:eastAsia="en-US"/>
+              <w14:ligatures w14:val="standardContextual"/>
+            </w:rPr>
+          </w:pPr>
+          <w:hyperlink w:anchor="_Toc226576884" w:history="1">
+            <w:r>
+              <w:rPr>
+                <w:rStyle w:val="Hyperlink"/>
+                <w:noProof/>
+              </w:rPr>
+              <w:t>4.2.</w:t>
+            </w:r>
+            <w:r>
+              <w:rPr>
+                <w:rFonts w:asciiTheme="minorHAnsi" w:eastAsiaTheme="minorEastAsia" w:hAnsiTheme="minorHAnsi" w:cstheme="minorBidi"/>
+                <w:smallCaps w:val="0"/>
+                <w:noProof/>
+                <w:kern w:val="2"/>
+                <w:sz w:val="24"/>
+                <w:szCs w:val="24"/>
+                <w:lang w:eastAsia="en-US"/>
+                <w14:ligatures w14:val="standardContextual"/>
+              </w:rPr>
+              <w:tab/>
+            </w:r>
+            <w:r>
+              <w:rPr>
+                <w:rStyle w:val="Hyperlink"/>
+                <w:noProof/>
+              </w:rPr>
+              <w:t>Sequence Diagrams</w:t>
+            </w:r>
+            <w:r>
+              <w:rPr>
+                <w:noProof/>
+              </w:rPr>
+              <w:tab/>
+            </w:r>
+            <w:r>
+              <w:rPr>
+                <w:noProof/>
+              </w:rPr>
+              <w:fldChar w:fldCharType="begin"/>
+            </w:r>
+            <w:r>
+              <w:rPr>
+                <w:noProof/>
+              </w:rPr>
+              <w:instrText xml:space="preserve"> PAGEREF _Toc226576884 \h </w:instrText>
+            </w:r>
+            <w:r>
+              <w:rPr>
+                <w:noProof/>
+              </w:rPr>
+            </w:r>
+            <w:r>
+              <w:rPr>
+                <w:noProof/>
+              </w:rPr>
+              <w:fldChar w:fldCharType="separate"/>
+            </w:r>
+            <w:r>
+              <w:rPr>
+                <w:noProof/>
+              </w:rPr>
+              <w:t>xiv</w:t>
+            </w:r>
+            <w:r>
+              <w:rPr>
+                <w:noProof/>
+              </w:rPr>
+              <w:fldChar w:fldCharType="end"/>
+            </w:r>
+          </w:hyperlink>
+        </w:p>
+        <w:p>
+          <w:pPr>
+            <w:pStyle w:val="TOC2"/>
+            <w:rPr>
+              <w:rFonts w:asciiTheme="minorHAnsi" w:eastAsiaTheme="minorEastAsia" w:hAnsiTheme="minorHAnsi" w:cstheme="minorBidi"/>
+              <w:smallCaps w:val="0"/>
+              <w:noProof/>
+              <w:kern w:val="2"/>
+              <w:sz w:val="24"/>
+              <w:szCs w:val="24"/>
+              <w:lang w:eastAsia="en-US"/>
+              <w14:ligatures w14:val="standardContextual"/>
+            </w:rPr>
+          </w:pPr>
+          <w:hyperlink w:anchor="_Toc226576885" w:history="1">
+            <w:r>
+              <w:rPr>
+                <w:rStyle w:val="Hyperlink"/>
+                <w:noProof/>
+              </w:rPr>
+              <w:t>4.2.2: User Pre-game Sequence</w:t>
+            </w:r>
+            <w:r>
+              <w:rPr>
+                <w:noProof/>
+              </w:rPr>
+              <w:tab/>
+            </w:r>
+            <w:r>
+              <w:rPr>
+                <w:noProof/>
+              </w:rPr>
+              <w:fldChar w:fldCharType="begin"/>
+            </w:r>
+            <w:r>
+              <w:rPr>
+                <w:noProof/>
+              </w:rPr>
+              <w:instrText xml:space="preserve"> PAGEREF _Toc226576885 \h </w:instrText>
+            </w:r>
+            <w:r>
+              <w:rPr>
+                <w:noProof/>
+              </w:rPr>
+            </w:r>
+            <w:r>
+              <w:rPr>
+                <w:noProof/>
+              </w:rPr>
+              <w:fldChar w:fldCharType="separate"/>
+            </w:r>
+            <w:r>
+              <w:rPr>
+                <w:noProof/>
+              </w:rPr>
+              <w:t>xiv</w:t>
+            </w:r>
+            <w:r>
+              <w:rPr>
+                <w:noProof/>
+              </w:rPr>
+              <w:fldChar w:fldCharType="end"/>
+            </w:r>
+          </w:hyperlink>
+        </w:p>
+        <w:p>
+          <w:pPr>
+            <w:pStyle w:val="TOC2"/>
+            <w:rPr>
+              <w:rFonts w:asciiTheme="minorHAnsi" w:eastAsiaTheme="minorEastAsia" w:hAnsiTheme="minorHAnsi" w:cstheme="minorBidi"/>
+              <w:smallCaps w:val="0"/>
+              <w:noProof/>
+              <w:kern w:val="2"/>
+              <w:sz w:val="24"/>
+              <w:szCs w:val="24"/>
+              <w:lang w:eastAsia="en-US"/>
+              <w14:ligatures w14:val="standardContextual"/>
+            </w:rPr>
+          </w:pPr>
+          <w:hyperlink w:anchor="_Toc226576886" w:history="1">
+            <w:r>
+              <w:rPr>
+                <w:rStyle w:val="Hyperlink"/>
+                <w:noProof/>
+              </w:rPr>
+              <w:t>4.2.3: User In-game Sequence</w:t>
+            </w:r>
+            <w:r>
+              <w:rPr>
+                <w:noProof/>
+              </w:rPr>
+              <w:tab/>
+            </w:r>
+            <w:r>
+              <w:rPr>
+                <w:noProof/>
+              </w:rPr>
+              <w:fldChar w:fldCharType="begin"/>
+            </w:r>
+            <w:r>
+              <w:rPr>
+                <w:noProof/>
+              </w:rPr>
+              <w:instrText xml:space="preserve"> PAGEREF _Toc226576886 \h </w:instrText>
+            </w:r>
+            <w:r>
+              <w:rPr>
+                <w:noProof/>
+              </w:rPr>
+            </w:r>
+            <w:r>
+              <w:rPr>
+                <w:noProof/>
+              </w:rPr>
+              <w:fldChar w:fldCharType="separate"/>
+            </w:r>
+            <w:r>
+              <w:rPr>
+                <w:noProof/>
+              </w:rPr>
+              <w:t>xv</w:t>
+            </w:r>
+            <w:r>
+              <w:rPr>
+                <w:noProof/>
+              </w:rPr>
+              <w:fldChar w:fldCharType="end"/>
+            </w:r>
+          </w:hyperlink>
+        </w:p>
+        <w:p>
+          <w:pPr>
+            <w:pStyle w:val="TOC2"/>
+            <w:rPr>
+              <w:rFonts w:asciiTheme="minorHAnsi" w:eastAsiaTheme="minorEastAsia" w:hAnsiTheme="minorHAnsi" w:cstheme="minorBidi"/>
+              <w:smallCaps w:val="0"/>
+              <w:noProof/>
+              <w:kern w:val="2"/>
+              <w:sz w:val="24"/>
+              <w:szCs w:val="24"/>
+              <w:lang w:eastAsia="en-US"/>
+              <w14:ligatures w14:val="standardContextual"/>
+            </w:rPr>
+          </w:pPr>
+          <w:hyperlink w:anchor="_Toc226576887" w:history="1">
+            <w:r>
+              <w:rPr>
+                <w:rStyle w:val="Hyperlink"/>
+                <w:noProof/>
+              </w:rPr>
+              <w:t>4.2.4: Dealer pre-game Sequence</w:t>
+            </w:r>
+            <w:r>
+              <w:rPr>
+                <w:noProof/>
+              </w:rPr>
+              <w:tab/>
+            </w:r>
+            <w:r>
+              <w:rPr>
+                <w:noProof/>
+              </w:rPr>
+              <w:fldChar w:fldCharType="begin"/>
+            </w:r>
+            <w:r>
+              <w:rPr>
+                <w:noProof/>
+              </w:rPr>
+              <w:instrText xml:space="preserve"> PAGEREF _Toc226576887 \h </w:instrText>
+            </w:r>
+            <w:r>
+              <w:rPr>
+                <w:noProof/>
+              </w:rPr>
+            </w:r>
+            <w:r>
+              <w:rPr>
+                <w:noProof/>
+              </w:rPr>
+              <w:fldChar w:fldCharType="separate"/>
+            </w:r>
+            <w:r>
+              <w:rPr>
+                <w:noProof/>
+              </w:rPr>
+              <w:t>xvi</w:t>
+            </w:r>
+            <w:r>
+              <w:rPr>
+                <w:noProof/>
+              </w:rPr>
+              <w:fldChar w:fldCharType="end"/>
+            </w:r>
+          </w:hyperlink>
+        </w:p>
+        <w:p>
+          <w:pPr>
+            <w:pStyle w:val="TOC2"/>
+            <w:rPr>
+              <w:rFonts w:asciiTheme="minorHAnsi" w:eastAsiaTheme="minorEastAsia" w:hAnsiTheme="minorHAnsi" w:cstheme="minorBidi"/>
+              <w:smallCaps w:val="0"/>
+              <w:noProof/>
+              <w:kern w:val="2"/>
+              <w:sz w:val="24"/>
+              <w:szCs w:val="24"/>
+              <w:lang w:eastAsia="en-US"/>
+              <w14:ligatures w14:val="standardContextual"/>
+            </w:rPr>
+          </w:pPr>
+          <w:hyperlink w:anchor="_Toc226576888" w:history="1">
+            <w:r>
+              <w:rPr>
+                <w:noProof/>
+              </w:rPr>
+              <w:tab/>
+            </w:r>
+            <w:r>
+              <w:rPr>
+                <w:noProof/>
+              </w:rPr>
+              <w:fldChar w:fldCharType="begin"/>
+            </w:r>
+            <w:r>
+              <w:rPr>
+                <w:noProof/>
+              </w:rPr>
+              <w:instrText xml:space="preserve"> PAGEREF _Toc226576888 \h </w:instrText>
+            </w:r>
+            <w:r>
+              <w:rPr>
+                <w:noProof/>
+              </w:rPr>
+            </w:r>
+            <w:r>
+              <w:rPr>
+                <w:noProof/>
+              </w:rPr>
+              <w:fldChar w:fldCharType="separate"/>
+            </w:r>
+            <w:r>
+              <w:rPr>
+                <w:noProof/>
+              </w:rPr>
+              <w:t>xvi</w:t>
+            </w:r>
+            <w:r>
+              <w:rPr>
+                <w:noProof/>
+              </w:rPr>
+              <w:fldChar w:fldCharType="end"/>
+            </w:r>
+          </w:hyperlink>
+        </w:p>
+        <w:p>
+          <w:pPr>
+            <w:pStyle w:val="TOC2"/>
+            <w:rPr>
+              <w:rFonts w:asciiTheme="minorHAnsi" w:eastAsiaTheme="minorEastAsia" w:hAnsiTheme="minorHAnsi" w:cstheme="minorBidi"/>
+              <w:smallCaps w:val="0"/>
+              <w:noProof/>
+              <w:kern w:val="2"/>
+              <w:sz w:val="24"/>
+              <w:szCs w:val="24"/>
+              <w:lang w:eastAsia="en-US"/>
+              <w14:ligatures w14:val="standardContextual"/>
+            </w:rPr>
+          </w:pPr>
+          <w:hyperlink w:anchor="_Toc226576889" w:history="1">
+            <w:r>
+              <w:rPr>
+                <w:rStyle w:val="Hyperlink"/>
+                <w:bCs/>
+                <w:noProof/>
+              </w:rPr>
+              <w:t>This diagram shows the sequence for each action after the dealer logs on</w:t>
+            </w:r>
+            <w:r>
+              <w:rPr>
+                <w:noProof/>
+              </w:rPr>
+              <w:tab/>
+            </w:r>
+            <w:r>
+              <w:rPr>
+                <w:noProof/>
+              </w:rPr>
+              <w:fldChar w:fldCharType="begin"/>
+            </w:r>
+            <w:r>
+              <w:rPr>
+                <w:noProof/>
+              </w:rPr>
+              <w:instrText xml:space="preserve"> PAGEREF _Toc226576889 \h </w:instrText>
+            </w:r>
+            <w:r>
+              <w:rPr>
+                <w:noProof/>
+              </w:rPr>
+            </w:r>
+            <w:r>
+              <w:rPr>
+                <w:noProof/>
+              </w:rPr>
+              <w:fldChar w:fldCharType="separate"/>
+            </w:r>
+            <w:r>
+              <w:rPr>
+                <w:noProof/>
+              </w:rPr>
+              <w:t>xvi</w:t>
+            </w:r>
+            <w:r>
+              <w:rPr>
+                <w:noProof/>
+              </w:rPr>
+              <w:fldChar w:fldCharType="end"/>
+            </w:r>
+          </w:hyperlink>
+        </w:p>
+        <w:p>
+          <w:pPr>
+            <w:pStyle w:val="TOC2"/>
+            <w:rPr>
+              <w:rFonts w:asciiTheme="minorHAnsi" w:eastAsiaTheme="minorEastAsia" w:hAnsiTheme="minorHAnsi" w:cstheme="minorBidi"/>
+              <w:smallCaps w:val="0"/>
+              <w:noProof/>
+              <w:kern w:val="2"/>
+              <w:sz w:val="24"/>
+              <w:szCs w:val="24"/>
+              <w:lang w:eastAsia="en-US"/>
+              <w14:ligatures w14:val="standardContextual"/>
+            </w:rPr>
+          </w:pPr>
+          <w:hyperlink w:anchor="_Toc226576890" w:history="1">
+            <w:r>
+              <w:rPr>
+                <w:rStyle w:val="Hyperlink"/>
+                <w:noProof/>
+              </w:rPr>
+              <w:t>4.2.5: Dealer in-game Sequence</w:t>
+            </w:r>
+            <w:r>
+              <w:rPr>
+                <w:noProof/>
+              </w:rPr>
+              <w:tab/>
+            </w:r>
+            <w:r>
+              <w:rPr>
+                <w:noProof/>
+              </w:rPr>
+              <w:fldChar w:fldCharType="begin"/>
+            </w:r>
+            <w:r>
+              <w:rPr>
+                <w:noProof/>
+              </w:rPr>
+              <w:instrText xml:space="preserve"> PAGEREF _Toc226576890 \h </w:instrText>
+            </w:r>
+            <w:r>
+              <w:rPr>
+                <w:noProof/>
+              </w:rPr>
+            </w:r>
+            <w:r>
+              <w:rPr>
+                <w:noProof/>
+              </w:rPr>
+              <w:fldChar w:fldCharType="separate"/>
+            </w:r>
+            <w:r>
+              <w:rPr>
+                <w:noProof/>
+              </w:rPr>
+              <w:t>xvii</w:t>
+            </w:r>
+            <w:r>
+              <w:rPr>
+                <w:noProof/>
+              </w:rPr>
+              <w:fldChar w:fldCharType="end"/>
+            </w:r>
+          </w:hyperlink>
+        </w:p>
+        <w:p>
+          <w:pPr>
+            <w:pStyle w:val="TOC2"/>
+            <w:rPr>
+              <w:rFonts w:asciiTheme="minorHAnsi" w:eastAsiaTheme="minorEastAsia" w:hAnsiTheme="minorHAnsi" w:cstheme="minorBidi"/>
+              <w:smallCaps w:val="0"/>
+              <w:noProof/>
+              <w:kern w:val="2"/>
+              <w:sz w:val="24"/>
+              <w:szCs w:val="24"/>
+              <w:lang w:eastAsia="en-US"/>
+              <w14:ligatures w14:val="standardContextual"/>
+            </w:rPr>
+          </w:pPr>
+          <w:hyperlink w:anchor="_Toc226576891" w:history="1">
+            <w:r>
+              <w:rPr>
+                <w:rStyle w:val="Hyperlink"/>
+                <w:noProof/>
+              </w:rPr>
+              <w:t>4.3: Common &amp; Intended User Interfacing Flow</w:t>
+            </w:r>
+            <w:r>
+              <w:rPr>
+                <w:noProof/>
+              </w:rPr>
+              <w:tab/>
+            </w:r>
+            <w:r>
+              <w:rPr>
+                <w:noProof/>
+              </w:rPr>
+              <w:fldChar w:fldCharType="begin"/>
+            </w:r>
+            <w:r>
+              <w:rPr>
+                <w:noProof/>
+              </w:rPr>
+              <w:instrText xml:space="preserve"> PAGEREF _Toc226576891 \h </w:instrText>
+            </w:r>
+            <w:r>
+              <w:rPr>
+                <w:noProof/>
+              </w:rPr>
+            </w:r>
+            <w:r>
+              <w:rPr>
+                <w:noProof/>
+              </w:rPr>
+              <w:fldChar w:fldCharType="separate"/>
+            </w:r>
+            <w:r>
+              <w:rPr>
+                <w:noProof/>
+              </w:rPr>
+              <w:t>xviii</w:t>
+            </w:r>
+            <w:r>
+              <w:rPr>
+                <w:noProof/>
               </w:rPr>
               <w:fldChar w:fldCharType="end"/>
             </w:r>
@@ -2153,1542 +4115,6 @@
               <w14:ligatures w14:val="standardContextual"/>
             </w:rPr>
           </w:pPr>
-          <w:hyperlink w:anchor="_Toc226573990">
-            <w:r>
-              <w:rPr>
-                <w:rStyle w:val="IndexLink"/>
-              </w:rPr>
-              <w:t>1.1.</w:t>
-            </w:r>
-            <w:r>
-              <w:rPr>
-                <w:rStyle w:val="IndexLink"/>
-                <w:rFonts w:asciiTheme="minorHAnsi" w:eastAsiaTheme="minorEastAsia" w:hAnsiTheme="minorHAnsi" w:cstheme="minorBidi"/>
-                <w:smallCaps w:val="0"/>
-                <w:kern w:val="2"/>
-                <w:sz w:val="24"/>
-                <w:szCs w:val="24"/>
-                <w:lang w:eastAsia="en-US"/>
-                <w14:ligatures w14:val="standardContextual"/>
-              </w:rPr>
-              <w:tab/>
-            </w:r>
-            <w:r>
-              <w:rPr>
-                <w:webHidden/>
-              </w:rPr>
-              <w:fldChar w:fldCharType="begin"/>
-            </w:r>
-            <w:r>
-              <w:rPr>
-                <w:webHidden/>
-              </w:rPr>
-              <w:instrText>PAGEREF _Toc226573990 \h</w:instrText>
-            </w:r>
-            <w:r>
-              <w:rPr>
-                <w:webHidden/>
-              </w:rPr>
-            </w:r>
-            <w:r>
-              <w:rPr>
-                <w:webHidden/>
-              </w:rPr>
-              <w:fldChar w:fldCharType="separate"/>
-            </w:r>
-            <w:r>
-              <w:rPr>
-                <w:rStyle w:val="IndexLink"/>
-              </w:rPr>
-              <w:t>Scope</w:t>
-            </w:r>
-            <w:r>
-              <w:rPr>
-                <w:rStyle w:val="IndexLink"/>
-              </w:rPr>
-              <w:tab/>
-              <w:t>iv</w:t>
-            </w:r>
-            <w:r>
-              <w:rPr>
-                <w:webHidden/>
-              </w:rPr>
-              <w:fldChar w:fldCharType="end"/>
-            </w:r>
-          </w:hyperlink>
-        </w:p>
-        <w:p>
-          <w:pPr>
-            <w:pStyle w:val="TOC2"/>
-            <w:tabs>
-              <w:tab w:val="left" w:pos="800"/>
-            </w:tabs>
-            <w:rPr>
-              <w:rFonts w:asciiTheme="minorHAnsi" w:eastAsiaTheme="minorEastAsia" w:hAnsiTheme="minorHAnsi" w:cstheme="minorBidi"/>
-              <w:smallCaps w:val="0"/>
-              <w:kern w:val="2"/>
-              <w:sz w:val="24"/>
-              <w:szCs w:val="24"/>
-              <w:lang w:eastAsia="en-US"/>
-              <w14:ligatures w14:val="standardContextual"/>
-            </w:rPr>
-          </w:pPr>
-          <w:hyperlink w:anchor="_Toc226573991">
-            <w:r>
-              <w:rPr>
-                <w:rStyle w:val="IndexLink"/>
-              </w:rPr>
-              <w:t>1.1.</w:t>
-            </w:r>
-            <w:r>
-              <w:rPr>
-                <w:rStyle w:val="IndexLink"/>
-                <w:rFonts w:asciiTheme="minorHAnsi" w:eastAsiaTheme="minorEastAsia" w:hAnsiTheme="minorHAnsi" w:cstheme="minorBidi"/>
-                <w:smallCaps w:val="0"/>
-                <w:kern w:val="2"/>
-                <w:sz w:val="24"/>
-                <w:szCs w:val="24"/>
-                <w:lang w:eastAsia="en-US"/>
-                <w14:ligatures w14:val="standardContextual"/>
-              </w:rPr>
-              <w:tab/>
-            </w:r>
-            <w:r>
-              <w:rPr>
-                <w:webHidden/>
-              </w:rPr>
-              <w:fldChar w:fldCharType="begin"/>
-            </w:r>
-            <w:r>
-              <w:rPr>
-                <w:webHidden/>
-              </w:rPr>
-              <w:instrText>PAGEREF _Toc226573991 \h</w:instrText>
-            </w:r>
-            <w:r>
-              <w:rPr>
-                <w:webHidden/>
-              </w:rPr>
-            </w:r>
-            <w:r>
-              <w:rPr>
-                <w:webHidden/>
-              </w:rPr>
-              <w:fldChar w:fldCharType="separate"/>
-            </w:r>
-            <w:r>
-              <w:rPr>
-                <w:rStyle w:val="IndexLink"/>
-              </w:rPr>
-              <w:t>Definitions, Acronyms, Abbreviations</w:t>
-            </w:r>
-            <w:r>
-              <w:rPr>
-                <w:rStyle w:val="IndexLink"/>
-              </w:rPr>
-              <w:tab/>
-              <w:t>iv</w:t>
-            </w:r>
-            <w:r>
-              <w:rPr>
-                <w:webHidden/>
-              </w:rPr>
-              <w:fldChar w:fldCharType="end"/>
-            </w:r>
-          </w:hyperlink>
-        </w:p>
-        <w:p>
-          <w:pPr>
-            <w:pStyle w:val="TOC2"/>
-            <w:tabs>
-              <w:tab w:val="left" w:pos="800"/>
-            </w:tabs>
-            <w:rPr>
-              <w:rFonts w:asciiTheme="minorHAnsi" w:eastAsiaTheme="minorEastAsia" w:hAnsiTheme="minorHAnsi" w:cstheme="minorBidi"/>
-              <w:smallCaps w:val="0"/>
-              <w:kern w:val="2"/>
-              <w:sz w:val="24"/>
-              <w:szCs w:val="24"/>
-              <w:lang w:eastAsia="en-US"/>
-              <w14:ligatures w14:val="standardContextual"/>
-            </w:rPr>
-          </w:pPr>
-          <w:hyperlink w:anchor="_Toc226573992">
-            <w:r>
-              <w:rPr>
-                <w:rStyle w:val="IndexLink"/>
-              </w:rPr>
-              <w:t>1.2.</w:t>
-            </w:r>
-            <w:r>
-              <w:rPr>
-                <w:rStyle w:val="IndexLink"/>
-                <w:rFonts w:asciiTheme="minorHAnsi" w:eastAsiaTheme="minorEastAsia" w:hAnsiTheme="minorHAnsi" w:cstheme="minorBidi"/>
-                <w:smallCaps w:val="0"/>
-                <w:kern w:val="2"/>
-                <w:sz w:val="24"/>
-                <w:szCs w:val="24"/>
-                <w:lang w:eastAsia="en-US"/>
-                <w14:ligatures w14:val="standardContextual"/>
-              </w:rPr>
-              <w:tab/>
-            </w:r>
-            <w:r>
-              <w:rPr>
-                <w:webHidden/>
-              </w:rPr>
-              <w:fldChar w:fldCharType="begin"/>
-            </w:r>
-            <w:r>
-              <w:rPr>
-                <w:webHidden/>
-              </w:rPr>
-              <w:instrText>PAGEREF _Toc226573992 \h</w:instrText>
-            </w:r>
-            <w:r>
-              <w:rPr>
-                <w:webHidden/>
-              </w:rPr>
-            </w:r>
-            <w:r>
-              <w:rPr>
-                <w:webHidden/>
-              </w:rPr>
-              <w:fldChar w:fldCharType="separate"/>
-            </w:r>
-            <w:r>
-              <w:rPr>
-                <w:rStyle w:val="IndexLink"/>
-              </w:rPr>
-              <w:t>Overview</w:t>
-            </w:r>
-            <w:r>
-              <w:rPr>
-                <w:rStyle w:val="IndexLink"/>
-              </w:rPr>
-              <w:tab/>
-              <w:t>v</w:t>
-            </w:r>
-            <w:r>
-              <w:rPr>
-                <w:webHidden/>
-              </w:rPr>
-              <w:fldChar w:fldCharType="end"/>
-            </w:r>
-          </w:hyperlink>
-        </w:p>
-        <w:p>
-          <w:pPr>
-            <w:pStyle w:val="TOC1"/>
-            <w:tabs>
-              <w:tab w:val="left" w:pos="400"/>
-            </w:tabs>
-            <w:rPr>
-              <w:rFonts w:asciiTheme="minorHAnsi" w:eastAsiaTheme="minorEastAsia" w:hAnsiTheme="minorHAnsi" w:cstheme="minorBidi"/>
-              <w:b w:val="0"/>
-              <w:caps w:val="0"/>
-              <w:kern w:val="2"/>
-              <w:sz w:val="24"/>
-              <w:szCs w:val="24"/>
-              <w:lang w:eastAsia="en-US"/>
-              <w14:ligatures w14:val="standardContextual"/>
-            </w:rPr>
-          </w:pPr>
-          <w:hyperlink w:anchor="_Toc226573993">
-            <w:r>
-              <w:rPr>
-                <w:rStyle w:val="IndexLink"/>
-                <w:lang w:bidi="en-US"/>
-              </w:rPr>
-              <w:t>2.</w:t>
-            </w:r>
-            <w:r>
-              <w:rPr>
-                <w:rStyle w:val="IndexLink"/>
-                <w:rFonts w:asciiTheme="minorHAnsi" w:eastAsiaTheme="minorEastAsia" w:hAnsiTheme="minorHAnsi" w:cstheme="minorBidi"/>
-                <w:b w:val="0"/>
-                <w:caps w:val="0"/>
-                <w:kern w:val="2"/>
-                <w:sz w:val="24"/>
-                <w:szCs w:val="24"/>
-                <w:lang w:eastAsia="en-US"/>
-                <w14:ligatures w14:val="standardContextual"/>
-              </w:rPr>
-              <w:tab/>
-            </w:r>
-            <w:r>
-              <w:rPr>
-                <w:webHidden/>
-              </w:rPr>
-              <w:fldChar w:fldCharType="begin"/>
-            </w:r>
-            <w:r>
-              <w:rPr>
-                <w:webHidden/>
-              </w:rPr>
-              <w:instrText>PAGEREF _Toc226573993 \h</w:instrText>
-            </w:r>
-            <w:r>
-              <w:rPr>
-                <w:webHidden/>
-              </w:rPr>
-            </w:r>
-            <w:r>
-              <w:rPr>
-                <w:webHidden/>
-              </w:rPr>
-              <w:fldChar w:fldCharType="separate"/>
-            </w:r>
-            <w:r>
-              <w:rPr>
-                <w:rStyle w:val="IndexLink"/>
-              </w:rPr>
-              <w:t>Architecture</w:t>
-            </w:r>
-            <w:r>
-              <w:rPr>
-                <w:rStyle w:val="IndexLink"/>
-              </w:rPr>
-              <w:tab/>
-              <w:t>vi</w:t>
-            </w:r>
-            <w:r>
-              <w:rPr>
-                <w:webHidden/>
-              </w:rPr>
-              <w:fldChar w:fldCharType="end"/>
-            </w:r>
-          </w:hyperlink>
-        </w:p>
-        <w:p>
-          <w:pPr>
-            <w:pStyle w:val="TOC2"/>
-            <w:tabs>
-              <w:tab w:val="left" w:pos="800"/>
-            </w:tabs>
-            <w:rPr>
-              <w:rFonts w:asciiTheme="minorHAnsi" w:eastAsiaTheme="minorEastAsia" w:hAnsiTheme="minorHAnsi" w:cstheme="minorBidi"/>
-              <w:smallCaps w:val="0"/>
-              <w:kern w:val="2"/>
-              <w:sz w:val="24"/>
-              <w:szCs w:val="24"/>
-              <w:lang w:eastAsia="en-US"/>
-              <w14:ligatures w14:val="standardContextual"/>
-            </w:rPr>
-          </w:pPr>
-          <w:hyperlink w:anchor="_Toc226573994">
-            <w:r>
-              <w:rPr>
-                <w:rStyle w:val="IndexLink"/>
-              </w:rPr>
-              <w:t>2.1.</w:t>
-            </w:r>
-            <w:r>
-              <w:rPr>
-                <w:rStyle w:val="IndexLink"/>
-                <w:rFonts w:asciiTheme="minorHAnsi" w:eastAsiaTheme="minorEastAsia" w:hAnsiTheme="minorHAnsi" w:cstheme="minorBidi"/>
-                <w:smallCaps w:val="0"/>
-                <w:kern w:val="2"/>
-                <w:sz w:val="24"/>
-                <w:szCs w:val="24"/>
-                <w:lang w:eastAsia="en-US"/>
-                <w14:ligatures w14:val="standardContextual"/>
-              </w:rPr>
-              <w:tab/>
-            </w:r>
-            <w:r>
-              <w:rPr>
-                <w:webHidden/>
-              </w:rPr>
-              <w:fldChar w:fldCharType="begin"/>
-            </w:r>
-            <w:r>
-              <w:rPr>
-                <w:webHidden/>
-              </w:rPr>
-              <w:instrText>PAGEREF _Toc226573994 \h</w:instrText>
-            </w:r>
-            <w:r>
-              <w:rPr>
-                <w:webHidden/>
-              </w:rPr>
-            </w:r>
-            <w:r>
-              <w:rPr>
-                <w:webHidden/>
-              </w:rPr>
-              <w:fldChar w:fldCharType="separate"/>
-            </w:r>
-            <w:r>
-              <w:rPr>
-                <w:rStyle w:val="IndexLink"/>
-              </w:rPr>
-              <w:t>Overview</w:t>
-            </w:r>
-            <w:r>
-              <w:rPr>
-                <w:rStyle w:val="IndexLink"/>
-              </w:rPr>
-              <w:tab/>
-              <w:t>vi</w:t>
-            </w:r>
-            <w:r>
-              <w:rPr>
-                <w:webHidden/>
-              </w:rPr>
-              <w:fldChar w:fldCharType="end"/>
-            </w:r>
-          </w:hyperlink>
-        </w:p>
-        <w:p>
-          <w:pPr>
-            <w:pStyle w:val="TOC2"/>
-            <w:tabs>
-              <w:tab w:val="left" w:pos="800"/>
-            </w:tabs>
-            <w:rPr>
-              <w:rFonts w:asciiTheme="minorHAnsi" w:eastAsiaTheme="minorEastAsia" w:hAnsiTheme="minorHAnsi" w:cstheme="minorBidi"/>
-              <w:smallCaps w:val="0"/>
-              <w:kern w:val="2"/>
-              <w:sz w:val="24"/>
-              <w:szCs w:val="24"/>
-              <w:lang w:eastAsia="en-US"/>
-              <w14:ligatures w14:val="standardContextual"/>
-            </w:rPr>
-          </w:pPr>
-          <w:hyperlink w:anchor="_Toc226573995">
-            <w:r>
-              <w:rPr>
-                <w:rStyle w:val="IndexLink"/>
-              </w:rPr>
-              <w:t>2.2.</w:t>
-            </w:r>
-            <w:r>
-              <w:rPr>
-                <w:rStyle w:val="IndexLink"/>
-                <w:rFonts w:asciiTheme="minorHAnsi" w:eastAsiaTheme="minorEastAsia" w:hAnsiTheme="minorHAnsi" w:cstheme="minorBidi"/>
-                <w:smallCaps w:val="0"/>
-                <w:kern w:val="2"/>
-                <w:sz w:val="24"/>
-                <w:szCs w:val="24"/>
-                <w:lang w:eastAsia="en-US"/>
-                <w14:ligatures w14:val="standardContextual"/>
-              </w:rPr>
-              <w:tab/>
-            </w:r>
-            <w:r>
-              <w:rPr>
-                <w:webHidden/>
-              </w:rPr>
-              <w:fldChar w:fldCharType="begin"/>
-            </w:r>
-            <w:r>
-              <w:rPr>
-                <w:webHidden/>
-              </w:rPr>
-              <w:instrText>PAGEREF _Toc226573995 \h</w:instrText>
-            </w:r>
-            <w:r>
-              <w:rPr>
-                <w:webHidden/>
-              </w:rPr>
-            </w:r>
-            <w:r>
-              <w:rPr>
-                <w:webHidden/>
-              </w:rPr>
-              <w:fldChar w:fldCharType="separate"/>
-            </w:r>
-            <w:r>
-              <w:rPr>
-                <w:rStyle w:val="IndexLink"/>
-              </w:rPr>
-              <w:t>Networking</w:t>
-            </w:r>
-            <w:r>
-              <w:rPr>
-                <w:rStyle w:val="IndexLink"/>
-              </w:rPr>
-              <w:tab/>
-              <w:t>vi</w:t>
-            </w:r>
-            <w:r>
-              <w:rPr>
-                <w:webHidden/>
-              </w:rPr>
-              <w:fldChar w:fldCharType="end"/>
-            </w:r>
-          </w:hyperlink>
-        </w:p>
-        <w:p>
-          <w:pPr>
-            <w:pStyle w:val="TOC2"/>
-            <w:tabs>
-              <w:tab w:val="left" w:pos="800"/>
-            </w:tabs>
-            <w:rPr>
-              <w:rFonts w:asciiTheme="minorHAnsi" w:eastAsiaTheme="minorEastAsia" w:hAnsiTheme="minorHAnsi" w:cstheme="minorBidi"/>
-              <w:smallCaps w:val="0"/>
-              <w:kern w:val="2"/>
-              <w:sz w:val="24"/>
-              <w:szCs w:val="24"/>
-              <w:lang w:eastAsia="en-US"/>
-              <w14:ligatures w14:val="standardContextual"/>
-            </w:rPr>
-          </w:pPr>
-          <w:hyperlink w:anchor="_Toc226573996">
-            <w:r>
-              <w:rPr>
-                <w:rStyle w:val="IndexLink"/>
-              </w:rPr>
-              <w:t>2.3.</w:t>
-            </w:r>
-            <w:r>
-              <w:rPr>
-                <w:rStyle w:val="IndexLink"/>
-                <w:rFonts w:asciiTheme="minorHAnsi" w:eastAsiaTheme="minorEastAsia" w:hAnsiTheme="minorHAnsi" w:cstheme="minorBidi"/>
-                <w:smallCaps w:val="0"/>
-                <w:kern w:val="2"/>
-                <w:sz w:val="24"/>
-                <w:szCs w:val="24"/>
-                <w:lang w:eastAsia="en-US"/>
-                <w14:ligatures w14:val="standardContextual"/>
-              </w:rPr>
-              <w:tab/>
-            </w:r>
-            <w:r>
-              <w:rPr>
-                <w:webHidden/>
-              </w:rPr>
-              <w:fldChar w:fldCharType="begin"/>
-            </w:r>
-            <w:r>
-              <w:rPr>
-                <w:webHidden/>
-              </w:rPr>
-              <w:instrText>PAGEREF _Toc226573996 \h</w:instrText>
-            </w:r>
-            <w:r>
-              <w:rPr>
-                <w:webHidden/>
-              </w:rPr>
-            </w:r>
-            <w:r>
-              <w:rPr>
-                <w:webHidden/>
-              </w:rPr>
-              <w:fldChar w:fldCharType="separate"/>
-            </w:r>
-            <w:r>
-              <w:rPr>
-                <w:rStyle w:val="IndexLink"/>
-              </w:rPr>
-              <w:t>Messaging</w:t>
-            </w:r>
-            <w:r>
-              <w:rPr>
-                <w:rStyle w:val="IndexLink"/>
-              </w:rPr>
-              <w:tab/>
-              <w:t>vi</w:t>
-            </w:r>
-            <w:r>
-              <w:rPr>
-                <w:webHidden/>
-              </w:rPr>
-              <w:fldChar w:fldCharType="end"/>
-            </w:r>
-          </w:hyperlink>
-        </w:p>
-        <w:p>
-          <w:pPr>
-            <w:pStyle w:val="TOC2"/>
-            <w:tabs>
-              <w:tab w:val="left" w:pos="800"/>
-            </w:tabs>
-            <w:rPr>
-              <w:rFonts w:asciiTheme="minorHAnsi" w:eastAsiaTheme="minorEastAsia" w:hAnsiTheme="minorHAnsi" w:cstheme="minorBidi"/>
-              <w:smallCaps w:val="0"/>
-              <w:kern w:val="2"/>
-              <w:sz w:val="24"/>
-              <w:szCs w:val="24"/>
-              <w:lang w:eastAsia="en-US"/>
-              <w14:ligatures w14:val="standardContextual"/>
-            </w:rPr>
-          </w:pPr>
-          <w:hyperlink w:anchor="_Toc226573997">
-            <w:r>
-              <w:rPr>
-                <w:rStyle w:val="IndexLink"/>
-              </w:rPr>
-              <w:t>2.4.</w:t>
-            </w:r>
-            <w:r>
-              <w:rPr>
-                <w:rStyle w:val="IndexLink"/>
-                <w:rFonts w:asciiTheme="minorHAnsi" w:eastAsiaTheme="minorEastAsia" w:hAnsiTheme="minorHAnsi" w:cstheme="minorBidi"/>
-                <w:smallCaps w:val="0"/>
-                <w:kern w:val="2"/>
-                <w:sz w:val="24"/>
-                <w:szCs w:val="24"/>
-                <w:lang w:eastAsia="en-US"/>
-                <w14:ligatures w14:val="standardContextual"/>
-              </w:rPr>
-              <w:tab/>
-            </w:r>
-            <w:r>
-              <w:rPr>
-                <w:webHidden/>
-              </w:rPr>
-              <w:fldChar w:fldCharType="begin"/>
-            </w:r>
-            <w:r>
-              <w:rPr>
-                <w:webHidden/>
-              </w:rPr>
-              <w:instrText>PAGEREF _Toc226573997 \h</w:instrText>
-            </w:r>
-            <w:r>
-              <w:rPr>
-                <w:webHidden/>
-              </w:rPr>
-            </w:r>
-            <w:r>
-              <w:rPr>
-                <w:webHidden/>
-              </w:rPr>
-              <w:fldChar w:fldCharType="separate"/>
-            </w:r>
-            <w:r>
-              <w:rPr>
-                <w:rStyle w:val="IndexLink"/>
-              </w:rPr>
-              <w:t>Server</w:t>
-            </w:r>
-            <w:r>
-              <w:rPr>
-                <w:rStyle w:val="IndexLink"/>
-              </w:rPr>
-              <w:tab/>
-              <w:t>vi</w:t>
-            </w:r>
-            <w:r>
-              <w:rPr>
-                <w:webHidden/>
-              </w:rPr>
-              <w:fldChar w:fldCharType="end"/>
-            </w:r>
-          </w:hyperlink>
-        </w:p>
-        <w:p>
-          <w:pPr>
-            <w:pStyle w:val="TOC2"/>
-            <w:tabs>
-              <w:tab w:val="left" w:pos="800"/>
-            </w:tabs>
-            <w:rPr>
-              <w:rFonts w:asciiTheme="minorHAnsi" w:eastAsiaTheme="minorEastAsia" w:hAnsiTheme="minorHAnsi" w:cstheme="minorBidi"/>
-              <w:smallCaps w:val="0"/>
-              <w:kern w:val="2"/>
-              <w:sz w:val="24"/>
-              <w:szCs w:val="24"/>
-              <w:lang w:eastAsia="en-US"/>
-              <w14:ligatures w14:val="standardContextual"/>
-            </w:rPr>
-          </w:pPr>
-          <w:hyperlink w:anchor="_Toc226573998">
-            <w:r>
-              <w:rPr>
-                <w:rStyle w:val="IndexLink"/>
-              </w:rPr>
-              <w:t>2.5.</w:t>
-            </w:r>
-            <w:r>
-              <w:rPr>
-                <w:rStyle w:val="IndexLink"/>
-                <w:rFonts w:asciiTheme="minorHAnsi" w:eastAsiaTheme="minorEastAsia" w:hAnsiTheme="minorHAnsi" w:cstheme="minorBidi"/>
-                <w:smallCaps w:val="0"/>
-                <w:kern w:val="2"/>
-                <w:sz w:val="24"/>
-                <w:szCs w:val="24"/>
-                <w:lang w:eastAsia="en-US"/>
-                <w14:ligatures w14:val="standardContextual"/>
-              </w:rPr>
-              <w:tab/>
-            </w:r>
-            <w:r>
-              <w:rPr>
-                <w:webHidden/>
-              </w:rPr>
-              <w:fldChar w:fldCharType="begin"/>
-            </w:r>
-            <w:r>
-              <w:rPr>
-                <w:webHidden/>
-              </w:rPr>
-              <w:instrText>PAGEREF _Toc226573998 \h</w:instrText>
-            </w:r>
-            <w:r>
-              <w:rPr>
-                <w:webHidden/>
-              </w:rPr>
-            </w:r>
-            <w:r>
-              <w:rPr>
-                <w:webHidden/>
-              </w:rPr>
-              <w:fldChar w:fldCharType="separate"/>
-            </w:r>
-            <w:r>
-              <w:rPr>
-                <w:rStyle w:val="IndexLink"/>
-              </w:rPr>
-              <w:t>Client</w:t>
-            </w:r>
-            <w:r>
-              <w:rPr>
-                <w:rStyle w:val="IndexLink"/>
-              </w:rPr>
-              <w:tab/>
-              <w:t>vii</w:t>
-            </w:r>
-            <w:r>
-              <w:rPr>
-                <w:webHidden/>
-              </w:rPr>
-              <w:fldChar w:fldCharType="end"/>
-            </w:r>
-          </w:hyperlink>
-        </w:p>
-        <w:p>
-          <w:pPr>
-            <w:pStyle w:val="TOC1"/>
-            <w:tabs>
-              <w:tab w:val="left" w:pos="400"/>
-            </w:tabs>
-            <w:rPr>
-              <w:rFonts w:asciiTheme="minorHAnsi" w:eastAsiaTheme="minorEastAsia" w:hAnsiTheme="minorHAnsi" w:cstheme="minorBidi"/>
-              <w:b w:val="0"/>
-              <w:caps w:val="0"/>
-              <w:kern w:val="2"/>
-              <w:sz w:val="24"/>
-              <w:szCs w:val="24"/>
-              <w:lang w:eastAsia="en-US"/>
-              <w14:ligatures w14:val="standardContextual"/>
-            </w:rPr>
-          </w:pPr>
-          <w:hyperlink w:anchor="_Toc226573999">
-            <w:r>
-              <w:rPr>
-                <w:rStyle w:val="IndexLink"/>
-                <w:lang w:bidi="en-US"/>
-              </w:rPr>
-              <w:t>3.</w:t>
-            </w:r>
-            <w:r>
-              <w:rPr>
-                <w:rStyle w:val="IndexLink"/>
-                <w:rFonts w:asciiTheme="minorHAnsi" w:eastAsiaTheme="minorEastAsia" w:hAnsiTheme="minorHAnsi" w:cstheme="minorBidi"/>
-                <w:b w:val="0"/>
-                <w:caps w:val="0"/>
-                <w:kern w:val="2"/>
-                <w:sz w:val="24"/>
-                <w:szCs w:val="24"/>
-                <w:lang w:eastAsia="en-US"/>
-                <w14:ligatures w14:val="standardContextual"/>
-              </w:rPr>
-              <w:tab/>
-            </w:r>
-            <w:r>
-              <w:rPr>
-                <w:webHidden/>
-              </w:rPr>
-              <w:fldChar w:fldCharType="begin"/>
-            </w:r>
-            <w:r>
-              <w:rPr>
-                <w:webHidden/>
-              </w:rPr>
-              <w:instrText>PAGEREF _Toc226573999 \h</w:instrText>
-            </w:r>
-            <w:r>
-              <w:rPr>
-                <w:webHidden/>
-              </w:rPr>
-            </w:r>
-            <w:r>
-              <w:rPr>
-                <w:webHidden/>
-              </w:rPr>
-              <w:fldChar w:fldCharType="separate"/>
-            </w:r>
-            <w:r>
-              <w:rPr>
-                <w:rStyle w:val="IndexLink"/>
-              </w:rPr>
-              <w:t>System Interface Design</w:t>
-            </w:r>
-            <w:r>
-              <w:rPr>
-                <w:rStyle w:val="IndexLink"/>
-              </w:rPr>
-              <w:tab/>
-              <w:t>ix</w:t>
-            </w:r>
-            <w:r>
-              <w:rPr>
-                <w:webHidden/>
-              </w:rPr>
-              <w:fldChar w:fldCharType="end"/>
-            </w:r>
-          </w:hyperlink>
-        </w:p>
-        <w:p>
-          <w:pPr>
-            <w:pStyle w:val="TOC2"/>
-            <w:tabs>
-              <w:tab w:val="left" w:pos="800"/>
-            </w:tabs>
-            <w:rPr>
-              <w:rFonts w:asciiTheme="minorHAnsi" w:eastAsiaTheme="minorEastAsia" w:hAnsiTheme="minorHAnsi" w:cstheme="minorBidi"/>
-              <w:smallCaps w:val="0"/>
-              <w:kern w:val="2"/>
-              <w:sz w:val="24"/>
-              <w:szCs w:val="24"/>
-              <w:lang w:eastAsia="en-US"/>
-              <w14:ligatures w14:val="standardContextual"/>
-            </w:rPr>
-          </w:pPr>
-          <w:hyperlink w:anchor="_Toc226574000">
-            <w:r>
-              <w:rPr>
-                <w:rStyle w:val="IndexLink"/>
-              </w:rPr>
-              <w:t>3.1.</w:t>
-            </w:r>
-            <w:r>
-              <w:rPr>
-                <w:rStyle w:val="IndexLink"/>
-                <w:rFonts w:asciiTheme="minorHAnsi" w:eastAsiaTheme="minorEastAsia" w:hAnsiTheme="minorHAnsi" w:cstheme="minorBidi"/>
-                <w:smallCaps w:val="0"/>
-                <w:kern w:val="2"/>
-                <w:sz w:val="24"/>
-                <w:szCs w:val="24"/>
-                <w:lang w:eastAsia="en-US"/>
-                <w14:ligatures w14:val="standardContextual"/>
-              </w:rPr>
-              <w:tab/>
-            </w:r>
-            <w:r>
-              <w:rPr>
-                <w:webHidden/>
-              </w:rPr>
-              <w:fldChar w:fldCharType="begin"/>
-            </w:r>
-            <w:r>
-              <w:rPr>
-                <w:webHidden/>
-              </w:rPr>
-              <w:instrText>PAGEREF _Toc226574000 \h</w:instrText>
-            </w:r>
-            <w:r>
-              <w:rPr>
-                <w:webHidden/>
-              </w:rPr>
-            </w:r>
-            <w:r>
-              <w:rPr>
-                <w:webHidden/>
-              </w:rPr>
-              <w:fldChar w:fldCharType="separate"/>
-            </w:r>
-            <w:r>
-              <w:rPr>
-                <w:rStyle w:val="IndexLink"/>
-              </w:rPr>
-              <w:t>Application Overview</w:t>
-            </w:r>
-            <w:r>
-              <w:rPr>
-                <w:rStyle w:val="IndexLink"/>
-              </w:rPr>
-              <w:tab/>
-              <w:t>ix</w:t>
-            </w:r>
-            <w:r>
-              <w:rPr>
-                <w:webHidden/>
-              </w:rPr>
-              <w:fldChar w:fldCharType="end"/>
-            </w:r>
-          </w:hyperlink>
-        </w:p>
-        <w:p>
-          <w:pPr>
-            <w:pStyle w:val="TOC3"/>
-            <w:tabs>
-              <w:tab w:val="left" w:pos="1200"/>
-            </w:tabs>
-            <w:rPr>
-              <w:rFonts w:asciiTheme="minorHAnsi" w:eastAsiaTheme="minorEastAsia" w:hAnsiTheme="minorHAnsi" w:cstheme="minorBidi"/>
-              <w:i w:val="0"/>
-              <w:kern w:val="2"/>
-              <w:sz w:val="24"/>
-              <w:szCs w:val="24"/>
-              <w:lang w:eastAsia="en-US"/>
-              <w14:ligatures w14:val="standardContextual"/>
-            </w:rPr>
-          </w:pPr>
-          <w:hyperlink w:anchor="_Toc226574001">
-            <w:r>
-              <w:rPr>
-                <w:rStyle w:val="IndexLink"/>
-              </w:rPr>
-              <w:t>3.1.1.</w:t>
-            </w:r>
-            <w:r>
-              <w:rPr>
-                <w:rStyle w:val="IndexLink"/>
-                <w:rFonts w:asciiTheme="minorHAnsi" w:eastAsiaTheme="minorEastAsia" w:hAnsiTheme="minorHAnsi" w:cstheme="minorBidi"/>
-                <w:i w:val="0"/>
-                <w:kern w:val="2"/>
-                <w:sz w:val="24"/>
-                <w:szCs w:val="24"/>
-                <w:lang w:eastAsia="en-US"/>
-                <w14:ligatures w14:val="standardContextual"/>
-              </w:rPr>
-              <w:tab/>
-            </w:r>
-            <w:r>
-              <w:rPr>
-                <w:webHidden/>
-              </w:rPr>
-              <w:fldChar w:fldCharType="begin"/>
-            </w:r>
-            <w:r>
-              <w:rPr>
-                <w:webHidden/>
-              </w:rPr>
-              <w:instrText>PAGEREF _Toc226574001 \h</w:instrText>
-            </w:r>
-            <w:r>
-              <w:rPr>
-                <w:webHidden/>
-              </w:rPr>
-            </w:r>
-            <w:r>
-              <w:rPr>
-                <w:webHidden/>
-              </w:rPr>
-              <w:fldChar w:fldCharType="separate"/>
-            </w:r>
-            <w:r>
-              <w:rPr>
-                <w:rStyle w:val="IndexLink"/>
-              </w:rPr>
-              <w:t>Design Outlook</w:t>
-            </w:r>
-            <w:r>
-              <w:rPr>
-                <w:rStyle w:val="IndexLink"/>
-              </w:rPr>
-              <w:tab/>
-              <w:t>ix</w:t>
-            </w:r>
-            <w:r>
-              <w:rPr>
-                <w:webHidden/>
-              </w:rPr>
-              <w:fldChar w:fldCharType="end"/>
-            </w:r>
-          </w:hyperlink>
-        </w:p>
-        <w:p>
-          <w:pPr>
-            <w:pStyle w:val="TOC2"/>
-            <w:tabs>
-              <w:tab w:val="left" w:pos="800"/>
-            </w:tabs>
-            <w:rPr>
-              <w:rFonts w:asciiTheme="minorHAnsi" w:eastAsiaTheme="minorEastAsia" w:hAnsiTheme="minorHAnsi" w:cstheme="minorBidi"/>
-              <w:smallCaps w:val="0"/>
-              <w:kern w:val="2"/>
-              <w:sz w:val="24"/>
-              <w:szCs w:val="24"/>
-              <w:lang w:eastAsia="en-US"/>
-              <w14:ligatures w14:val="standardContextual"/>
-            </w:rPr>
-          </w:pPr>
-          <w:hyperlink w:anchor="_Toc226574002">
-            <w:r>
-              <w:rPr>
-                <w:rStyle w:val="IndexLink"/>
-              </w:rPr>
-              <w:t>3.2.</w:t>
-            </w:r>
-            <w:r>
-              <w:rPr>
-                <w:rStyle w:val="IndexLink"/>
-                <w:rFonts w:asciiTheme="minorHAnsi" w:eastAsiaTheme="minorEastAsia" w:hAnsiTheme="minorHAnsi" w:cstheme="minorBidi"/>
-                <w:smallCaps w:val="0"/>
-                <w:kern w:val="2"/>
-                <w:sz w:val="24"/>
-                <w:szCs w:val="24"/>
-                <w:lang w:eastAsia="en-US"/>
-                <w14:ligatures w14:val="standardContextual"/>
-              </w:rPr>
-              <w:tab/>
-            </w:r>
-            <w:r>
-              <w:rPr>
-                <w:webHidden/>
-              </w:rPr>
-              <w:fldChar w:fldCharType="begin"/>
-            </w:r>
-            <w:r>
-              <w:rPr>
-                <w:webHidden/>
-              </w:rPr>
-              <w:instrText>PAGEREF _Toc226574002 \h</w:instrText>
-            </w:r>
-            <w:r>
-              <w:rPr>
-                <w:webHidden/>
-              </w:rPr>
-            </w:r>
-            <w:r>
-              <w:rPr>
-                <w:webHidden/>
-              </w:rPr>
-              <w:fldChar w:fldCharType="separate"/>
-            </w:r>
-            <w:r>
-              <w:rPr>
-                <w:rStyle w:val="IndexLink"/>
-              </w:rPr>
-              <w:t>GUI Diagrams</w:t>
-            </w:r>
-            <w:r>
-              <w:rPr>
-                <w:rStyle w:val="IndexLink"/>
-              </w:rPr>
-              <w:tab/>
-              <w:t>x</w:t>
-            </w:r>
-            <w:r>
-              <w:rPr>
-                <w:webHidden/>
-              </w:rPr>
-              <w:fldChar w:fldCharType="end"/>
-            </w:r>
-          </w:hyperlink>
-        </w:p>
-        <w:p>
-          <w:pPr>
-            <w:pStyle w:val="TOC2"/>
-            <w:tabs>
-              <w:tab w:val="left" w:pos="800"/>
-            </w:tabs>
-            <w:rPr>
-              <w:rFonts w:asciiTheme="minorHAnsi" w:eastAsiaTheme="minorEastAsia" w:hAnsiTheme="minorHAnsi" w:cstheme="minorBidi"/>
-              <w:smallCaps w:val="0"/>
-              <w:kern w:val="2"/>
-              <w:sz w:val="24"/>
-              <w:szCs w:val="24"/>
-              <w:lang w:eastAsia="en-US"/>
-              <w14:ligatures w14:val="standardContextual"/>
-            </w:rPr>
-          </w:pPr>
-          <w:hyperlink w:anchor="_Toc226574003">
-            <w:r>
-              <w:rPr>
-                <w:rStyle w:val="IndexLink"/>
-              </w:rPr>
-              <w:t>3.3.</w:t>
-            </w:r>
-            <w:r>
-              <w:rPr>
-                <w:rStyle w:val="IndexLink"/>
-                <w:rFonts w:asciiTheme="minorHAnsi" w:eastAsiaTheme="minorEastAsia" w:hAnsiTheme="minorHAnsi" w:cstheme="minorBidi"/>
-                <w:smallCaps w:val="0"/>
-                <w:kern w:val="2"/>
-                <w:sz w:val="24"/>
-                <w:szCs w:val="24"/>
-                <w:lang w:eastAsia="en-US"/>
-                <w14:ligatures w14:val="standardContextual"/>
-              </w:rPr>
-              <w:tab/>
-            </w:r>
-            <w:r>
-              <w:rPr>
-                <w:webHidden/>
-              </w:rPr>
-              <w:fldChar w:fldCharType="begin"/>
-            </w:r>
-            <w:r>
-              <w:rPr>
-                <w:webHidden/>
-              </w:rPr>
-              <w:instrText>PAGEREF _Toc226574003 \h</w:instrText>
-            </w:r>
-            <w:r>
-              <w:rPr>
-                <w:webHidden/>
-              </w:rPr>
-            </w:r>
-            <w:r>
-              <w:rPr>
-                <w:webHidden/>
-              </w:rPr>
-              <w:fldChar w:fldCharType="separate"/>
-            </w:r>
-            <w:r>
-              <w:rPr>
-                <w:rStyle w:val="IndexLink"/>
-              </w:rPr>
-              <w:t>Layout and Structure</w:t>
-            </w:r>
-            <w:r>
-              <w:rPr>
-                <w:rStyle w:val="IndexLink"/>
-              </w:rPr>
-              <w:tab/>
-              <w:t>xii</w:t>
-            </w:r>
-            <w:r>
-              <w:rPr>
-                <w:webHidden/>
-              </w:rPr>
-              <w:fldChar w:fldCharType="end"/>
-            </w:r>
-          </w:hyperlink>
-        </w:p>
-        <w:p>
-          <w:pPr>
-            <w:pStyle w:val="TOC1"/>
-            <w:tabs>
-              <w:tab w:val="left" w:pos="400"/>
-            </w:tabs>
-            <w:rPr>
-              <w:rFonts w:asciiTheme="minorHAnsi" w:eastAsiaTheme="minorEastAsia" w:hAnsiTheme="minorHAnsi" w:cstheme="minorBidi"/>
-              <w:b w:val="0"/>
-              <w:caps w:val="0"/>
-              <w:kern w:val="2"/>
-              <w:sz w:val="24"/>
-              <w:szCs w:val="24"/>
-              <w:lang w:eastAsia="en-US"/>
-              <w14:ligatures w14:val="standardContextual"/>
-            </w:rPr>
-          </w:pPr>
-          <w:hyperlink w:anchor="_Toc226574004">
-            <w:r>
-              <w:rPr>
-                <w:rStyle w:val="IndexLink"/>
-                <w:lang w:bidi="en-US"/>
-              </w:rPr>
-              <w:t>4.</w:t>
-            </w:r>
-            <w:r>
-              <w:rPr>
-                <w:rStyle w:val="IndexLink"/>
-                <w:rFonts w:asciiTheme="minorHAnsi" w:eastAsiaTheme="minorEastAsia" w:hAnsiTheme="minorHAnsi" w:cstheme="minorBidi"/>
-                <w:b w:val="0"/>
-                <w:caps w:val="0"/>
-                <w:kern w:val="2"/>
-                <w:sz w:val="24"/>
-                <w:szCs w:val="24"/>
-                <w:lang w:eastAsia="en-US"/>
-                <w14:ligatures w14:val="standardContextual"/>
-              </w:rPr>
-              <w:tab/>
-            </w:r>
-            <w:r>
-              <w:rPr>
-                <w:webHidden/>
-              </w:rPr>
-              <w:fldChar w:fldCharType="begin"/>
-            </w:r>
-            <w:r>
-              <w:rPr>
-                <w:webHidden/>
-              </w:rPr>
-              <w:instrText>PAGEREF _Toc226574004 \h</w:instrText>
-            </w:r>
-            <w:r>
-              <w:rPr>
-                <w:webHidden/>
-              </w:rPr>
-            </w:r>
-            <w:r>
-              <w:rPr>
-                <w:webHidden/>
-              </w:rPr>
-              <w:fldChar w:fldCharType="separate"/>
-            </w:r>
-            <w:r>
-              <w:rPr>
-                <w:rStyle w:val="IndexLink"/>
-              </w:rPr>
-              <w:t>Use-Cases and Common Flows</w:t>
-            </w:r>
-            <w:r>
-              <w:rPr>
-                <w:rStyle w:val="IndexLink"/>
-              </w:rPr>
-              <w:tab/>
-              <w:t>xiii</w:t>
-            </w:r>
-            <w:r>
-              <w:rPr>
-                <w:webHidden/>
-              </w:rPr>
-              <w:fldChar w:fldCharType="end"/>
-            </w:r>
-          </w:hyperlink>
-        </w:p>
-        <w:p>
-          <w:pPr>
-            <w:pStyle w:val="TOC2"/>
-            <w:tabs>
-              <w:tab w:val="left" w:pos="800"/>
-            </w:tabs>
-            <w:rPr>
-              <w:rFonts w:asciiTheme="minorHAnsi" w:eastAsiaTheme="minorEastAsia" w:hAnsiTheme="minorHAnsi" w:cstheme="minorBidi"/>
-              <w:smallCaps w:val="0"/>
-              <w:kern w:val="2"/>
-              <w:sz w:val="24"/>
-              <w:szCs w:val="24"/>
-              <w:lang w:eastAsia="en-US"/>
-              <w14:ligatures w14:val="standardContextual"/>
-            </w:rPr>
-          </w:pPr>
-          <w:hyperlink w:anchor="_Toc226574005">
-            <w:r>
-              <w:rPr>
-                <w:rStyle w:val="IndexLink"/>
-              </w:rPr>
-              <w:t>4.1.</w:t>
-            </w:r>
-            <w:r>
-              <w:rPr>
-                <w:rStyle w:val="IndexLink"/>
-                <w:rFonts w:asciiTheme="minorHAnsi" w:eastAsiaTheme="minorEastAsia" w:hAnsiTheme="minorHAnsi" w:cstheme="minorBidi"/>
-                <w:smallCaps w:val="0"/>
-                <w:kern w:val="2"/>
-                <w:sz w:val="24"/>
-                <w:szCs w:val="24"/>
-                <w:lang w:eastAsia="en-US"/>
-                <w14:ligatures w14:val="standardContextual"/>
-              </w:rPr>
-              <w:tab/>
-            </w:r>
-            <w:r>
-              <w:rPr>
-                <w:webHidden/>
-              </w:rPr>
-              <w:fldChar w:fldCharType="begin"/>
-            </w:r>
-            <w:r>
-              <w:rPr>
-                <w:webHidden/>
-              </w:rPr>
-              <w:instrText>PAGEREF _Toc226574005 \h</w:instrText>
-            </w:r>
-            <w:r>
-              <w:rPr>
-                <w:webHidden/>
-              </w:rPr>
-            </w:r>
-            <w:r>
-              <w:rPr>
-                <w:webHidden/>
-              </w:rPr>
-              <w:fldChar w:fldCharType="separate"/>
-            </w:r>
-            <w:r>
-              <w:rPr>
-                <w:rStyle w:val="IndexLink"/>
-              </w:rPr>
-              <w:t>Use-Case Diagrams</w:t>
-            </w:r>
-            <w:r>
-              <w:rPr>
-                <w:rStyle w:val="IndexLink"/>
-              </w:rPr>
-              <w:tab/>
-              <w:t>xiii</w:t>
-            </w:r>
-            <w:r>
-              <w:rPr>
-                <w:webHidden/>
-              </w:rPr>
-              <w:fldChar w:fldCharType="end"/>
-            </w:r>
-          </w:hyperlink>
-        </w:p>
-        <w:p>
-          <w:pPr>
-            <w:pStyle w:val="TOC2"/>
-            <w:tabs>
-              <w:tab w:val="left" w:pos="800"/>
-            </w:tabs>
-            <w:rPr>
-              <w:rFonts w:asciiTheme="minorHAnsi" w:eastAsiaTheme="minorEastAsia" w:hAnsiTheme="minorHAnsi" w:cstheme="minorBidi"/>
-              <w:smallCaps w:val="0"/>
-              <w:kern w:val="2"/>
-              <w:sz w:val="24"/>
-              <w:szCs w:val="24"/>
-              <w:lang w:eastAsia="en-US"/>
-              <w14:ligatures w14:val="standardContextual"/>
-            </w:rPr>
-          </w:pPr>
-          <w:hyperlink w:anchor="_Toc226574006">
-            <w:r>
-              <w:rPr>
-                <w:rStyle w:val="IndexLink"/>
-              </w:rPr>
-              <w:t>4.2.</w:t>
-            </w:r>
-            <w:r>
-              <w:rPr>
-                <w:rStyle w:val="IndexLink"/>
-                <w:rFonts w:asciiTheme="minorHAnsi" w:eastAsiaTheme="minorEastAsia" w:hAnsiTheme="minorHAnsi" w:cstheme="minorBidi"/>
-                <w:smallCaps w:val="0"/>
-                <w:kern w:val="2"/>
-                <w:sz w:val="24"/>
-                <w:szCs w:val="24"/>
-                <w:lang w:eastAsia="en-US"/>
-                <w14:ligatures w14:val="standardContextual"/>
-              </w:rPr>
-              <w:tab/>
-            </w:r>
-            <w:r>
-              <w:rPr>
-                <w:webHidden/>
-              </w:rPr>
-              <w:fldChar w:fldCharType="begin"/>
-            </w:r>
-            <w:r>
-              <w:rPr>
-                <w:webHidden/>
-              </w:rPr>
-              <w:instrText>PAGEREF _Toc226574006 \h</w:instrText>
-            </w:r>
-            <w:r>
-              <w:rPr>
-                <w:webHidden/>
-              </w:rPr>
-            </w:r>
-            <w:r>
-              <w:rPr>
-                <w:webHidden/>
-              </w:rPr>
-              <w:fldChar w:fldCharType="separate"/>
-            </w:r>
-            <w:r>
-              <w:rPr>
-                <w:rStyle w:val="IndexLink"/>
-              </w:rPr>
-              <w:t>Sequence Diagrams</w:t>
-            </w:r>
-            <w:r>
-              <w:rPr>
-                <w:rStyle w:val="IndexLink"/>
-              </w:rPr>
-              <w:tab/>
-              <w:t>xiii</w:t>
-            </w:r>
-            <w:r>
-              <w:rPr>
-                <w:webHidden/>
-              </w:rPr>
-              <w:fldChar w:fldCharType="end"/>
-            </w:r>
-          </w:hyperlink>
-        </w:p>
-        <w:p>
-          <w:pPr>
-            <w:pStyle w:val="TOC2"/>
-            <w:rPr>
-              <w:rFonts w:asciiTheme="minorHAnsi" w:eastAsiaTheme="minorEastAsia" w:hAnsiTheme="minorHAnsi" w:cstheme="minorBidi"/>
-              <w:smallCaps w:val="0"/>
-              <w:kern w:val="2"/>
-              <w:sz w:val="24"/>
-              <w:szCs w:val="24"/>
-              <w:lang w:eastAsia="en-US"/>
-              <w14:ligatures w14:val="standardContextual"/>
-            </w:rPr>
-          </w:pPr>
-          <w:hyperlink w:anchor="_Toc226574007">
-            <w:r>
-              <w:rPr>
-                <w:webHidden/>
-              </w:rPr>
-              <w:fldChar w:fldCharType="begin"/>
-            </w:r>
-            <w:r>
-              <w:rPr>
-                <w:webHidden/>
-              </w:rPr>
-              <w:instrText>PAGEREF _Toc226574007 \h</w:instrText>
-            </w:r>
-            <w:r>
-              <w:rPr>
-                <w:webHidden/>
-              </w:rPr>
-            </w:r>
-            <w:r>
-              <w:rPr>
-                <w:webHidden/>
-              </w:rPr>
-              <w:fldChar w:fldCharType="separate"/>
-            </w:r>
-            <w:r>
-              <w:rPr>
-                <w:rStyle w:val="IndexLink"/>
-              </w:rPr>
-              <w:tab/>
-              <w:t>xiv</w:t>
-            </w:r>
-            <w:r>
-              <w:rPr>
-                <w:webHidden/>
-              </w:rPr>
-              <w:fldChar w:fldCharType="end"/>
-            </w:r>
-          </w:hyperlink>
-        </w:p>
-        <w:p>
-          <w:pPr>
-            <w:pStyle w:val="TOC2"/>
-            <w:rPr>
-              <w:rFonts w:asciiTheme="minorHAnsi" w:eastAsiaTheme="minorEastAsia" w:hAnsiTheme="minorHAnsi" w:cstheme="minorBidi"/>
-              <w:smallCaps w:val="0"/>
-              <w:kern w:val="2"/>
-              <w:sz w:val="24"/>
-              <w:szCs w:val="24"/>
-              <w:lang w:eastAsia="en-US"/>
-              <w14:ligatures w14:val="standardContextual"/>
-            </w:rPr>
-          </w:pPr>
-          <w:hyperlink w:anchor="_Toc226574008">
-            <w:r>
-              <w:rPr>
-                <w:webHidden/>
-              </w:rPr>
-              <w:fldChar w:fldCharType="begin"/>
-            </w:r>
-            <w:r>
-              <w:rPr>
-                <w:webHidden/>
-              </w:rPr>
-              <w:instrText>PAGEREF _Toc226574008 \h</w:instrText>
-            </w:r>
-            <w:r>
-              <w:rPr>
-                <w:webHidden/>
-              </w:rPr>
-            </w:r>
-            <w:r>
-              <w:rPr>
-                <w:webHidden/>
-              </w:rPr>
-              <w:fldChar w:fldCharType="separate"/>
-            </w:r>
-            <w:r>
-              <w:rPr>
-                <w:rStyle w:val="IndexLink"/>
-              </w:rPr>
-              <w:tab/>
-              <w:t>xiv</w:t>
-            </w:r>
-            <w:r>
-              <w:rPr>
-                <w:webHidden/>
-              </w:rPr>
-              <w:fldChar w:fldCharType="end"/>
-            </w:r>
-          </w:hyperlink>
-        </w:p>
-        <w:p>
-          <w:pPr>
-            <w:pStyle w:val="TOC2"/>
-            <w:tabs>
-              <w:tab w:val="left" w:pos="800"/>
-            </w:tabs>
-            <w:rPr>
-              <w:rFonts w:asciiTheme="minorHAnsi" w:eastAsiaTheme="minorEastAsia" w:hAnsiTheme="minorHAnsi" w:cstheme="minorBidi"/>
-              <w:smallCaps w:val="0"/>
-              <w:kern w:val="2"/>
-              <w:sz w:val="24"/>
-              <w:szCs w:val="24"/>
-              <w:lang w:eastAsia="en-US"/>
-              <w14:ligatures w14:val="standardContextual"/>
-            </w:rPr>
-          </w:pPr>
-          <w:hyperlink w:anchor="_Toc226574009">
-            <w:r>
-              <w:rPr>
-                <w:rStyle w:val="IndexLink"/>
-              </w:rPr>
-              <w:t>4.3.</w:t>
-            </w:r>
-            <w:r>
-              <w:rPr>
-                <w:rStyle w:val="IndexLink"/>
-                <w:rFonts w:asciiTheme="minorHAnsi" w:eastAsiaTheme="minorEastAsia" w:hAnsiTheme="minorHAnsi" w:cstheme="minorBidi"/>
-                <w:smallCaps w:val="0"/>
-                <w:kern w:val="2"/>
-                <w:sz w:val="24"/>
-                <w:szCs w:val="24"/>
-                <w:lang w:eastAsia="en-US"/>
-                <w14:ligatures w14:val="standardContextual"/>
-              </w:rPr>
-              <w:tab/>
-            </w:r>
-            <w:r>
-              <w:rPr>
-                <w:webHidden/>
-              </w:rPr>
-              <w:fldChar w:fldCharType="begin"/>
-            </w:r>
-            <w:r>
-              <w:rPr>
-                <w:webHidden/>
-              </w:rPr>
-              <w:instrText>PAGEREF _Toc226574009 \h</w:instrText>
-            </w:r>
-            <w:r>
-              <w:rPr>
-                <w:webHidden/>
-              </w:rPr>
-            </w:r>
-            <w:r>
-              <w:rPr>
-                <w:webHidden/>
-              </w:rPr>
-              <w:fldChar w:fldCharType="separate"/>
-            </w:r>
-            <w:r>
-              <w:rPr>
-                <w:rStyle w:val="IndexLink"/>
-              </w:rPr>
-              <w:t>Common &amp; Intended User Interfacing Flow</w:t>
-            </w:r>
-            <w:r>
-              <w:rPr>
-                <w:rStyle w:val="IndexLink"/>
-              </w:rPr>
-              <w:tab/>
-              <w:t>xiv</w:t>
-            </w:r>
-            <w:r>
-              <w:rPr>
-                <w:webHidden/>
-              </w:rPr>
-              <w:fldChar w:fldCharType="end"/>
-            </w:r>
-          </w:hyperlink>
           <w:r>
             <w:rPr>
               <w:rStyle w:val="IndexLink"/>
@@ -3749,7 +4175,7 @@
       </w:pPr>
       <w:bookmarkStart w:id="2" w:name="__RefHeading___Toc695_1633043759"/>
       <w:bookmarkStart w:id="3" w:name="_Toc226533746"/>
-      <w:bookmarkStart w:id="4" w:name="_Toc226573989"/>
+      <w:bookmarkStart w:id="4" w:name="_Toc226576867"/>
       <w:bookmarkEnd w:id="2"/>
       <w:bookmarkEnd w:id="3"/>
       <w:r>
@@ -3772,21 +4198,7 @@
         <w:rPr>
           <w:color w:val="000000"/>
         </w:rPr>
-        <w:t xml:space="preserve">This software design document provides </w:t>
-      </w:r>
-      <w:proofErr w:type="gramStart"/>
-      <w:r>
-        <w:rPr>
-          <w:color w:val="000000"/>
-        </w:rPr>
-        <w:t>a</w:t>
-      </w:r>
-      <w:proofErr w:type="gramEnd"/>
-      <w:r>
-        <w:rPr>
-          <w:color w:val="000000"/>
-        </w:rPr>
-        <w:t xml:space="preserve"> architectural overview for the Blackjack Handling System (BHS).</w:t>
+        <w:t>This software design document provides a architectural overview for the Blackjack Handling System (BHS).</w:t>
       </w:r>
     </w:p>
     <w:p>
@@ -3801,8 +4213,8 @@
         </w:rPr>
       </w:pPr>
       <w:bookmarkStart w:id="5" w:name="__RefHeading___Toc697_1633043759"/>
-      <w:bookmarkStart w:id="6" w:name="_Toc226573990"/>
-      <w:bookmarkStart w:id="7" w:name="_Toc226533747"/>
+      <w:bookmarkStart w:id="6" w:name="_Toc226533747"/>
+      <w:bookmarkStart w:id="7" w:name="_Toc226576868"/>
       <w:bookmarkEnd w:id="5"/>
       <w:r>
         <w:rPr>
@@ -3835,8 +4247,8 @@
         </w:rPr>
       </w:pPr>
       <w:bookmarkStart w:id="8" w:name="__RefHeading___Toc699_1633043759"/>
-      <w:bookmarkStart w:id="9" w:name="_Toc226573991"/>
-      <w:bookmarkStart w:id="10" w:name="_Toc226533748"/>
+      <w:bookmarkStart w:id="9" w:name="_Toc226533748"/>
+      <w:bookmarkStart w:id="10" w:name="_Toc226576869"/>
       <w:bookmarkEnd w:id="8"/>
       <w:r>
         <w:rPr>
@@ -3874,21 +4286,7 @@
         <w:rPr>
           <w:color w:val="000000"/>
         </w:rPr>
-        <w:t xml:space="preserve">Dealer: A specialized user role with the added ability to operate as a dealer for the games and the configurator of game parameters when creating joinable tables for blackjack, deals cards in accordance </w:t>
-      </w:r>
-      <w:proofErr w:type="gramStart"/>
-      <w:r>
-        <w:rPr>
-          <w:color w:val="000000"/>
-        </w:rPr>
-        <w:t>to</w:t>
-      </w:r>
-      <w:proofErr w:type="gramEnd"/>
-      <w:r>
-        <w:rPr>
-          <w:color w:val="000000"/>
-        </w:rPr>
-        <w:t xml:space="preserve"> standard blackjack rules</w:t>
+        <w:t>Dealer: A specialized user role with the added ability to operate as a dealer for the games and the configurator of game parameters when creating joinable tables for blackjack, deals cards in accordance to standard blackjack rules</w:t>
       </w:r>
     </w:p>
     <w:p>
@@ -4053,21 +4451,7 @@
         <w:rPr>
           <w:color w:val="000000"/>
         </w:rPr>
-        <w:t xml:space="preserve">Bet: </w:t>
-      </w:r>
-      <w:proofErr w:type="gramStart"/>
-      <w:r>
-        <w:rPr>
-          <w:color w:val="000000"/>
-        </w:rPr>
-        <w:t>A number of</w:t>
-      </w:r>
-      <w:proofErr w:type="gramEnd"/>
-      <w:r>
-        <w:rPr>
-          <w:color w:val="000000"/>
-        </w:rPr>
-        <w:t xml:space="preserve"> credits submitted by a player before being dealt hands to start playing the game</w:t>
+        <w:t>Bet: A number of credits submitted by a player before being dealt hands to start playing the game</w:t>
       </w:r>
     </w:p>
     <w:p>
@@ -4082,35 +4466,7 @@
         <w:rPr>
           <w:color w:val="000000"/>
         </w:rPr>
-        <w:t xml:space="preserve">Timer: A countdown for the time players </w:t>
-      </w:r>
-      <w:proofErr w:type="gramStart"/>
-      <w:r>
-        <w:rPr>
-          <w:color w:val="000000"/>
-        </w:rPr>
-        <w:t>have</w:t>
-      </w:r>
-      <w:proofErr w:type="gramEnd"/>
-      <w:r>
-        <w:rPr>
-          <w:color w:val="000000"/>
-        </w:rPr>
-        <w:t xml:space="preserve"> to </w:t>
-      </w:r>
-      <w:proofErr w:type="gramStart"/>
-      <w:r>
-        <w:rPr>
-          <w:color w:val="000000"/>
-        </w:rPr>
-        <w:t>take action</w:t>
-      </w:r>
-      <w:proofErr w:type="gramEnd"/>
-      <w:r>
-        <w:rPr>
-          <w:color w:val="000000"/>
-        </w:rPr>
-        <w:t xml:space="preserve"> in a round of the game</w:t>
+        <w:t>Timer: A countdown for the time players have to take action in a round of the game</w:t>
       </w:r>
     </w:p>
     <w:p>
@@ -4231,21 +4587,7 @@
         <w:rPr>
           <w:color w:val="000000"/>
         </w:rPr>
-        <w:t xml:space="preserve">Stand: When a player </w:t>
-      </w:r>
-      <w:proofErr w:type="gramStart"/>
-      <w:r>
-        <w:rPr>
-          <w:color w:val="000000"/>
-        </w:rPr>
-        <w:t>signals</w:t>
-      </w:r>
-      <w:proofErr w:type="gramEnd"/>
-      <w:r>
-        <w:rPr>
-          <w:color w:val="000000"/>
-        </w:rPr>
-        <w:t xml:space="preserve"> they don’t want any additional cards dealt to them during the current round.</w:t>
+        <w:t>Stand: When a player signals they don’t want any additional cards dealt to them during the current round.</w:t>
       </w:r>
     </w:p>
     <w:p>
@@ -4275,35 +4617,7 @@
         <w:rPr>
           <w:color w:val="000000"/>
         </w:rPr>
-        <w:t xml:space="preserve">Split: When a player has matching cards, they can pay to have their hand divided into two separate hands. The dealer will then </w:t>
-      </w:r>
-      <w:proofErr w:type="gramStart"/>
-      <w:r>
-        <w:rPr>
-          <w:color w:val="000000"/>
-        </w:rPr>
-        <w:t>deal</w:t>
-      </w:r>
-      <w:proofErr w:type="gramEnd"/>
-      <w:r>
-        <w:rPr>
-          <w:color w:val="000000"/>
-        </w:rPr>
-        <w:t xml:space="preserve"> each </w:t>
-      </w:r>
-      <w:proofErr w:type="gramStart"/>
-      <w:r>
-        <w:rPr>
-          <w:color w:val="000000"/>
-        </w:rPr>
-        <w:t>hand</w:t>
-      </w:r>
-      <w:proofErr w:type="gramEnd"/>
-      <w:r>
-        <w:rPr>
-          <w:color w:val="000000"/>
-        </w:rPr>
-        <w:t xml:space="preserve"> an additional card to bring the total cards in each hand to two.</w:t>
+        <w:t>Split: When a player has matching cards, they can pay to have their hand divided into two separate hands. The dealer will then deal each hand an additional card to bring the total cards in each hand to two.</w:t>
       </w:r>
     </w:p>
     <w:p>
@@ -4408,21 +4722,7 @@
         <w:rPr>
           <w:color w:val="000000"/>
         </w:rPr>
-        <w:t xml:space="preserve">Shuffling: when the order of the cards in the shoe </w:t>
-      </w:r>
-      <w:proofErr w:type="gramStart"/>
-      <w:r>
-        <w:rPr>
-          <w:color w:val="000000"/>
-        </w:rPr>
-        <w:t>are</w:t>
-      </w:r>
-      <w:proofErr w:type="gramEnd"/>
-      <w:r>
-        <w:rPr>
-          <w:color w:val="000000"/>
-        </w:rPr>
-        <w:t xml:space="preserve"> randomized.</w:t>
+        <w:t>Shuffling: when the order of the cards in the shoe are randomized.</w:t>
       </w:r>
     </w:p>
     <w:p>
@@ -4446,8 +4746,8 @@
         </w:rPr>
       </w:pPr>
       <w:bookmarkStart w:id="11" w:name="__RefHeading___Toc701_1633043759"/>
-      <w:bookmarkStart w:id="12" w:name="_Toc226573992"/>
-      <w:bookmarkStart w:id="13" w:name="_Toc226533749"/>
+      <w:bookmarkStart w:id="12" w:name="_Toc226533749"/>
+      <w:bookmarkStart w:id="13" w:name="_Toc226576870"/>
       <w:bookmarkEnd w:id="11"/>
       <w:r>
         <w:rPr>
@@ -4484,8 +4784,8 @@
         </w:rPr>
       </w:pPr>
       <w:bookmarkStart w:id="14" w:name="__RefHeading___Toc703_1633043759"/>
-      <w:bookmarkStart w:id="15" w:name="_Toc226573993"/>
-      <w:bookmarkStart w:id="16" w:name="_Toc226533750"/>
+      <w:bookmarkStart w:id="15" w:name="_Toc226533750"/>
+      <w:bookmarkStart w:id="16" w:name="_Toc226576871"/>
       <w:bookmarkEnd w:id="14"/>
       <w:r>
         <w:rPr>
@@ -4509,8 +4809,8 @@
         </w:rPr>
       </w:pPr>
       <w:bookmarkStart w:id="17" w:name="__RefHeading___Toc705_1633043759"/>
-      <w:bookmarkStart w:id="18" w:name="_Toc226573994"/>
-      <w:bookmarkStart w:id="19" w:name="_Toc226533751"/>
+      <w:bookmarkStart w:id="18" w:name="_Toc226533751"/>
+      <w:bookmarkStart w:id="19" w:name="_Toc226576872"/>
       <w:bookmarkEnd w:id="17"/>
       <w:r>
         <w:rPr>
@@ -4561,8 +4861,8 @@
         </w:rPr>
       </w:pPr>
       <w:bookmarkStart w:id="20" w:name="__RefHeading___Toc707_1633043759"/>
-      <w:bookmarkStart w:id="21" w:name="_Toc226573995"/>
-      <w:bookmarkStart w:id="22" w:name="_Toc226533752"/>
+      <w:bookmarkStart w:id="21" w:name="_Toc226533752"/>
+      <w:bookmarkStart w:id="22" w:name="_Toc226576873"/>
       <w:bookmarkEnd w:id="20"/>
       <w:r>
         <w:rPr>
@@ -4607,8 +4907,8 @@
         </w:rPr>
       </w:pPr>
       <w:bookmarkStart w:id="23" w:name="__RefHeading___Toc709_1633043759"/>
-      <w:bookmarkStart w:id="24" w:name="_Toc226573996"/>
-      <w:bookmarkStart w:id="25" w:name="_Toc226533753"/>
+      <w:bookmarkStart w:id="24" w:name="_Toc226533753"/>
+      <w:bookmarkStart w:id="25" w:name="_Toc226576874"/>
       <w:bookmarkEnd w:id="23"/>
       <w:r>
         <w:rPr>
@@ -4653,8 +4953,8 @@
         </w:rPr>
       </w:pPr>
       <w:bookmarkStart w:id="26" w:name="__RefHeading___Toc711_1633043759"/>
-      <w:bookmarkStart w:id="27" w:name="_Toc226573997"/>
-      <w:bookmarkStart w:id="28" w:name="_Toc226533754"/>
+      <w:bookmarkStart w:id="27" w:name="_Toc226533754"/>
+      <w:bookmarkStart w:id="28" w:name="_Toc226576875"/>
       <w:bookmarkEnd w:id="26"/>
       <w:r>
         <w:rPr>
@@ -4841,21 +5141,7 @@
         <w:rPr>
           <w:color w:val="000000"/>
         </w:rPr>
-        <w:t xml:space="preserve">Each table will be given a unique ID. It will also have a unique dealer, and a list of payer ID that can constantly change ass players join and leave the table. Each table will have specific in-game settings that the dealer sets up as the table is created. These include the minimum and maximum bets, the game timer that limits how long each play </w:t>
-      </w:r>
-      <w:proofErr w:type="gramStart"/>
-      <w:r>
-        <w:rPr>
-          <w:color w:val="000000"/>
-        </w:rPr>
-        <w:t>has to</w:t>
-      </w:r>
-      <w:proofErr w:type="gramEnd"/>
-      <w:r>
-        <w:rPr>
-          <w:color w:val="000000"/>
-        </w:rPr>
-        <w:t xml:space="preserve"> perform an action during their turn, and the number of decks the shoe will contain for that table.</w:t>
+        <w:t>Each table will be given a unique ID. It will also have a unique dealer, and a list of payer ID that can constantly change ass players join and leave the table. Each table will have specific in-game settings that the dealer sets up as the table is created. These include the minimum and maximum bets, the game timer that limits how long each play has to perform an action during their turn, and the number of decks the shoe will contain for that table.</w:t>
       </w:r>
     </w:p>
     <w:p>
@@ -4902,35 +5188,7 @@
         <w:rPr>
           <w:color w:val="000000"/>
         </w:rPr>
-        <w:t xml:space="preserve">The game will contain the shoe. Depending on how many decks the shoe contains, it will start with a shuffled list of cards equal to the number of decks times 52. The cards are </w:t>
-      </w:r>
-      <w:proofErr w:type="gramStart"/>
-      <w:r>
-        <w:rPr>
-          <w:color w:val="000000"/>
-        </w:rPr>
-        <w:t>dealt</w:t>
-      </w:r>
-      <w:proofErr w:type="gramEnd"/>
-      <w:r>
-        <w:rPr>
-          <w:color w:val="000000"/>
-        </w:rPr>
-        <w:t xml:space="preserve"> one at a time to each player as called for depending on the current in-game state and player or dealer requests. When a card is </w:t>
-      </w:r>
-      <w:proofErr w:type="gramStart"/>
-      <w:r>
-        <w:rPr>
-          <w:color w:val="000000"/>
-        </w:rPr>
-        <w:t>dealt</w:t>
-      </w:r>
-      <w:proofErr w:type="gramEnd"/>
-      <w:r>
-        <w:rPr>
-          <w:color w:val="000000"/>
-        </w:rPr>
-        <w:t>, it is removed from the shoe and added to one of the active hands. One the round is completed, all cards in any hand are discarded and a new set of cards is dealt from the shoe. When the shoe has only 60 cards remaining in it, the current round of hands is completed and then all discarded cards are returned to the shoe and the shoe is shuffled.</w:t>
+        <w:t>The game will contain the shoe. Depending on how many decks the shoe contains, it will start with a shuffled list of cards equal to the number of decks times 52. The cards are dealt one at a time to each player as called for depending on the current in-game state and player or dealer requests. When a card is dealt, it is removed from the shoe and added to one of the active hands. One the round is completed, all cards in any hand are discarded and a new set of cards is dealt from the shoe. When the shoe has only 60 cards remaining in it, the current round of hands is completed and then all discarded cards are returned to the shoe and the shoe is shuffled.</w:t>
       </w:r>
     </w:p>
     <w:p>
@@ -4980,8 +5238,8 @@
           <w:color w:val="000000"/>
         </w:rPr>
       </w:pPr>
-      <w:bookmarkStart w:id="29" w:name="_Toc226573998"/>
-      <w:bookmarkStart w:id="30" w:name="_Toc226533755"/>
+      <w:bookmarkStart w:id="29" w:name="_Toc226533755"/>
+      <w:bookmarkStart w:id="30" w:name="_Toc226576876"/>
       <w:r>
         <w:rPr>
           <w:color w:val="000000"/>
@@ -5097,7 +5355,7 @@
       </w:pPr>
       <w:bookmarkStart w:id="31" w:name="__RefHeading___Toc715_1633043759"/>
       <w:bookmarkStart w:id="32" w:name="_Toc226533756"/>
-      <w:bookmarkStart w:id="33" w:name="_Toc226573999"/>
+      <w:bookmarkStart w:id="33" w:name="_Toc226576877"/>
       <w:bookmarkEnd w:id="31"/>
       <w:r>
         <w:rPr>
@@ -5128,7 +5386,7 @@
       </w:pPr>
       <w:bookmarkStart w:id="34" w:name="__RefHeading___Toc717_1633043759"/>
       <w:bookmarkStart w:id="35" w:name="_Toc226533757"/>
-      <w:bookmarkStart w:id="36" w:name="_Toc226574000"/>
+      <w:bookmarkStart w:id="36" w:name="_Toc226576878"/>
       <w:bookmarkEnd w:id="34"/>
       <w:r>
         <w:rPr>
@@ -5302,7 +5560,7 @@
       </w:pPr>
       <w:bookmarkStart w:id="37" w:name="__RefHeading___Toc719_1633043759"/>
       <w:bookmarkStart w:id="38" w:name="_Toc226533758"/>
-      <w:bookmarkStart w:id="39" w:name="_Toc226574001"/>
+      <w:bookmarkStart w:id="39" w:name="_Toc226576879"/>
       <w:bookmarkEnd w:id="37"/>
       <w:r>
         <w:rPr>
@@ -5377,21 +5635,7 @@
           <w:color w:val="000000"/>
         </w:rPr>
         <w:br/>
-        <w:t xml:space="preserve">The GUI dynamically adjusts available controls and views depending on whether the user is a player or dealer. This ensures users only see relevant actions and </w:t>
-      </w:r>
-      <w:proofErr w:type="gramStart"/>
-      <w:r>
-        <w:rPr>
-          <w:color w:val="000000"/>
-        </w:rPr>
-        <w:t>reduces</w:t>
-      </w:r>
-      <w:proofErr w:type="gramEnd"/>
-      <w:r>
-        <w:rPr>
-          <w:color w:val="000000"/>
-        </w:rPr>
-        <w:t xml:space="preserve"> complexity during interaction. </w:t>
+        <w:t xml:space="preserve">The GUI dynamically adjusts available controls and views depending on whether the user is a player or dealer. This ensures users only see relevant actions and reduces complexity during interaction. </w:t>
       </w:r>
     </w:p>
     <w:p>
@@ -5597,8 +5841,8 @@
       </w:pPr>
       <w:bookmarkStart w:id="40" w:name="__RefHeading___Toc721_1633043759"/>
       <w:bookmarkStart w:id="41" w:name="_Toc226533766"/>
-      <w:bookmarkStart w:id="42" w:name="_Toc226574002"/>
-      <w:bookmarkStart w:id="43" w:name="GUI_Diagrams"/>
+      <w:bookmarkStart w:id="42" w:name="GUI_Diagrams"/>
+      <w:bookmarkStart w:id="43" w:name="_Toc226576880"/>
       <w:bookmarkEnd w:id="40"/>
       <w:r>
         <w:rPr>
@@ -5809,7 +6053,7 @@
           <w:color w:val="000000"/>
         </w:rPr>
         <w:drawing>
-          <wp:anchor distT="0" distB="0" distL="0" distR="0" simplePos="0" relativeHeight="37" behindDoc="0" locked="0" layoutInCell="0" allowOverlap="1" wp14:anchorId="4BE26D6B" wp14:editId="7CF2B34D">
+          <wp:anchor distT="0" distB="0" distL="0" distR="0" simplePos="0" relativeHeight="251629568" behindDoc="0" locked="0" layoutInCell="0" allowOverlap="1" wp14:anchorId="4BE26D6B" wp14:editId="7CF2B34D">
             <wp:simplePos x="0" y="0"/>
             <wp:positionH relativeFrom="column">
               <wp:align>center</wp:align>
@@ -5929,19 +6173,11 @@
           <w:color w:val="000000"/>
         </w:rPr>
       </w:pPr>
-      <w:proofErr w:type="gramStart"/>
-      <w:r>
-        <w:rPr>
-          <w:color w:val="000000"/>
-        </w:rPr>
-        <w:t>Allows</w:t>
-      </w:r>
-      <w:proofErr w:type="gramEnd"/>
-      <w:r>
-        <w:rPr>
-          <w:color w:val="000000"/>
-        </w:rPr>
-        <w:t xml:space="preserve"> players to join tables or navigate to other system features </w:t>
+      <w:r>
+        <w:rPr>
+          <w:color w:val="000000"/>
+        </w:rPr>
+        <w:t xml:space="preserve">Allows players to join tables or navigate to other system features </w:t>
       </w:r>
     </w:p>
     <w:p>
@@ -6065,7 +6301,7 @@
           <w:color w:val="000000"/>
         </w:rPr>
         <w:drawing>
-          <wp:anchor distT="0" distB="0" distL="0" distR="0" simplePos="0" relativeHeight="38" behindDoc="0" locked="0" layoutInCell="0" allowOverlap="1" wp14:anchorId="4F47D43D" wp14:editId="11A60825">
+          <wp:anchor distT="0" distB="0" distL="0" distR="0" simplePos="0" relativeHeight="251630592" behindDoc="0" locked="0" layoutInCell="0" allowOverlap="1" wp14:anchorId="4F47D43D" wp14:editId="11A60825">
             <wp:simplePos x="0" y="0"/>
             <wp:positionH relativeFrom="column">
               <wp:align>center</wp:align>
@@ -6458,21 +6694,7 @@
         <w:rPr>
           <w:color w:val="000000"/>
         </w:rPr>
-        <w:t xml:space="preserve">The layout mirrors a real blackjack table, with player positioning indicating turn order and interaction flow. The difference for the dealer-sided flow of logging in is that they will immediately </w:t>
-      </w:r>
-      <w:proofErr w:type="gramStart"/>
-      <w:r>
-        <w:rPr>
-          <w:color w:val="000000"/>
-        </w:rPr>
-        <w:t>be met</w:t>
-      </w:r>
-      <w:proofErr w:type="gramEnd"/>
-      <w:r>
-        <w:rPr>
-          <w:color w:val="000000"/>
-        </w:rPr>
-        <w:t xml:space="preserve"> with the table screen, first in a settings configuration setup with adjustable parameters, then as a table upon completing the configuration.</w:t>
+        <w:t>The layout mirrors a real blackjack table, with player positioning indicating turn order and interaction flow. The difference for the dealer-sided flow of logging in is that they will immediately be met with the table screen, first in a settings configuration setup with adjustable parameters, then as a table upon completing the configuration.</w:t>
       </w:r>
     </w:p>
     <w:p>
@@ -6498,7 +6720,7 @@
         </w:rPr>
         <w:lastRenderedPageBreak/>
         <w:drawing>
-          <wp:anchor distT="0" distB="0" distL="0" distR="0" simplePos="0" relativeHeight="39" behindDoc="0" locked="0" layoutInCell="0" allowOverlap="1" wp14:anchorId="29934112" wp14:editId="113409E9">
+          <wp:anchor distT="0" distB="0" distL="0" distR="0" simplePos="0" relativeHeight="251631616" behindDoc="0" locked="0" layoutInCell="0" allowOverlap="1" wp14:anchorId="29934112" wp14:editId="113409E9">
             <wp:simplePos x="0" y="0"/>
             <wp:positionH relativeFrom="column">
               <wp:align>center</wp:align>
@@ -6559,7 +6781,7 @@
       </w:pPr>
       <w:bookmarkStart w:id="44" w:name="__RefHeading___Toc723_1633043759"/>
       <w:bookmarkStart w:id="45" w:name="_Toc226533767"/>
-      <w:bookmarkStart w:id="46" w:name="_Toc226574003"/>
+      <w:bookmarkStart w:id="46" w:name="_Toc226576881"/>
       <w:bookmarkEnd w:id="44"/>
       <w:r>
         <w:rPr>
@@ -6589,21 +6811,7 @@
           <w:color w:val="000000"/>
         </w:rPr>
         <w:tab/>
-        <w:t xml:space="preserve">The graphical user interface is organized using a modular, panel-based structure that supports dynamic content updates and separation of concerns between different functional areas. Each primary screen (login, lobby, and table) is composed of reusable interface regions that can be updated or replaced without requiring a full screen transition. This allows the client to respond efficiently to real-time updates from the server while maintaining </w:t>
-      </w:r>
-      <w:proofErr w:type="gramStart"/>
-      <w:r>
-        <w:rPr>
-          <w:color w:val="000000"/>
-        </w:rPr>
-        <w:t>a consistent</w:t>
-      </w:r>
-      <w:proofErr w:type="gramEnd"/>
-      <w:r>
-        <w:rPr>
-          <w:color w:val="000000"/>
-        </w:rPr>
-        <w:t xml:space="preserve"> user experience.</w:t>
+        <w:t>The graphical user interface is organized using a modular, panel-based structure that supports dynamic content updates and separation of concerns between different functional areas. Each primary screen (login, lobby, and table) is composed of reusable interface regions that can be updated or replaced without requiring a full screen transition. This allows the client to respond efficiently to real-time updates from the server while maintaining a consistent user experience.</w:t>
       </w:r>
     </w:p>
     <w:p>
@@ -6664,7 +6872,7 @@
       </w:pPr>
       <w:bookmarkStart w:id="47" w:name="__RefHeading___Toc725_1633043759"/>
       <w:bookmarkStart w:id="48" w:name="_Toc226533768"/>
-      <w:bookmarkStart w:id="49" w:name="_Toc226574004"/>
+      <w:bookmarkStart w:id="49" w:name="_Toc226576882"/>
       <w:bookmarkEnd w:id="47"/>
       <w:r>
         <w:rPr>
@@ -6695,7 +6903,7 @@
       </w:pPr>
       <w:bookmarkStart w:id="50" w:name="__RefHeading___Toc727_1633043759"/>
       <w:bookmarkStart w:id="51" w:name="_Toc226533769"/>
-      <w:bookmarkStart w:id="52" w:name="_Toc226574005"/>
+      <w:bookmarkStart w:id="52" w:name="_Toc226576883"/>
       <w:bookmarkEnd w:id="50"/>
       <w:r>
         <w:rPr>
@@ -6725,7 +6933,7 @@
           <w:color w:val="000000"/>
         </w:rPr>
         <w:drawing>
-          <wp:anchor distT="0" distB="0" distL="114300" distR="114300" simplePos="0" relativeHeight="44" behindDoc="0" locked="0" layoutInCell="0" allowOverlap="1" wp14:anchorId="146CF63B" wp14:editId="332EECF5">
+          <wp:anchor distT="0" distB="0" distL="114300" distR="114300" simplePos="0" relativeHeight="251666432" behindDoc="0" locked="0" layoutInCell="0" allowOverlap="1" wp14:anchorId="146CF63B" wp14:editId="332EECF5">
             <wp:simplePos x="0" y="0"/>
             <wp:positionH relativeFrom="column">
               <wp:posOffset>419100</wp:posOffset>
@@ -6785,15 +6993,7 @@
         <w:ind w:left="720"/>
       </w:pPr>
       <w:r>
-        <w:t xml:space="preserve">The use case diagram </w:t>
-      </w:r>
-      <w:proofErr w:type="gramStart"/>
-      <w:r>
-        <w:t>is showing</w:t>
-      </w:r>
-      <w:proofErr w:type="gramEnd"/>
-      <w:r>
-        <w:t xml:space="preserve"> the expected output of each user action.</w:t>
+        <w:t>The use case diagram is showing the expected output of each user action.</w:t>
       </w:r>
     </w:p>
     <w:p>
@@ -6801,15 +7001,7 @@
         <w:ind w:left="720"/>
       </w:pPr>
       <w:r>
-        <w:t xml:space="preserve">For the player, the player begins </w:t>
-      </w:r>
-      <w:proofErr w:type="gramStart"/>
-      <w:r>
-        <w:t>in</w:t>
-      </w:r>
-      <w:proofErr w:type="gramEnd"/>
-      <w:r>
-        <w:t xml:space="preserve"> the login screen with 2 separate actions. The player is sent to</w:t>
+        <w:t>For the player, the player begins in the login screen with 2 separate actions. The player is sent to</w:t>
       </w:r>
     </w:p>
     <w:p>
@@ -6817,15 +7009,7 @@
         <w:ind w:left="720"/>
       </w:pPr>
       <w:r>
-        <w:t xml:space="preserve">the lobby where they </w:t>
-      </w:r>
-      <w:proofErr w:type="gramStart"/>
-      <w:r>
-        <w:t>are able to</w:t>
-      </w:r>
-      <w:proofErr w:type="gramEnd"/>
-      <w:r>
-        <w:t xml:space="preserve"> add funds to their account or cash out their whole account. They</w:t>
+        <w:t>the lobby where they are able to add funds to their account or cash out their whole account. They</w:t>
       </w:r>
     </w:p>
     <w:p>
@@ -6833,15 +7017,7 @@
         <w:ind w:left="720"/>
       </w:pPr>
       <w:r>
-        <w:t xml:space="preserve">will also be able to select which table they want to play </w:t>
-      </w:r>
-      <w:proofErr w:type="gramStart"/>
-      <w:r>
-        <w:t>in</w:t>
-      </w:r>
-      <w:proofErr w:type="gramEnd"/>
-      <w:r>
-        <w:t>. The table screen is where the player</w:t>
+        <w:t>will also be able to select which table they want to play in. The table screen is where the player</w:t>
       </w:r>
     </w:p>
     <w:p>
@@ -6857,15 +7033,7 @@
         <w:ind w:left="720"/>
       </w:pPr>
       <w:r>
-        <w:t xml:space="preserve">The dealer will also begin </w:t>
-      </w:r>
-      <w:proofErr w:type="gramStart"/>
-      <w:r>
-        <w:t>in</w:t>
-      </w:r>
-      <w:proofErr w:type="gramEnd"/>
-      <w:r>
-        <w:t xml:space="preserve"> the login screen but will skip the lobby entirely. They will be</w:t>
+        <w:t>The dealer will also begin in the login screen but will skip the lobby entirely. They will be</w:t>
       </w:r>
     </w:p>
     <w:p>
@@ -6873,15 +7041,7 @@
         <w:ind w:left="720"/>
       </w:pPr>
       <w:r>
-        <w:t xml:space="preserve">responsible </w:t>
-      </w:r>
-      <w:proofErr w:type="gramStart"/>
-      <w:r>
-        <w:t>with</w:t>
-      </w:r>
-      <w:proofErr w:type="gramEnd"/>
-      <w:r>
-        <w:t xml:space="preserve"> setting up the table and opening for players waiting in the lobby. During the</w:t>
+        <w:t>responsible with setting up the table and opening for players waiting in the lobby. During the</w:t>
       </w:r>
     </w:p>
     <w:p>
@@ -6924,7 +7084,7 @@
       </w:pPr>
       <w:bookmarkStart w:id="53" w:name="__RefHeading___Toc729_1633043759"/>
       <w:bookmarkStart w:id="54" w:name="_Toc226533770"/>
-      <w:bookmarkStart w:id="55" w:name="_Toc226574006"/>
+      <w:bookmarkStart w:id="55" w:name="_Toc226576884"/>
       <w:bookmarkEnd w:id="53"/>
       <w:r>
         <w:rPr>
@@ -6979,7 +7139,7 @@
           <w:noProof/>
         </w:rPr>
         <w:drawing>
-          <wp:anchor distT="0" distB="0" distL="0" distR="0" simplePos="0" relativeHeight="41" behindDoc="0" locked="0" layoutInCell="0" allowOverlap="1" wp14:anchorId="2A453D56" wp14:editId="3D4EC6E9">
+          <wp:anchor distT="0" distB="0" distL="0" distR="0" simplePos="0" relativeHeight="251640832" behindDoc="0" locked="0" layoutInCell="0" allowOverlap="1" wp14:anchorId="2A453D56" wp14:editId="3D4EC6E9">
             <wp:simplePos x="0" y="0"/>
             <wp:positionH relativeFrom="column">
               <wp:posOffset>1314450</wp:posOffset>
@@ -7051,19 +7211,11 @@
           <w:color w:val="000000"/>
         </w:rPr>
       </w:pPr>
-      <w:proofErr w:type="gramStart"/>
-      <w:r>
-        <w:rPr>
-          <w:color w:val="000000"/>
-        </w:rPr>
-        <w:t>This diagrams</w:t>
-      </w:r>
-      <w:proofErr w:type="gramEnd"/>
-      <w:r>
-        <w:rPr>
-          <w:color w:val="000000"/>
-        </w:rPr>
-        <w:t xml:space="preserve"> shows the sequence for account creation. Whenever a user creates an</w:t>
+      <w:r>
+        <w:rPr>
+          <w:color w:val="000000"/>
+        </w:rPr>
+        <w:t>This diagram shows the sequence for account creation. Whenever a user creates an</w:t>
       </w:r>
     </w:p>
     <w:p>
@@ -7102,14 +7254,20 @@
           <w:color w:val="000000"/>
         </w:rPr>
         <w:tab/>
+      </w:r>
+      <w:bookmarkStart w:id="56" w:name="_Toc226576885"/>
+      <w:r>
+        <w:rPr>
+          <w:color w:val="000000"/>
+        </w:rPr>
         <w:t>4.2.2: User Pre-game Sequence</w:t>
       </w:r>
-      <w:bookmarkStart w:id="56" w:name="REQBV5SS8"/>
-      <w:bookmarkStart w:id="57" w:name="__RefHeading___Toc731_1633043759"/>
-      <w:bookmarkStart w:id="58" w:name="_Toc226533771"/>
-      <w:bookmarkStart w:id="59" w:name="_Toc226574009"/>
+      <w:bookmarkStart w:id="57" w:name="REQBV5SS8"/>
+      <w:bookmarkStart w:id="58" w:name="__RefHeading___Toc731_1633043759"/>
+      <w:bookmarkStart w:id="59" w:name="_Toc226533771"/>
       <w:bookmarkEnd w:id="56"/>
       <w:bookmarkEnd w:id="57"/>
+      <w:bookmarkEnd w:id="58"/>
     </w:p>
     <w:p>
       <w:pPr>
@@ -7124,7 +7282,7 @@
           <w:color w:val="000000"/>
         </w:rPr>
         <w:drawing>
-          <wp:anchor distT="0" distB="0" distL="0" distR="0" simplePos="0" relativeHeight="42" behindDoc="0" locked="0" layoutInCell="0" allowOverlap="1" wp14:anchorId="1231BB1A" wp14:editId="18E3A1D9">
+          <wp:anchor distT="0" distB="0" distL="0" distR="0" simplePos="0" relativeHeight="251648000" behindDoc="0" locked="0" layoutInCell="0" allowOverlap="1" wp14:anchorId="1231BB1A" wp14:editId="18E3A1D9">
             <wp:simplePos x="0" y="0"/>
             <wp:positionH relativeFrom="column">
               <wp:posOffset>457200</wp:posOffset>
@@ -7215,21 +7373,20 @@
           <w:color w:val="000000"/>
         </w:rPr>
       </w:pPr>
-      <w:bookmarkStart w:id="60" w:name="_Toc226574008"/>
-      <w:bookmarkStart w:id="61" w:name="_Toc226574007"/>
+      <w:bookmarkStart w:id="60" w:name="_Toc226576886"/>
       <w:r>
         <w:rPr>
           <w:noProof/>
           <w:color w:val="000000"/>
         </w:rPr>
         <w:drawing>
-          <wp:anchor distT="0" distB="0" distL="0" distR="0" simplePos="0" relativeHeight="40" behindDoc="0" locked="0" layoutInCell="0" allowOverlap="1" wp14:anchorId="6FC4CDA8" wp14:editId="6C129F56">
+          <wp:anchor distT="0" distB="0" distL="0" distR="0" simplePos="0" relativeHeight="251639808" behindDoc="0" locked="0" layoutInCell="0" allowOverlap="1" wp14:anchorId="6FC4CDA8" wp14:editId="59574811">
             <wp:simplePos x="0" y="0"/>
             <wp:positionH relativeFrom="column">
-              <wp:posOffset>590550</wp:posOffset>
+              <wp:posOffset>504825</wp:posOffset>
             </wp:positionH>
             <wp:positionV relativeFrom="paragraph">
-              <wp:posOffset>323850</wp:posOffset>
+              <wp:posOffset>457200</wp:posOffset>
             </wp:positionV>
             <wp:extent cx="4572000" cy="5861050"/>
             <wp:effectExtent l="0" t="0" r="0" b="0"/>
@@ -7269,13 +7426,18 @@
           </wp:anchor>
         </w:drawing>
       </w:r>
+      <w:r>
+        <w:rPr>
+          <w:color w:val="000000"/>
+        </w:rPr>
+        <w:t>4.2.3: User In-game Sequence</w:t>
+      </w:r>
       <w:bookmarkEnd w:id="60"/>
-      <w:bookmarkEnd w:id="61"/>
-      <w:r>
-        <w:rPr>
-          <w:color w:val="000000"/>
-        </w:rPr>
-        <w:t xml:space="preserve">4.2.3: User In-game Sequence </w:t>
+      <w:r>
+        <w:rPr>
+          <w:color w:val="000000"/>
+        </w:rPr>
+        <w:t xml:space="preserve"> </w:t>
       </w:r>
     </w:p>
     <w:p>
@@ -7350,44 +7512,26 @@
           <w:ilvl w:val="0"/>
           <w:numId w:val="0"/>
         </w:numPr>
-        <w:spacing w:before="0"/>
         <w:ind w:left="720" w:firstLine="720"/>
         <w:rPr>
           <w:color w:val="000000"/>
         </w:rPr>
       </w:pPr>
-      <w:r>
-        <w:rPr>
+      <w:bookmarkStart w:id="61" w:name="_Toc226576887"/>
+      <w:r>
+        <w:rPr>
+          <w:noProof/>
           <w:color w:val="000000"/>
         </w:rPr>
         <w:lastRenderedPageBreak/>
-        <w:t>4.2.4: Dealer pre-game Sequence</w:t>
-      </w:r>
-    </w:p>
-    <w:p>
-      <w:pPr>
-        <w:pStyle w:val="Heading2"/>
-        <w:numPr>
-          <w:ilvl w:val="0"/>
-          <w:numId w:val="0"/>
-        </w:numPr>
-        <w:rPr>
-          <w:color w:val="000000"/>
-        </w:rPr>
-      </w:pPr>
-      <w:r>
-        <w:rPr>
-          <w:noProof/>
-          <w:color w:val="000000"/>
-        </w:rPr>
         <w:drawing>
-          <wp:anchor distT="0" distB="0" distL="0" distR="0" simplePos="0" relativeHeight="43" behindDoc="0" locked="0" layoutInCell="0" allowOverlap="1" wp14:anchorId="2177A972" wp14:editId="06AC2FFE">
+          <wp:anchor distT="0" distB="0" distL="0" distR="0" simplePos="0" relativeHeight="251665408" behindDoc="0" locked="0" layoutInCell="0" allowOverlap="1" wp14:anchorId="2177A972" wp14:editId="37E2D351">
             <wp:simplePos x="0" y="0"/>
             <wp:positionH relativeFrom="column">
-              <wp:posOffset>228600</wp:posOffset>
+              <wp:posOffset>95250</wp:posOffset>
             </wp:positionH>
             <wp:positionV relativeFrom="paragraph">
-              <wp:posOffset>501015</wp:posOffset>
+              <wp:posOffset>262890</wp:posOffset>
             </wp:positionV>
             <wp:extent cx="5029200" cy="5703570"/>
             <wp:effectExtent l="0" t="0" r="0" b="0"/>
@@ -7427,42 +7571,37 @@
           </wp:anchor>
         </w:drawing>
       </w:r>
-    </w:p>
-    <w:p>
-      <w:pPr>
-        <w:pStyle w:val="Heading2"/>
-        <w:numPr>
-          <w:ilvl w:val="0"/>
-          <w:numId w:val="0"/>
-        </w:numPr>
-        <w:rPr>
-          <w:b w:val="0"/>
-          <w:bCs/>
-          <w:color w:val="000000"/>
-        </w:rPr>
-      </w:pPr>
-      <w:r>
-        <w:rPr>
-          <w:color w:val="000000"/>
-        </w:rPr>
-        <w:tab/>
-      </w:r>
-      <w:r>
-        <w:rPr>
-          <w:color w:val="000000"/>
-        </w:rPr>
-        <w:tab/>
-      </w:r>
-      <w:r>
-        <w:rPr>
-          <w:b w:val="0"/>
-          <w:bCs/>
+      <w:r>
+        <w:rPr>
+          <w:color w:val="000000"/>
+        </w:rPr>
+        <w:t xml:space="preserve">4.2.4: Dealer pre-game </w:t>
+      </w:r>
+      <w:bookmarkStart w:id="62" w:name="_Toc226576888"/>
+      <w:bookmarkEnd w:id="61"/>
+      <w:r>
+        <w:rPr>
+          <w:color w:val="000000"/>
+        </w:rPr>
+        <w:t xml:space="preserve">Sequence </w:t>
+      </w:r>
+      <w:bookmarkEnd w:id="62"/>
+    </w:p>
+    <w:p>
+      <w:pPr>
+        <w:ind w:left="720" w:firstLine="720"/>
+        <w:rPr>
+          <w:b/>
+          <w:color w:val="000000"/>
+          <w:sz w:val="24"/>
+        </w:rPr>
+      </w:pPr>
+      <w:bookmarkStart w:id="63" w:name="_Toc226576890"/>
+      <w:r>
+        <w:rPr>
           <w:color w:val="000000"/>
         </w:rPr>
         <w:t>This diagram shows the sequence for each action after the dealer logs on</w:t>
-      </w:r>
-      <w:r>
-        <w:br w:type="page"/>
       </w:r>
     </w:p>
     <w:p>
@@ -7483,15 +7622,15 @@
         </w:rPr>
         <w:lastRenderedPageBreak/>
         <w:drawing>
-          <wp:anchor distT="0" distB="0" distL="114300" distR="114300" simplePos="0" relativeHeight="45" behindDoc="0" locked="0" layoutInCell="0" allowOverlap="1" wp14:anchorId="16B9D1E2" wp14:editId="71B57DD3">
+          <wp:anchor distT="0" distB="0" distL="114300" distR="114300" simplePos="0" relativeHeight="251685888" behindDoc="0" locked="0" layoutInCell="0" allowOverlap="1" wp14:anchorId="16B9D1E2" wp14:editId="7BC92EFE">
             <wp:simplePos x="0" y="0"/>
             <wp:positionH relativeFrom="column">
-              <wp:posOffset>808990</wp:posOffset>
+              <wp:posOffset>760095</wp:posOffset>
             </wp:positionH>
             <wp:positionV relativeFrom="paragraph">
-              <wp:posOffset>408940</wp:posOffset>
+              <wp:posOffset>314325</wp:posOffset>
             </wp:positionV>
-            <wp:extent cx="4137660" cy="7000875"/>
+            <wp:extent cx="4053205" cy="6858000"/>
             <wp:effectExtent l="0" t="0" r="0" b="0"/>
             <wp:wrapTopAndBottom/>
             <wp:docPr id="11" name="Picture 4"/>
@@ -7516,7 +7655,7 @@
                   <pic:spPr bwMode="auto">
                     <a:xfrm>
                       <a:off x="0" y="0"/>
-                      <a:ext cx="4137660" cy="7000875"/>
+                      <a:ext cx="4053205" cy="6858000"/>
                     </a:xfrm>
                     <a:prstGeom prst="rect">
                       <a:avLst/>
@@ -7526,6 +7665,12 @@
                 </pic:pic>
               </a:graphicData>
             </a:graphic>
+            <wp14:sizeRelH relativeFrom="margin">
+              <wp14:pctWidth>0</wp14:pctWidth>
+            </wp14:sizeRelH>
+            <wp14:sizeRelV relativeFrom="margin">
+              <wp14:pctHeight>0</wp14:pctHeight>
+            </wp14:sizeRelV>
           </wp:anchor>
         </w:drawing>
       </w:r>
@@ -7535,8 +7680,10 @@
         </w:rPr>
         <w:t>4.2.5: Dealer in-game Sequence</w:t>
       </w:r>
+      <w:bookmarkEnd w:id="63"/>
     </w:p>
     <w:p/>
+    <w:p/>
     <w:p>
       <w:pPr>
         <w:ind w:left="720" w:firstLine="720"/>
@@ -7577,6 +7724,12 @@
           <w:color w:val="000000"/>
         </w:rPr>
         <w:t>game.</w:t>
+      </w:r>
+      <w:r>
+        <w:rPr>
+          <w:color w:val="000000"/>
+        </w:rPr>
+        <w:t>4.3</w:t>
       </w:r>
     </w:p>
     <w:p>
@@ -7591,21 +7744,28 @@
           <w:color w:val="000000"/>
         </w:rPr>
       </w:pPr>
+      <w:bookmarkStart w:id="64" w:name="_Toc226576891"/>
       <w:r>
         <w:rPr>
           <w:color w:val="000000"/>
         </w:rPr>
         <w:lastRenderedPageBreak/>
+        <w:t xml:space="preserve">4.3: </w:t>
+      </w:r>
+      <w:r>
+        <w:rPr>
+          <w:color w:val="000000"/>
+        </w:rPr>
         <w:t>C</w:t>
       </w:r>
-      <w:bookmarkEnd w:id="58"/>
+      <w:bookmarkEnd w:id="59"/>
       <w:r>
         <w:rPr>
           <w:color w:val="000000"/>
         </w:rPr>
         <w:t>ommon &amp; Intended User Interfacing Flow</w:t>
       </w:r>
-      <w:bookmarkEnd w:id="59"/>
+      <w:bookmarkEnd w:id="64"/>
       <w:r>
         <w:rPr>
           <w:color w:val="000000"/>
@@ -7624,21 +7784,7 @@
         <w:rPr>
           <w:color w:val="000000"/>
         </w:rPr>
-        <w:t xml:space="preserve">4.3.1 While identifying the main user sequences and common use cases, we put the primary game loop/sequence as our priority. In addressing that design in conjunction with the primary goal of approaching the client/server structure problem, we felt it was necessary to keep the most consistently accessed set of actions and outcomes at the top of our minds while moving towards implementation to ensure </w:t>
-      </w:r>
-      <w:proofErr w:type="gramStart"/>
-      <w:r>
-        <w:rPr>
-          <w:color w:val="000000"/>
-        </w:rPr>
-        <w:t>the smoothness</w:t>
-      </w:r>
-      <w:proofErr w:type="gramEnd"/>
-      <w:r>
-        <w:rPr>
-          <w:color w:val="000000"/>
-        </w:rPr>
-        <w:t xml:space="preserve"> and real-time responsiveness the program aims to deliver on.</w:t>
+        <w:t>While identifying the main user sequences and common use cases, we put the primary game loop/sequence as our priority. In addressing that design in conjunction with the primary goal of approaching the client/server structure problem, we felt it was necessary to keep the most consistently accessed set of actions and outcomes at the top of our minds while moving towards implementation to ensure the smoothness and real-time responsiveness the program aims to deliver on.</w:t>
       </w:r>
     </w:p>
     <w:p>
@@ -7653,35 +7799,7 @@
           <w:color w:val="000000"/>
         </w:rPr>
         <w:tab/>
-        <w:t xml:space="preserve">For future considerations and the development of this Blackjack Handling System, on top of solidifying the game logic according to standard casino rules, the program design will be built upon with considerations to efficiently and seamlessly </w:t>
-      </w:r>
-      <w:proofErr w:type="gramStart"/>
-      <w:r>
-        <w:rPr>
-          <w:color w:val="000000"/>
-        </w:rPr>
-        <w:t>providing</w:t>
-      </w:r>
-      <w:proofErr w:type="gramEnd"/>
-      <w:r>
-        <w:rPr>
-          <w:color w:val="000000"/>
-        </w:rPr>
-        <w:t xml:space="preserve"> a multi-threaded server to </w:t>
-      </w:r>
-      <w:proofErr w:type="gramStart"/>
-      <w:r>
-        <w:rPr>
-          <w:color w:val="000000"/>
-        </w:rPr>
-        <w:t>clients</w:t>
-      </w:r>
-      <w:proofErr w:type="gramEnd"/>
-      <w:r>
-        <w:rPr>
-          <w:color w:val="000000"/>
-        </w:rPr>
-        <w:t xml:space="preserve"> gameplay experience.</w:t>
+        <w:t>For future considerations and the development of this Blackjack Handling System, on top of solidifying the game logic according to standard casino rules, the program design will be built upon with considerations to efficiently and seamlessly providing a multi-threaded server to clients gameplay experience.</w:t>
       </w:r>
     </w:p>
     <w:p>
@@ -7892,17 +8010,8 @@
                               <w:rStyle w:val="PageNumber"/>
                               <w:color w:val="000000"/>
                             </w:rPr>
-                            <w:t>i</w:t>
+                            <w:t>ii</w:t>
                           </w:r>
-                          <w:proofErr w:type="spellStart"/>
-                          <w:r>
-                            <w:rPr>
-                              <w:rStyle w:val="PageNumber"/>
-                              <w:color w:val="000000"/>
-                            </w:rPr>
-                            <w:t>i</w:t>
-                          </w:r>
-                          <w:proofErr w:type="spellEnd"/>
                           <w:r>
                             <w:rPr>
                               <w:rStyle w:val="PageNumber"/>
@@ -7957,17 +8066,8 @@
                         <w:rStyle w:val="PageNumber"/>
                         <w:color w:val="000000"/>
                       </w:rPr>
-                      <w:t>i</w:t>
+                      <w:t>ii</w:t>
                     </w:r>
-                    <w:proofErr w:type="spellStart"/>
-                    <w:r>
-                      <w:rPr>
-                        <w:rStyle w:val="PageNumber"/>
-                        <w:color w:val="000000"/>
-                      </w:rPr>
-                      <w:t>i</w:t>
-                    </w:r>
-                    <w:proofErr w:type="spellEnd"/>
                     <w:r>
                       <w:rPr>
                         <w:rStyle w:val="PageNumber"/>
@@ -8075,17 +8175,8 @@
                               <w:rStyle w:val="PageNumber"/>
                               <w:color w:val="000000"/>
                             </w:rPr>
-                            <w:t>i</w:t>
+                            <w:t>ii</w:t>
                           </w:r>
-                          <w:proofErr w:type="spellStart"/>
-                          <w:r>
-                            <w:rPr>
-                              <w:rStyle w:val="PageNumber"/>
-                              <w:color w:val="000000"/>
-                            </w:rPr>
-                            <w:t>i</w:t>
-                          </w:r>
-                          <w:proofErr w:type="spellEnd"/>
                           <w:r>
                             <w:rPr>
                               <w:rStyle w:val="PageNumber"/>
@@ -8140,17 +8231,8 @@
                         <w:rStyle w:val="PageNumber"/>
                         <w:color w:val="000000"/>
                       </w:rPr>
-                      <w:t>i</w:t>
+                      <w:t>ii</w:t>
                     </w:r>
-                    <w:proofErr w:type="spellStart"/>
-                    <w:r>
-                      <w:rPr>
-                        <w:rStyle w:val="PageNumber"/>
-                        <w:color w:val="000000"/>
-                      </w:rPr>
-                      <w:t>i</w:t>
-                    </w:r>
-                    <w:proofErr w:type="spellEnd"/>
                     <w:r>
                       <w:rPr>
                         <w:rStyle w:val="PageNumber"/>
@@ -8451,16 +8533,8 @@
       <w:rPr>
         <w:rStyle w:val="PageNumber"/>
       </w:rPr>
-      <w:t>ii</w:t>
+      <w:t>iii</w:t>
     </w:r>
-    <w:proofErr w:type="spellStart"/>
-    <w:r>
-      <w:rPr>
-        <w:rStyle w:val="PageNumber"/>
-      </w:rPr>
-      <w:t>i</w:t>
-    </w:r>
-    <w:proofErr w:type="spellEnd"/>
     <w:r>
       <w:rPr>
         <w:rStyle w:val="PageNumber"/>

</xml_diff>

<commit_message>
Created CLient and  server packages, added png cards to client.
</commit_message>
<xml_diff>
--- a/Documentation/Phase 2/CS 401 - Group 2 - SDD Doc.docx
+++ b/Documentation/Phase 2/CS 401 - Group 2 - SDD Doc.docx
@@ -2036,6 +2036,7 @@
           <w:docPartUnique/>
         </w:docPartObj>
       </w:sdtPr>
+      <w:sdtEndPr/>
       <w:sdtContent>
         <w:p>
           <w:pPr>
@@ -2072,7 +2073,7 @@
             </w:rPr>
             <w:fldChar w:fldCharType="separate"/>
           </w:r>
-          <w:hyperlink w:anchor="_Toc226576867" w:history="1">
+          <w:hyperlink w:anchor="_Toc226577308" w:history="1">
             <w:r>
               <w:rPr>
                 <w:rStyle w:val="Hyperlink"/>
@@ -2118,7 +2119,7 @@
               <w:rPr>
                 <w:noProof/>
               </w:rPr>
-              <w:instrText xml:space="preserve"> PAGEREF _Toc226576867 \h </w:instrText>
+              <w:instrText xml:space="preserve"> PAGEREF _Toc226577308 \h </w:instrText>
             </w:r>
             <w:r>
               <w:rPr>
@@ -2162,7 +2163,7 @@
               <w14:ligatures w14:val="standardContextual"/>
             </w:rPr>
           </w:pPr>
-          <w:hyperlink w:anchor="_Toc226576868" w:history="1">
+          <w:hyperlink w:anchor="_Toc226577309" w:history="1">
             <w:r>
               <w:rPr>
                 <w:rStyle w:val="Hyperlink"/>
@@ -2206,7 +2207,7 @@
               <w:rPr>
                 <w:noProof/>
               </w:rPr>
-              <w:instrText xml:space="preserve"> PAGEREF _Toc226576868 \h </w:instrText>
+              <w:instrText xml:space="preserve"> PAGEREF _Toc226577309 \h </w:instrText>
             </w:r>
             <w:r>
               <w:rPr>
@@ -2250,7 +2251,7 @@
               <w14:ligatures w14:val="standardContextual"/>
             </w:rPr>
           </w:pPr>
-          <w:hyperlink w:anchor="_Toc226576869" w:history="1">
+          <w:hyperlink w:anchor="_Toc226577310" w:history="1">
             <w:r>
               <w:rPr>
                 <w:rStyle w:val="Hyperlink"/>
@@ -2294,7 +2295,7 @@
               <w:rPr>
                 <w:noProof/>
               </w:rPr>
-              <w:instrText xml:space="preserve"> PAGEREF _Toc226576869 \h </w:instrText>
+              <w:instrText xml:space="preserve"> PAGEREF _Toc226577310 \h </w:instrText>
             </w:r>
             <w:r>
               <w:rPr>
@@ -2338,7 +2339,7 @@
               <w14:ligatures w14:val="standardContextual"/>
             </w:rPr>
           </w:pPr>
-          <w:hyperlink w:anchor="_Toc226576870" w:history="1">
+          <w:hyperlink w:anchor="_Toc226577311" w:history="1">
             <w:r>
               <w:rPr>
                 <w:rStyle w:val="Hyperlink"/>
@@ -2382,7 +2383,7 @@
               <w:rPr>
                 <w:noProof/>
               </w:rPr>
-              <w:instrText xml:space="preserve"> PAGEREF _Toc226576870 \h </w:instrText>
+              <w:instrText xml:space="preserve"> PAGEREF _Toc226577311 \h </w:instrText>
             </w:r>
             <w:r>
               <w:rPr>
@@ -2427,7 +2428,7 @@
               <w14:ligatures w14:val="standardContextual"/>
             </w:rPr>
           </w:pPr>
-          <w:hyperlink w:anchor="_Toc226576871" w:history="1">
+          <w:hyperlink w:anchor="_Toc226577312" w:history="1">
             <w:r>
               <w:rPr>
                 <w:rStyle w:val="Hyperlink"/>
@@ -2473,7 +2474,7 @@
               <w:rPr>
                 <w:noProof/>
               </w:rPr>
-              <w:instrText xml:space="preserve"> PAGEREF _Toc226576871 \h </w:instrText>
+              <w:instrText xml:space="preserve"> PAGEREF _Toc226577312 \h </w:instrText>
             </w:r>
             <w:r>
               <w:rPr>
@@ -2517,7 +2518,7 @@
               <w14:ligatures w14:val="standardContextual"/>
             </w:rPr>
           </w:pPr>
-          <w:hyperlink w:anchor="_Toc226576872" w:history="1">
+          <w:hyperlink w:anchor="_Toc226577313" w:history="1">
             <w:r>
               <w:rPr>
                 <w:rStyle w:val="Hyperlink"/>
@@ -2561,7 +2562,7 @@
               <w:rPr>
                 <w:noProof/>
               </w:rPr>
-              <w:instrText xml:space="preserve"> PAGEREF _Toc226576872 \h </w:instrText>
+              <w:instrText xml:space="preserve"> PAGEREF _Toc226577313 \h </w:instrText>
             </w:r>
             <w:r>
               <w:rPr>
@@ -2605,7 +2606,7 @@
               <w14:ligatures w14:val="standardContextual"/>
             </w:rPr>
           </w:pPr>
-          <w:hyperlink w:anchor="_Toc226576873" w:history="1">
+          <w:hyperlink w:anchor="_Toc226577314" w:history="1">
             <w:r>
               <w:rPr>
                 <w:rStyle w:val="Hyperlink"/>
@@ -2649,7 +2650,7 @@
               <w:rPr>
                 <w:noProof/>
               </w:rPr>
-              <w:instrText xml:space="preserve"> PAGEREF _Toc226576873 \h </w:instrText>
+              <w:instrText xml:space="preserve"> PAGEREF _Toc226577314 \h </w:instrText>
             </w:r>
             <w:r>
               <w:rPr>
@@ -2693,7 +2694,7 @@
               <w14:ligatures w14:val="standardContextual"/>
             </w:rPr>
           </w:pPr>
-          <w:hyperlink w:anchor="_Toc226576874" w:history="1">
+          <w:hyperlink w:anchor="_Toc226577315" w:history="1">
             <w:r>
               <w:rPr>
                 <w:rStyle w:val="Hyperlink"/>
@@ -2737,7 +2738,7 @@
               <w:rPr>
                 <w:noProof/>
               </w:rPr>
-              <w:instrText xml:space="preserve"> PAGEREF _Toc226576874 \h </w:instrText>
+              <w:instrText xml:space="preserve"> PAGEREF _Toc226577315 \h </w:instrText>
             </w:r>
             <w:r>
               <w:rPr>
@@ -2781,7 +2782,7 @@
               <w14:ligatures w14:val="standardContextual"/>
             </w:rPr>
           </w:pPr>
-          <w:hyperlink w:anchor="_Toc226576875" w:history="1">
+          <w:hyperlink w:anchor="_Toc226577316" w:history="1">
             <w:r>
               <w:rPr>
                 <w:rStyle w:val="Hyperlink"/>
@@ -2825,7 +2826,7 @@
               <w:rPr>
                 <w:noProof/>
               </w:rPr>
-              <w:instrText xml:space="preserve"> PAGEREF _Toc226576875 \h </w:instrText>
+              <w:instrText xml:space="preserve"> PAGEREF _Toc226577316 \h </w:instrText>
             </w:r>
             <w:r>
               <w:rPr>
@@ -2869,7 +2870,7 @@
               <w14:ligatures w14:val="standardContextual"/>
             </w:rPr>
           </w:pPr>
-          <w:hyperlink w:anchor="_Toc226576876" w:history="1">
+          <w:hyperlink w:anchor="_Toc226577317" w:history="1">
             <w:r>
               <w:rPr>
                 <w:rStyle w:val="Hyperlink"/>
@@ -2913,7 +2914,7 @@
               <w:rPr>
                 <w:noProof/>
               </w:rPr>
-              <w:instrText xml:space="preserve"> PAGEREF _Toc226576876 \h </w:instrText>
+              <w:instrText xml:space="preserve"> PAGEREF _Toc226577317 \h </w:instrText>
             </w:r>
             <w:r>
               <w:rPr>
@@ -2958,7 +2959,7 @@
               <w14:ligatures w14:val="standardContextual"/>
             </w:rPr>
           </w:pPr>
-          <w:hyperlink w:anchor="_Toc226576877" w:history="1">
+          <w:hyperlink w:anchor="_Toc226577318" w:history="1">
             <w:r>
               <w:rPr>
                 <w:rStyle w:val="Hyperlink"/>
@@ -3004,7 +3005,7 @@
               <w:rPr>
                 <w:noProof/>
               </w:rPr>
-              <w:instrText xml:space="preserve"> PAGEREF _Toc226576877 \h </w:instrText>
+              <w:instrText xml:space="preserve"> PAGEREF _Toc226577318 \h </w:instrText>
             </w:r>
             <w:r>
               <w:rPr>
@@ -3048,7 +3049,7 @@
               <w14:ligatures w14:val="standardContextual"/>
             </w:rPr>
           </w:pPr>
-          <w:hyperlink w:anchor="_Toc226576878" w:history="1">
+          <w:hyperlink w:anchor="_Toc226577319" w:history="1">
             <w:r>
               <w:rPr>
                 <w:rStyle w:val="Hyperlink"/>
@@ -3092,7 +3093,7 @@
               <w:rPr>
                 <w:noProof/>
               </w:rPr>
-              <w:instrText xml:space="preserve"> PAGEREF _Toc226576878 \h </w:instrText>
+              <w:instrText xml:space="preserve"> PAGEREF _Toc226577319 \h </w:instrText>
             </w:r>
             <w:r>
               <w:rPr>
@@ -3136,7 +3137,7 @@
               <w14:ligatures w14:val="standardContextual"/>
             </w:rPr>
           </w:pPr>
-          <w:hyperlink w:anchor="_Toc226576879" w:history="1">
+          <w:hyperlink w:anchor="_Toc226577320" w:history="1">
             <w:r>
               <w:rPr>
                 <w:rStyle w:val="Hyperlink"/>
@@ -3180,7 +3181,7 @@
               <w:rPr>
                 <w:noProof/>
               </w:rPr>
-              <w:instrText xml:space="preserve"> PAGEREF _Toc226576879 \h </w:instrText>
+              <w:instrText xml:space="preserve"> PAGEREF _Toc226577320 \h </w:instrText>
             </w:r>
             <w:r>
               <w:rPr>
@@ -3224,7 +3225,7 @@
               <w14:ligatures w14:val="standardContextual"/>
             </w:rPr>
           </w:pPr>
-          <w:hyperlink w:anchor="_Toc226576880" w:history="1">
+          <w:hyperlink w:anchor="_Toc226577321" w:history="1">
             <w:r>
               <w:rPr>
                 <w:rStyle w:val="Hyperlink"/>
@@ -3268,7 +3269,7 @@
               <w:rPr>
                 <w:noProof/>
               </w:rPr>
-              <w:instrText xml:space="preserve"> PAGEREF _Toc226576880 \h </w:instrText>
+              <w:instrText xml:space="preserve"> PAGEREF _Toc226577321 \h </w:instrText>
             </w:r>
             <w:r>
               <w:rPr>
@@ -3312,7 +3313,7 @@
               <w14:ligatures w14:val="standardContextual"/>
             </w:rPr>
           </w:pPr>
-          <w:hyperlink w:anchor="_Toc226576881" w:history="1">
+          <w:hyperlink w:anchor="_Toc226577322" w:history="1">
             <w:r>
               <w:rPr>
                 <w:rStyle w:val="Hyperlink"/>
@@ -3356,7 +3357,7 @@
               <w:rPr>
                 <w:noProof/>
               </w:rPr>
-              <w:instrText xml:space="preserve"> PAGEREF _Toc226576881 \h </w:instrText>
+              <w:instrText xml:space="preserve"> PAGEREF _Toc226577322 \h </w:instrText>
             </w:r>
             <w:r>
               <w:rPr>
@@ -3401,7 +3402,7 @@
               <w14:ligatures w14:val="standardContextual"/>
             </w:rPr>
           </w:pPr>
-          <w:hyperlink w:anchor="_Toc226576882" w:history="1">
+          <w:hyperlink w:anchor="_Toc226577323" w:history="1">
             <w:r>
               <w:rPr>
                 <w:rStyle w:val="Hyperlink"/>
@@ -3447,7 +3448,7 @@
               <w:rPr>
                 <w:noProof/>
               </w:rPr>
-              <w:instrText xml:space="preserve"> PAGEREF _Toc226576882 \h </w:instrText>
+              <w:instrText xml:space="preserve"> PAGEREF _Toc226577323 \h </w:instrText>
             </w:r>
             <w:r>
               <w:rPr>
@@ -3491,7 +3492,7 @@
               <w14:ligatures w14:val="standardContextual"/>
             </w:rPr>
           </w:pPr>
-          <w:hyperlink w:anchor="_Toc226576883" w:history="1">
+          <w:hyperlink w:anchor="_Toc226577324" w:history="1">
             <w:r>
               <w:rPr>
                 <w:rStyle w:val="Hyperlink"/>
@@ -3535,7 +3536,7 @@
               <w:rPr>
                 <w:noProof/>
               </w:rPr>
-              <w:instrText xml:space="preserve"> PAGEREF _Toc226576883 \h </w:instrText>
+              <w:instrText xml:space="preserve"> PAGEREF _Toc226577324 \h </w:instrText>
             </w:r>
             <w:r>
               <w:rPr>
@@ -3579,7 +3580,7 @@
               <w14:ligatures w14:val="standardContextual"/>
             </w:rPr>
           </w:pPr>
-          <w:hyperlink w:anchor="_Toc226576884" w:history="1">
+          <w:hyperlink w:anchor="_Toc226577325" w:history="1">
             <w:r>
               <w:rPr>
                 <w:rStyle w:val="Hyperlink"/>
@@ -3623,7 +3624,7 @@
               <w:rPr>
                 <w:noProof/>
               </w:rPr>
-              <w:instrText xml:space="preserve"> PAGEREF _Toc226576884 \h </w:instrText>
+              <w:instrText xml:space="preserve"> PAGEREF _Toc226577325 \h </w:instrText>
             </w:r>
             <w:r>
               <w:rPr>
@@ -3664,7 +3665,7 @@
               <w14:ligatures w14:val="standardContextual"/>
             </w:rPr>
           </w:pPr>
-          <w:hyperlink w:anchor="_Toc226576885" w:history="1">
+          <w:hyperlink w:anchor="_Toc226577326" w:history="1">
             <w:r>
               <w:rPr>
                 <w:rStyle w:val="Hyperlink"/>
@@ -3688,7 +3689,7 @@
               <w:rPr>
                 <w:noProof/>
               </w:rPr>
-              <w:instrText xml:space="preserve"> PAGEREF _Toc226576885 \h </w:instrText>
+              <w:instrText xml:space="preserve"> PAGEREF _Toc226577326 \h </w:instrText>
             </w:r>
             <w:r>
               <w:rPr>
@@ -3729,7 +3730,7 @@
               <w14:ligatures w14:val="standardContextual"/>
             </w:rPr>
           </w:pPr>
-          <w:hyperlink w:anchor="_Toc226576886" w:history="1">
+          <w:hyperlink w:anchor="_Toc226577327" w:history="1">
             <w:r>
               <w:rPr>
                 <w:rStyle w:val="Hyperlink"/>
@@ -3753,7 +3754,7 @@
               <w:rPr>
                 <w:noProof/>
               </w:rPr>
-              <w:instrText xml:space="preserve"> PAGEREF _Toc226576886 \h </w:instrText>
+              <w:instrText xml:space="preserve"> PAGEREF _Toc226577327 \h </w:instrText>
             </w:r>
             <w:r>
               <w:rPr>
@@ -3794,7 +3795,7 @@
               <w14:ligatures w14:val="standardContextual"/>
             </w:rPr>
           </w:pPr>
-          <w:hyperlink w:anchor="_Toc226576887" w:history="1">
+          <w:hyperlink w:anchor="_Toc226577328" w:history="1">
             <w:r>
               <w:rPr>
                 <w:rStyle w:val="Hyperlink"/>
@@ -3818,7 +3819,7 @@
               <w:rPr>
                 <w:noProof/>
               </w:rPr>
-              <w:instrText xml:space="preserve"> PAGEREF _Toc226576887 \h </w:instrText>
+              <w:instrText xml:space="preserve"> PAGEREF _Toc226577328 \h </w:instrText>
             </w:r>
             <w:r>
               <w:rPr>
@@ -3859,7 +3860,14 @@
               <w14:ligatures w14:val="standardContextual"/>
             </w:rPr>
           </w:pPr>
-          <w:hyperlink w:anchor="_Toc226576888" w:history="1">
+          <w:hyperlink w:anchor="_Toc226577329" w:history="1">
+            <w:r>
+              <w:rPr>
+                <w:rStyle w:val="Hyperlink"/>
+                <w:noProof/>
+              </w:rPr>
+              <w:t>4.2.5: Dealer in-game Sequence</w:t>
+            </w:r>
             <w:r>
               <w:rPr>
                 <w:noProof/>
@@ -3876,7 +3884,7 @@
               <w:rPr>
                 <w:noProof/>
               </w:rPr>
-              <w:instrText xml:space="preserve"> PAGEREF _Toc226576888 \h </w:instrText>
+              <w:instrText xml:space="preserve"> PAGEREF _Toc226577329 \h </w:instrText>
             </w:r>
             <w:r>
               <w:rPr>
@@ -3893,7 +3901,7 @@
               <w:rPr>
                 <w:noProof/>
               </w:rPr>
-              <w:t>xvi</w:t>
+              <w:t>xvii</w:t>
             </w:r>
             <w:r>
               <w:rPr>
@@ -3917,14 +3925,13 @@
               <w14:ligatures w14:val="standardContextual"/>
             </w:rPr>
           </w:pPr>
-          <w:hyperlink w:anchor="_Toc226576889" w:history="1">
+          <w:hyperlink w:anchor="_Toc226577330" w:history="1">
             <w:r>
               <w:rPr>
                 <w:rStyle w:val="Hyperlink"/>
-                <w:bCs/>
-                <w:noProof/>
-              </w:rPr>
-              <w:t>This diagram shows the sequence for each action after the dealer logs on</w:t>
+                <w:noProof/>
+              </w:rPr>
+              <w:t>4.3: Common &amp; Intended User Interfacing Flow</w:t>
             </w:r>
             <w:r>
               <w:rPr>
@@ -3942,137 +3949,7 @@
               <w:rPr>
                 <w:noProof/>
               </w:rPr>
-              <w:instrText xml:space="preserve"> PAGEREF _Toc226576889 \h </w:instrText>
-            </w:r>
-            <w:r>
-              <w:rPr>
-                <w:noProof/>
-              </w:rPr>
-            </w:r>
-            <w:r>
-              <w:rPr>
-                <w:noProof/>
-              </w:rPr>
-              <w:fldChar w:fldCharType="separate"/>
-            </w:r>
-            <w:r>
-              <w:rPr>
-                <w:noProof/>
-              </w:rPr>
-              <w:t>xvi</w:t>
-            </w:r>
-            <w:r>
-              <w:rPr>
-                <w:noProof/>
-              </w:rPr>
-              <w:fldChar w:fldCharType="end"/>
-            </w:r>
-          </w:hyperlink>
-        </w:p>
-        <w:p>
-          <w:pPr>
-            <w:pStyle w:val="TOC2"/>
-            <w:rPr>
-              <w:rFonts w:asciiTheme="minorHAnsi" w:eastAsiaTheme="minorEastAsia" w:hAnsiTheme="minorHAnsi" w:cstheme="minorBidi"/>
-              <w:smallCaps w:val="0"/>
-              <w:noProof/>
-              <w:kern w:val="2"/>
-              <w:sz w:val="24"/>
-              <w:szCs w:val="24"/>
-              <w:lang w:eastAsia="en-US"/>
-              <w14:ligatures w14:val="standardContextual"/>
-            </w:rPr>
-          </w:pPr>
-          <w:hyperlink w:anchor="_Toc226576890" w:history="1">
-            <w:r>
-              <w:rPr>
-                <w:rStyle w:val="Hyperlink"/>
-                <w:noProof/>
-              </w:rPr>
-              <w:t>4.2.5: Dealer in-game Sequence</w:t>
-            </w:r>
-            <w:r>
-              <w:rPr>
-                <w:noProof/>
-              </w:rPr>
-              <w:tab/>
-            </w:r>
-            <w:r>
-              <w:rPr>
-                <w:noProof/>
-              </w:rPr>
-              <w:fldChar w:fldCharType="begin"/>
-            </w:r>
-            <w:r>
-              <w:rPr>
-                <w:noProof/>
-              </w:rPr>
-              <w:instrText xml:space="preserve"> PAGEREF _Toc226576890 \h </w:instrText>
-            </w:r>
-            <w:r>
-              <w:rPr>
-                <w:noProof/>
-              </w:rPr>
-            </w:r>
-            <w:r>
-              <w:rPr>
-                <w:noProof/>
-              </w:rPr>
-              <w:fldChar w:fldCharType="separate"/>
-            </w:r>
-            <w:r>
-              <w:rPr>
-                <w:noProof/>
-              </w:rPr>
-              <w:t>xvii</w:t>
-            </w:r>
-            <w:r>
-              <w:rPr>
-                <w:noProof/>
-              </w:rPr>
-              <w:fldChar w:fldCharType="end"/>
-            </w:r>
-          </w:hyperlink>
-        </w:p>
-        <w:p>
-          <w:pPr>
-            <w:pStyle w:val="TOC2"/>
-            <w:rPr>
-              <w:rFonts w:asciiTheme="minorHAnsi" w:eastAsiaTheme="minorEastAsia" w:hAnsiTheme="minorHAnsi" w:cstheme="minorBidi"/>
-              <w:smallCaps w:val="0"/>
-              <w:noProof/>
-              <w:kern w:val="2"/>
-              <w:sz w:val="24"/>
-              <w:szCs w:val="24"/>
-              <w:lang w:eastAsia="en-US"/>
-              <w14:ligatures w14:val="standardContextual"/>
-            </w:rPr>
-          </w:pPr>
-          <w:hyperlink w:anchor="_Toc226576891" w:history="1">
-            <w:r>
-              <w:rPr>
-                <w:rStyle w:val="Hyperlink"/>
-                <w:noProof/>
-              </w:rPr>
-              <w:t>4.3: Common &amp; Intended User Interfacing Flow</w:t>
-            </w:r>
-            <w:r>
-              <w:rPr>
-                <w:noProof/>
-              </w:rPr>
-              <w:tab/>
-            </w:r>
-            <w:r>
-              <w:rPr>
-                <w:noProof/>
-              </w:rPr>
-              <w:fldChar w:fldCharType="begin"/>
-            </w:r>
-            <w:r>
-              <w:rPr>
-                <w:noProof/>
-              </w:rPr>
-              <w:instrText xml:space="preserve"> PAGEREF _Toc226576891 \h </w:instrText>
+              <w:instrText xml:space="preserve"> PAGEREF _Toc226577330 \h </w:instrText>
             </w:r>
             <w:r>
               <w:rPr>
@@ -4175,7 +4052,7 @@
       </w:pPr>
       <w:bookmarkStart w:id="2" w:name="__RefHeading___Toc695_1633043759"/>
       <w:bookmarkStart w:id="3" w:name="_Toc226533746"/>
-      <w:bookmarkStart w:id="4" w:name="_Toc226576867"/>
+      <w:bookmarkStart w:id="4" w:name="_Toc226577308"/>
       <w:bookmarkEnd w:id="2"/>
       <w:bookmarkEnd w:id="3"/>
       <w:r>
@@ -4198,7 +4075,21 @@
         <w:rPr>
           <w:color w:val="000000"/>
         </w:rPr>
-        <w:t>This software design document provides a architectural overview for the Blackjack Handling System (BHS).</w:t>
+        <w:t xml:space="preserve">This software design document provides </w:t>
+      </w:r>
+      <w:proofErr w:type="gramStart"/>
+      <w:r>
+        <w:rPr>
+          <w:color w:val="000000"/>
+        </w:rPr>
+        <w:t>a</w:t>
+      </w:r>
+      <w:proofErr w:type="gramEnd"/>
+      <w:r>
+        <w:rPr>
+          <w:color w:val="000000"/>
+        </w:rPr>
+        <w:t xml:space="preserve"> architectural overview for the Blackjack Handling System (BHS).</w:t>
       </w:r>
     </w:p>
     <w:p>
@@ -4214,7 +4105,7 @@
       </w:pPr>
       <w:bookmarkStart w:id="5" w:name="__RefHeading___Toc697_1633043759"/>
       <w:bookmarkStart w:id="6" w:name="_Toc226533747"/>
-      <w:bookmarkStart w:id="7" w:name="_Toc226576868"/>
+      <w:bookmarkStart w:id="7" w:name="_Toc226577309"/>
       <w:bookmarkEnd w:id="5"/>
       <w:r>
         <w:rPr>
@@ -4248,7 +4139,7 @@
       </w:pPr>
       <w:bookmarkStart w:id="8" w:name="__RefHeading___Toc699_1633043759"/>
       <w:bookmarkStart w:id="9" w:name="_Toc226533748"/>
-      <w:bookmarkStart w:id="10" w:name="_Toc226576869"/>
+      <w:bookmarkStart w:id="10" w:name="_Toc226577310"/>
       <w:bookmarkEnd w:id="8"/>
       <w:r>
         <w:rPr>
@@ -4286,7 +4177,21 @@
         <w:rPr>
           <w:color w:val="000000"/>
         </w:rPr>
-        <w:t>Dealer: A specialized user role with the added ability to operate as a dealer for the games and the configurator of game parameters when creating joinable tables for blackjack, deals cards in accordance to standard blackjack rules</w:t>
+        <w:t xml:space="preserve">Dealer: A specialized user role with the added ability to operate as a dealer for the games and the configurator of game parameters when creating joinable tables for blackjack, deals cards in accordance </w:t>
+      </w:r>
+      <w:proofErr w:type="gramStart"/>
+      <w:r>
+        <w:rPr>
+          <w:color w:val="000000"/>
+        </w:rPr>
+        <w:t>to</w:t>
+      </w:r>
+      <w:proofErr w:type="gramEnd"/>
+      <w:r>
+        <w:rPr>
+          <w:color w:val="000000"/>
+        </w:rPr>
+        <w:t xml:space="preserve"> standard blackjack rules</w:t>
       </w:r>
     </w:p>
     <w:p>
@@ -4451,7 +4356,21 @@
         <w:rPr>
           <w:color w:val="000000"/>
         </w:rPr>
-        <w:t>Bet: A number of credits submitted by a player before being dealt hands to start playing the game</w:t>
+        <w:t xml:space="preserve">Bet: </w:t>
+      </w:r>
+      <w:proofErr w:type="gramStart"/>
+      <w:r>
+        <w:rPr>
+          <w:color w:val="000000"/>
+        </w:rPr>
+        <w:t>A number of</w:t>
+      </w:r>
+      <w:proofErr w:type="gramEnd"/>
+      <w:r>
+        <w:rPr>
+          <w:color w:val="000000"/>
+        </w:rPr>
+        <w:t xml:space="preserve"> credits submitted by a player before being dealt hands to start playing the game</w:t>
       </w:r>
     </w:p>
     <w:p>
@@ -4466,7 +4385,35 @@
         <w:rPr>
           <w:color w:val="000000"/>
         </w:rPr>
-        <w:t>Timer: A countdown for the time players have to take action in a round of the game</w:t>
+        <w:t xml:space="preserve">Timer: A countdown for the time players </w:t>
+      </w:r>
+      <w:proofErr w:type="gramStart"/>
+      <w:r>
+        <w:rPr>
+          <w:color w:val="000000"/>
+        </w:rPr>
+        <w:t>have</w:t>
+      </w:r>
+      <w:proofErr w:type="gramEnd"/>
+      <w:r>
+        <w:rPr>
+          <w:color w:val="000000"/>
+        </w:rPr>
+        <w:t xml:space="preserve"> to </w:t>
+      </w:r>
+      <w:proofErr w:type="gramStart"/>
+      <w:r>
+        <w:rPr>
+          <w:color w:val="000000"/>
+        </w:rPr>
+        <w:t>take action</w:t>
+      </w:r>
+      <w:proofErr w:type="gramEnd"/>
+      <w:r>
+        <w:rPr>
+          <w:color w:val="000000"/>
+        </w:rPr>
+        <w:t xml:space="preserve"> in a round of the game</w:t>
       </w:r>
     </w:p>
     <w:p>
@@ -4587,7 +4534,21 @@
         <w:rPr>
           <w:color w:val="000000"/>
         </w:rPr>
-        <w:t>Stand: When a player signals they don’t want any additional cards dealt to them during the current round.</w:t>
+        <w:t xml:space="preserve">Stand: When a player </w:t>
+      </w:r>
+      <w:proofErr w:type="gramStart"/>
+      <w:r>
+        <w:rPr>
+          <w:color w:val="000000"/>
+        </w:rPr>
+        <w:t>signals</w:t>
+      </w:r>
+      <w:proofErr w:type="gramEnd"/>
+      <w:r>
+        <w:rPr>
+          <w:color w:val="000000"/>
+        </w:rPr>
+        <w:t xml:space="preserve"> they don’t want any additional cards dealt to them during the current round.</w:t>
       </w:r>
     </w:p>
     <w:p>
@@ -4617,7 +4578,35 @@
         <w:rPr>
           <w:color w:val="000000"/>
         </w:rPr>
-        <w:t>Split: When a player has matching cards, they can pay to have their hand divided into two separate hands. The dealer will then deal each hand an additional card to bring the total cards in each hand to two.</w:t>
+        <w:t xml:space="preserve">Split: When a player has matching cards, they can pay to have their hand divided into two separate hands. The dealer will then </w:t>
+      </w:r>
+      <w:proofErr w:type="gramStart"/>
+      <w:r>
+        <w:rPr>
+          <w:color w:val="000000"/>
+        </w:rPr>
+        <w:t>deal</w:t>
+      </w:r>
+      <w:proofErr w:type="gramEnd"/>
+      <w:r>
+        <w:rPr>
+          <w:color w:val="000000"/>
+        </w:rPr>
+        <w:t xml:space="preserve"> each </w:t>
+      </w:r>
+      <w:proofErr w:type="gramStart"/>
+      <w:r>
+        <w:rPr>
+          <w:color w:val="000000"/>
+        </w:rPr>
+        <w:t>hand</w:t>
+      </w:r>
+      <w:proofErr w:type="gramEnd"/>
+      <w:r>
+        <w:rPr>
+          <w:color w:val="000000"/>
+        </w:rPr>
+        <w:t xml:space="preserve"> an additional card to bring the total cards in each hand to two.</w:t>
       </w:r>
     </w:p>
     <w:p>
@@ -4722,7 +4711,21 @@
         <w:rPr>
           <w:color w:val="000000"/>
         </w:rPr>
-        <w:t>Shuffling: when the order of the cards in the shoe are randomized.</w:t>
+        <w:t xml:space="preserve">Shuffling: when the order of the cards in the shoe </w:t>
+      </w:r>
+      <w:proofErr w:type="gramStart"/>
+      <w:r>
+        <w:rPr>
+          <w:color w:val="000000"/>
+        </w:rPr>
+        <w:t>are</w:t>
+      </w:r>
+      <w:proofErr w:type="gramEnd"/>
+      <w:r>
+        <w:rPr>
+          <w:color w:val="000000"/>
+        </w:rPr>
+        <w:t xml:space="preserve"> randomized.</w:t>
       </w:r>
     </w:p>
     <w:p>
@@ -4747,7 +4750,7 @@
       </w:pPr>
       <w:bookmarkStart w:id="11" w:name="__RefHeading___Toc701_1633043759"/>
       <w:bookmarkStart w:id="12" w:name="_Toc226533749"/>
-      <w:bookmarkStart w:id="13" w:name="_Toc226576870"/>
+      <w:bookmarkStart w:id="13" w:name="_Toc226577311"/>
       <w:bookmarkEnd w:id="11"/>
       <w:r>
         <w:rPr>
@@ -4785,7 +4788,7 @@
       </w:pPr>
       <w:bookmarkStart w:id="14" w:name="__RefHeading___Toc703_1633043759"/>
       <w:bookmarkStart w:id="15" w:name="_Toc226533750"/>
-      <w:bookmarkStart w:id="16" w:name="_Toc226576871"/>
+      <w:bookmarkStart w:id="16" w:name="_Toc226577312"/>
       <w:bookmarkEnd w:id="14"/>
       <w:r>
         <w:rPr>
@@ -4810,7 +4813,7 @@
       </w:pPr>
       <w:bookmarkStart w:id="17" w:name="__RefHeading___Toc705_1633043759"/>
       <w:bookmarkStart w:id="18" w:name="_Toc226533751"/>
-      <w:bookmarkStart w:id="19" w:name="_Toc226576872"/>
+      <w:bookmarkStart w:id="19" w:name="_Toc226577313"/>
       <w:bookmarkEnd w:id="17"/>
       <w:r>
         <w:rPr>
@@ -4832,7 +4835,13 @@
         <w:rPr>
           <w:color w:val="000000"/>
         </w:rPr>
-        <w:t>The system will be organized into several major elements. Of note are the Server and Client which between them contain all other elements in the application. Some elements are shared between them, such as the networking and messaging pieces. While they are both similar, there will be slight differences between the network piece on the server and the network piece on the client. Likewise, the messaging elements will contain many similarities but with some important differences to facilitate game play and other functionality within the application.</w:t>
+        <w:t>The system will be organized into several major elements. Of note are the Server and Client which between them contain all other elements in the application. Some elements are shared between them, such as the networking and messaging pieces. While they are both similar, there will be slight differences between the network piece on the server and the network piece on the client. Likewise, the messaging elements will contain many similarities but with some important differences to facilitate game play and oth</w:t>
+      </w:r>
+      <w:r>
+        <w:rPr>
+          <w:color w:val="000000"/>
+        </w:rPr>
+        <w:t>er functionality within the application.</w:t>
       </w:r>
     </w:p>
     <w:p>
@@ -4862,7 +4871,7 @@
       </w:pPr>
       <w:bookmarkStart w:id="20" w:name="__RefHeading___Toc707_1633043759"/>
       <w:bookmarkStart w:id="21" w:name="_Toc226533752"/>
-      <w:bookmarkStart w:id="22" w:name="_Toc226576873"/>
+      <w:bookmarkStart w:id="22" w:name="_Toc226577314"/>
       <w:bookmarkEnd w:id="20"/>
       <w:r>
         <w:rPr>
@@ -4908,7 +4917,7 @@
       </w:pPr>
       <w:bookmarkStart w:id="23" w:name="__RefHeading___Toc709_1633043759"/>
       <w:bookmarkStart w:id="24" w:name="_Toc226533753"/>
-      <w:bookmarkStart w:id="25" w:name="_Toc226576874"/>
+      <w:bookmarkStart w:id="25" w:name="_Toc226577315"/>
       <w:bookmarkEnd w:id="23"/>
       <w:r>
         <w:rPr>
@@ -4930,7 +4939,13 @@
         <w:rPr>
           <w:color w:val="000000"/>
         </w:rPr>
-        <w:t>The messaging component will handle the actual communication between the server and clients. Serialized content will be passed back and forth between the server and client through the networking component. Each message will be tailored to a specific task, such as handling the login and log-off sequences, the ability to add and remove funds from the players account, and most importantly the in game messages that must be passed back and forth to facilitate the correct sequence of events needed in order to choreograph player and dealer actions for smooth in-game mechanics.</w:t>
+        <w:t>The messaging component will handle the actual communication between the server and clients. Serialized content will be passed back and forth between the server and client through the networking component. Each message will be tailored to a specific task, such as handling the login and log-off sequences, the ability to add and remove funds from the players account, and most importantly the in game messages that must be passed back and forth to facilitate the correct sequence of events needed in order to cho</w:t>
+      </w:r>
+      <w:r>
+        <w:rPr>
+          <w:color w:val="000000"/>
+        </w:rPr>
+        <w:t>reograph player and dealer actions for smooth in-game mechanics.</w:t>
       </w:r>
     </w:p>
     <w:p>
@@ -4954,7 +4969,7 @@
       </w:pPr>
       <w:bookmarkStart w:id="26" w:name="__RefHeading___Toc711_1633043759"/>
       <w:bookmarkStart w:id="27" w:name="_Toc226533754"/>
-      <w:bookmarkStart w:id="28" w:name="_Toc226576875"/>
+      <w:bookmarkStart w:id="28" w:name="_Toc226577316"/>
       <w:bookmarkEnd w:id="26"/>
       <w:r>
         <w:rPr>
@@ -5024,7 +5039,13 @@
         <w:rPr>
           <w:color w:val="000000"/>
         </w:rPr>
-        <w:t xml:space="preserve">Data management primarily allows for continued game operations between server reboots. To make file management easier we plan to create one file per user. Since usernames will be unique across the application, we can generate a csv file in the format &lt;username&gt;.csv. Since we can access the username from the file itself, we only need to store the user’s password, access level (player, dealer, or developer), and the current credits in their account. While the user’s password and access level rarely change, the credits in the account will be constantly changing while a user is playing the game.  Having a separate file per user will allow us to modify multiple files simultaneously </w:t>
+        <w:t>Data management primarily allows for continued game operations between server reboots. To make file management easier we plan to create one file per user. Since usernames will be unique across the application, we can generate a csv file in the format &lt;username&gt;.csv. Since we can access the username from the file itself, we only need to store the user’s password, access level (player, dealer, or developer), and the current credits in their account. While the user’s password and access level rarely change, th</w:t>
+      </w:r>
+      <w:r>
+        <w:rPr>
+          <w:color w:val="000000"/>
+        </w:rPr>
+        <w:t xml:space="preserve">e credits in the account will be constantly changing while a user is playing the game.  Having a separate file per user will allow us to modify multiple files simultaneously </w:t>
       </w:r>
       <w:r>
         <w:rPr>
@@ -5093,7 +5114,13 @@
         <w:rPr>
           <w:color w:val="000000"/>
         </w:rPr>
-        <w:t>Account data will include a username, password, access level, and current account credits. This data will be stored in memory during active sessions but will also be written to file one every change to allow for seamless continuation between server reboots. Players will have the ability to create their accounts using the client application. While dealers and developers can also use the client to create their accounts, permissions for these accounts must be set manually by modifying the user files directly. To prevent access violations, these changes should be made between server reboots.</w:t>
+        <w:t xml:space="preserve">Account data will include a username, password, access level, and current account credits. This data will be stored in memory during active sessions but will also be written to file one every change to allow for seamless continuation between server reboots. Players will have the ability to create their accounts using the client application. While dealers and developers can also use the client to create their accounts, permissions for these accounts must be set manually by modifying the user files directly. </w:t>
+      </w:r>
+      <w:r>
+        <w:rPr>
+          <w:color w:val="000000"/>
+        </w:rPr>
+        <w:t>To prevent access violations, these changes should be made between server reboots.</w:t>
       </w:r>
     </w:p>
     <w:p>
@@ -5141,7 +5168,21 @@
         <w:rPr>
           <w:color w:val="000000"/>
         </w:rPr>
-        <w:t>Each table will be given a unique ID. It will also have a unique dealer, and a list of payer ID that can constantly change ass players join and leave the table. Each table will have specific in-game settings that the dealer sets up as the table is created. These include the minimum and maximum bets, the game timer that limits how long each play has to perform an action during their turn, and the number of decks the shoe will contain for that table.</w:t>
+        <w:t xml:space="preserve">Each table will be given a unique ID. It will also have a unique dealer, and a list of payer ID that can constantly change ass players join and leave the table. Each table will have specific in-game settings that the dealer sets up as the table is created. These include the minimum and maximum bets, the game timer that limits how long each play </w:t>
+      </w:r>
+      <w:proofErr w:type="gramStart"/>
+      <w:r>
+        <w:rPr>
+          <w:color w:val="000000"/>
+        </w:rPr>
+        <w:t>has to</w:t>
+      </w:r>
+      <w:proofErr w:type="gramEnd"/>
+      <w:r>
+        <w:rPr>
+          <w:color w:val="000000"/>
+        </w:rPr>
+        <w:t xml:space="preserve"> perform an action during their turn, and the number of decks the shoe will contain for that table.</w:t>
       </w:r>
     </w:p>
     <w:p>
@@ -5188,7 +5229,35 @@
         <w:rPr>
           <w:color w:val="000000"/>
         </w:rPr>
-        <w:t>The game will contain the shoe. Depending on how many decks the shoe contains, it will start with a shuffled list of cards equal to the number of decks times 52. The cards are dealt one at a time to each player as called for depending on the current in-game state and player or dealer requests. When a card is dealt, it is removed from the shoe and added to one of the active hands. One the round is completed, all cards in any hand are discarded and a new set of cards is dealt from the shoe. When the shoe has only 60 cards remaining in it, the current round of hands is completed and then all discarded cards are returned to the shoe and the shoe is shuffled.</w:t>
+        <w:t xml:space="preserve">The game will contain the shoe. Depending on how many decks the shoe contains, it will start with a shuffled list of cards equal to the number of decks times 52. The cards are </w:t>
+      </w:r>
+      <w:proofErr w:type="gramStart"/>
+      <w:r>
+        <w:rPr>
+          <w:color w:val="000000"/>
+        </w:rPr>
+        <w:t>dealt</w:t>
+      </w:r>
+      <w:proofErr w:type="gramEnd"/>
+      <w:r>
+        <w:rPr>
+          <w:color w:val="000000"/>
+        </w:rPr>
+        <w:t xml:space="preserve"> one at a time to each player as called for depending on the current in-game state and player or dealer requests. When a card is </w:t>
+      </w:r>
+      <w:proofErr w:type="gramStart"/>
+      <w:r>
+        <w:rPr>
+          <w:color w:val="000000"/>
+        </w:rPr>
+        <w:t>dealt</w:t>
+      </w:r>
+      <w:proofErr w:type="gramEnd"/>
+      <w:r>
+        <w:rPr>
+          <w:color w:val="000000"/>
+        </w:rPr>
+        <w:t>, it is removed from the shoe and added to one of the active hands. One the round is completed, all cards in any hand are discarded and a new set of cards is dealt from the shoe. When the shoe has only 60 cards remaining in it, the current round of hands is completed and then all discarded cards are returned to the shoe and the shoe is shuffled.</w:t>
       </w:r>
     </w:p>
     <w:p>
@@ -5239,7 +5308,7 @@
         </w:rPr>
       </w:pPr>
       <w:bookmarkStart w:id="29" w:name="_Toc226533755"/>
-      <w:bookmarkStart w:id="30" w:name="_Toc226576876"/>
+      <w:bookmarkStart w:id="30" w:name="_Toc226577317"/>
       <w:r>
         <w:rPr>
           <w:color w:val="000000"/>
@@ -5317,7 +5386,13 @@
         <w:rPr>
           <w:color w:val="000000"/>
         </w:rPr>
-        <w:t>The primary purpose of the client is to provide an intuitive display that relays real-time status of the different elements for the game to function while also providing an intuitive interface that allows the player or dealer to perform and desired actions while using the application. This is handled through the graphical user interface.  To accomplish this goal multiple display interfaces will be created that allow the user to switch between them. The initial screen will ask a player or dealer for their login credentials, and the IP address of the server they wish to connect to.</w:t>
+        <w:t>The primary purpose of the client is to provide an intuitive display that relays real-time status of the different elements for the game to function while also providing an intuitive interface that allows the player or dealer to perform and desired actions while using the application. This is handled through the graphical user interface.  To accomplish this goal multiple display interfaces will be created that allow the user to switch between them. The initial screen will ask a player or dealer for their lo</w:t>
+      </w:r>
+      <w:r>
+        <w:rPr>
+          <w:color w:val="000000"/>
+        </w:rPr>
+        <w:t>gin credentials, and the IP address of the server they wish to connect to.</w:t>
       </w:r>
     </w:p>
     <w:p>
@@ -5355,7 +5430,7 @@
       </w:pPr>
       <w:bookmarkStart w:id="31" w:name="__RefHeading___Toc715_1633043759"/>
       <w:bookmarkStart w:id="32" w:name="_Toc226533756"/>
-      <w:bookmarkStart w:id="33" w:name="_Toc226576877"/>
+      <w:bookmarkStart w:id="33" w:name="_Toc226577318"/>
       <w:bookmarkEnd w:id="31"/>
       <w:r>
         <w:rPr>
@@ -5386,7 +5461,7 @@
       </w:pPr>
       <w:bookmarkStart w:id="34" w:name="__RefHeading___Toc717_1633043759"/>
       <w:bookmarkStart w:id="35" w:name="_Toc226533757"/>
-      <w:bookmarkStart w:id="36" w:name="_Toc226576878"/>
+      <w:bookmarkStart w:id="36" w:name="_Toc226577319"/>
       <w:bookmarkEnd w:id="34"/>
       <w:r>
         <w:rPr>
@@ -5560,7 +5635,7 @@
       </w:pPr>
       <w:bookmarkStart w:id="37" w:name="__RefHeading___Toc719_1633043759"/>
       <w:bookmarkStart w:id="38" w:name="_Toc226533758"/>
-      <w:bookmarkStart w:id="39" w:name="_Toc226576879"/>
+      <w:bookmarkStart w:id="39" w:name="_Toc226577320"/>
       <w:bookmarkEnd w:id="37"/>
       <w:r>
         <w:rPr>
@@ -5635,7 +5710,21 @@
           <w:color w:val="000000"/>
         </w:rPr>
         <w:br/>
-        <w:t xml:space="preserve">The GUI dynamically adjusts available controls and views depending on whether the user is a player or dealer. This ensures users only see relevant actions and reduces complexity during interaction. </w:t>
+        <w:t xml:space="preserve">The GUI dynamically adjusts available controls and views depending on whether the user is a player or dealer. This ensures users only see relevant actions and </w:t>
+      </w:r>
+      <w:proofErr w:type="gramStart"/>
+      <w:r>
+        <w:rPr>
+          <w:color w:val="000000"/>
+        </w:rPr>
+        <w:t>reduces</w:t>
+      </w:r>
+      <w:proofErr w:type="gramEnd"/>
+      <w:r>
+        <w:rPr>
+          <w:color w:val="000000"/>
+        </w:rPr>
+        <w:t xml:space="preserve"> complexity during interaction. </w:t>
       </w:r>
     </w:p>
     <w:p>
@@ -5842,7 +5931,7 @@
       <w:bookmarkStart w:id="40" w:name="__RefHeading___Toc721_1633043759"/>
       <w:bookmarkStart w:id="41" w:name="_Toc226533766"/>
       <w:bookmarkStart w:id="42" w:name="GUI_Diagrams"/>
-      <w:bookmarkStart w:id="43" w:name="_Toc226576880"/>
+      <w:bookmarkStart w:id="43" w:name="_Toc226577321"/>
       <w:bookmarkEnd w:id="40"/>
       <w:r>
         <w:rPr>
@@ -6053,7 +6142,7 @@
           <w:color w:val="000000"/>
         </w:rPr>
         <w:drawing>
-          <wp:anchor distT="0" distB="0" distL="0" distR="0" simplePos="0" relativeHeight="251629568" behindDoc="0" locked="0" layoutInCell="0" allowOverlap="1" wp14:anchorId="4BE26D6B" wp14:editId="7CF2B34D">
+          <wp:anchor distT="0" distB="0" distL="0" distR="0" simplePos="0" relativeHeight="251625984" behindDoc="0" locked="0" layoutInCell="0" allowOverlap="1" wp14:anchorId="4BE26D6B" wp14:editId="7CF2B34D">
             <wp:simplePos x="0" y="0"/>
             <wp:positionH relativeFrom="column">
               <wp:align>center</wp:align>
@@ -6173,11 +6262,19 @@
           <w:color w:val="000000"/>
         </w:rPr>
       </w:pPr>
-      <w:r>
-        <w:rPr>
-          <w:color w:val="000000"/>
-        </w:rPr>
-        <w:t xml:space="preserve">Allows players to join tables or navigate to other system features </w:t>
+      <w:proofErr w:type="gramStart"/>
+      <w:r>
+        <w:rPr>
+          <w:color w:val="000000"/>
+        </w:rPr>
+        <w:t>Allows</w:t>
+      </w:r>
+      <w:proofErr w:type="gramEnd"/>
+      <w:r>
+        <w:rPr>
+          <w:color w:val="000000"/>
+        </w:rPr>
+        <w:t xml:space="preserve"> players to join tables or navigate to other system features </w:t>
       </w:r>
     </w:p>
     <w:p>
@@ -6301,7 +6398,7 @@
           <w:color w:val="000000"/>
         </w:rPr>
         <w:drawing>
-          <wp:anchor distT="0" distB="0" distL="0" distR="0" simplePos="0" relativeHeight="251630592" behindDoc="0" locked="0" layoutInCell="0" allowOverlap="1" wp14:anchorId="4F47D43D" wp14:editId="11A60825">
+          <wp:anchor distT="0" distB="0" distL="0" distR="0" simplePos="0" relativeHeight="251628032" behindDoc="0" locked="0" layoutInCell="0" allowOverlap="1" wp14:anchorId="4F47D43D" wp14:editId="11A60825">
             <wp:simplePos x="0" y="0"/>
             <wp:positionH relativeFrom="column">
               <wp:align>center</wp:align>
@@ -6694,7 +6791,21 @@
         <w:rPr>
           <w:color w:val="000000"/>
         </w:rPr>
-        <w:t>The layout mirrors a real blackjack table, with player positioning indicating turn order and interaction flow. The difference for the dealer-sided flow of logging in is that they will immediately be met with the table screen, first in a settings configuration setup with adjustable parameters, then as a table upon completing the configuration.</w:t>
+        <w:t xml:space="preserve">The layout mirrors a real blackjack table, with player positioning indicating turn order and interaction flow. The difference for the dealer-sided flow of logging in is that they will immediately </w:t>
+      </w:r>
+      <w:proofErr w:type="gramStart"/>
+      <w:r>
+        <w:rPr>
+          <w:color w:val="000000"/>
+        </w:rPr>
+        <w:t>be met</w:t>
+      </w:r>
+      <w:proofErr w:type="gramEnd"/>
+      <w:r>
+        <w:rPr>
+          <w:color w:val="000000"/>
+        </w:rPr>
+        <w:t xml:space="preserve"> with the table screen, first in a settings configuration setup with adjustable parameters, then as a table upon completing the configuration.</w:t>
       </w:r>
     </w:p>
     <w:p>
@@ -6720,7 +6831,7 @@
         </w:rPr>
         <w:lastRenderedPageBreak/>
         <w:drawing>
-          <wp:anchor distT="0" distB="0" distL="0" distR="0" simplePos="0" relativeHeight="251631616" behindDoc="0" locked="0" layoutInCell="0" allowOverlap="1" wp14:anchorId="29934112" wp14:editId="113409E9">
+          <wp:anchor distT="0" distB="0" distL="0" distR="0" simplePos="0" relativeHeight="251630080" behindDoc="0" locked="0" layoutInCell="0" allowOverlap="1" wp14:anchorId="29934112" wp14:editId="113409E9">
             <wp:simplePos x="0" y="0"/>
             <wp:positionH relativeFrom="column">
               <wp:align>center</wp:align>
@@ -6781,7 +6892,7 @@
       </w:pPr>
       <w:bookmarkStart w:id="44" w:name="__RefHeading___Toc723_1633043759"/>
       <w:bookmarkStart w:id="45" w:name="_Toc226533767"/>
-      <w:bookmarkStart w:id="46" w:name="_Toc226576881"/>
+      <w:bookmarkStart w:id="46" w:name="_Toc226577322"/>
       <w:bookmarkEnd w:id="44"/>
       <w:r>
         <w:rPr>
@@ -6811,7 +6922,21 @@
           <w:color w:val="000000"/>
         </w:rPr>
         <w:tab/>
-        <w:t>The graphical user interface is organized using a modular, panel-based structure that supports dynamic content updates and separation of concerns between different functional areas. Each primary screen (login, lobby, and table) is composed of reusable interface regions that can be updated or replaced without requiring a full screen transition. This allows the client to respond efficiently to real-time updates from the server while maintaining a consistent user experience.</w:t>
+        <w:t xml:space="preserve">The graphical user interface is organized using a modular, panel-based structure that supports dynamic content updates and separation of concerns between different functional areas. Each primary screen (login, lobby, and table) is composed of reusable interface regions that can be updated or replaced without requiring a full screen transition. This allows the client to respond efficiently to real-time updates from the server while maintaining </w:t>
+      </w:r>
+      <w:proofErr w:type="gramStart"/>
+      <w:r>
+        <w:rPr>
+          <w:color w:val="000000"/>
+        </w:rPr>
+        <w:t>a consistent</w:t>
+      </w:r>
+      <w:proofErr w:type="gramEnd"/>
+      <w:r>
+        <w:rPr>
+          <w:color w:val="000000"/>
+        </w:rPr>
+        <w:t xml:space="preserve"> user experience.</w:t>
       </w:r>
     </w:p>
     <w:p>
@@ -6872,7 +6997,7 @@
       </w:pPr>
       <w:bookmarkStart w:id="47" w:name="__RefHeading___Toc725_1633043759"/>
       <w:bookmarkStart w:id="48" w:name="_Toc226533768"/>
-      <w:bookmarkStart w:id="49" w:name="_Toc226576882"/>
+      <w:bookmarkStart w:id="49" w:name="_Toc226577323"/>
       <w:bookmarkEnd w:id="47"/>
       <w:r>
         <w:rPr>
@@ -6903,7 +7028,7 @@
       </w:pPr>
       <w:bookmarkStart w:id="50" w:name="__RefHeading___Toc727_1633043759"/>
       <w:bookmarkStart w:id="51" w:name="_Toc226533769"/>
-      <w:bookmarkStart w:id="52" w:name="_Toc226576883"/>
+      <w:bookmarkStart w:id="52" w:name="_Toc226577324"/>
       <w:bookmarkEnd w:id="50"/>
       <w:r>
         <w:rPr>
@@ -6933,7 +7058,7 @@
           <w:color w:val="000000"/>
         </w:rPr>
         <w:drawing>
-          <wp:anchor distT="0" distB="0" distL="114300" distR="114300" simplePos="0" relativeHeight="251666432" behindDoc="0" locked="0" layoutInCell="0" allowOverlap="1" wp14:anchorId="146CF63B" wp14:editId="332EECF5">
+          <wp:anchor distT="0" distB="0" distL="114300" distR="114300" simplePos="0" relativeHeight="251670016" behindDoc="0" locked="0" layoutInCell="0" allowOverlap="1" wp14:anchorId="146CF63B" wp14:editId="332EECF5">
             <wp:simplePos x="0" y="0"/>
             <wp:positionH relativeFrom="column">
               <wp:posOffset>419100</wp:posOffset>
@@ -6993,7 +7118,15 @@
         <w:ind w:left="720"/>
       </w:pPr>
       <w:r>
-        <w:t>The use case diagram is showing the expected output of each user action.</w:t>
+        <w:t xml:space="preserve">The use case diagram </w:t>
+      </w:r>
+      <w:proofErr w:type="gramStart"/>
+      <w:r>
+        <w:t>is showing</w:t>
+      </w:r>
+      <w:proofErr w:type="gramEnd"/>
+      <w:r>
+        <w:t xml:space="preserve"> the expected output of each user action.</w:t>
       </w:r>
     </w:p>
     <w:p>
@@ -7001,7 +7134,15 @@
         <w:ind w:left="720"/>
       </w:pPr>
       <w:r>
-        <w:t>For the player, the player begins in the login screen with 2 separate actions. The player is sent to</w:t>
+        <w:t xml:space="preserve">For the player, the player begins </w:t>
+      </w:r>
+      <w:proofErr w:type="gramStart"/>
+      <w:r>
+        <w:t>in</w:t>
+      </w:r>
+      <w:proofErr w:type="gramEnd"/>
+      <w:r>
+        <w:t xml:space="preserve"> the login screen with 2 separate actions. The player is sent to</w:t>
       </w:r>
     </w:p>
     <w:p>
@@ -7009,7 +7150,15 @@
         <w:ind w:left="720"/>
       </w:pPr>
       <w:r>
-        <w:t>the lobby where they are able to add funds to their account or cash out their whole account. They</w:t>
+        <w:t xml:space="preserve">the lobby where they </w:t>
+      </w:r>
+      <w:proofErr w:type="gramStart"/>
+      <w:r>
+        <w:t>are able to</w:t>
+      </w:r>
+      <w:proofErr w:type="gramEnd"/>
+      <w:r>
+        <w:t xml:space="preserve"> add funds to their account or cash out their whole account. They</w:t>
       </w:r>
     </w:p>
     <w:p>
@@ -7017,7 +7166,15 @@
         <w:ind w:left="720"/>
       </w:pPr>
       <w:r>
-        <w:t>will also be able to select which table they want to play in. The table screen is where the player</w:t>
+        <w:t xml:space="preserve">will also be able to select which table they want to play </w:t>
+      </w:r>
+      <w:proofErr w:type="gramStart"/>
+      <w:r>
+        <w:t>in</w:t>
+      </w:r>
+      <w:proofErr w:type="gramEnd"/>
+      <w:r>
+        <w:t>. The table screen is where the player</w:t>
       </w:r>
     </w:p>
     <w:p>
@@ -7033,7 +7190,15 @@
         <w:ind w:left="720"/>
       </w:pPr>
       <w:r>
-        <w:t>The dealer will also begin in the login screen but will skip the lobby entirely. They will be</w:t>
+        <w:t xml:space="preserve">The dealer will also begin </w:t>
+      </w:r>
+      <w:proofErr w:type="gramStart"/>
+      <w:r>
+        <w:t>in</w:t>
+      </w:r>
+      <w:proofErr w:type="gramEnd"/>
+      <w:r>
+        <w:t xml:space="preserve"> the login screen but will skip the lobby entirely. They will be</w:t>
       </w:r>
     </w:p>
     <w:p>
@@ -7041,7 +7206,15 @@
         <w:ind w:left="720"/>
       </w:pPr>
       <w:r>
-        <w:t>responsible with setting up the table and opening for players waiting in the lobby. During the</w:t>
+        <w:t xml:space="preserve">responsible </w:t>
+      </w:r>
+      <w:proofErr w:type="gramStart"/>
+      <w:r>
+        <w:t>with</w:t>
+      </w:r>
+      <w:proofErr w:type="gramEnd"/>
+      <w:r>
+        <w:t xml:space="preserve"> setting up the table and opening for players waiting in the lobby. During the</w:t>
       </w:r>
     </w:p>
     <w:p>
@@ -7084,7 +7257,7 @@
       </w:pPr>
       <w:bookmarkStart w:id="53" w:name="__RefHeading___Toc729_1633043759"/>
       <w:bookmarkStart w:id="54" w:name="_Toc226533770"/>
-      <w:bookmarkStart w:id="55" w:name="_Toc226576884"/>
+      <w:bookmarkStart w:id="55" w:name="_Toc226577325"/>
       <w:bookmarkEnd w:id="53"/>
       <w:r>
         <w:rPr>
@@ -7139,7 +7312,7 @@
           <w:noProof/>
         </w:rPr>
         <w:drawing>
-          <wp:anchor distT="0" distB="0" distL="0" distR="0" simplePos="0" relativeHeight="251640832" behindDoc="0" locked="0" layoutInCell="0" allowOverlap="1" wp14:anchorId="2A453D56" wp14:editId="3D4EC6E9">
+          <wp:anchor distT="0" distB="0" distL="0" distR="0" simplePos="0" relativeHeight="251641344" behindDoc="0" locked="0" layoutInCell="0" allowOverlap="1" wp14:anchorId="2A453D56" wp14:editId="3D4EC6E9">
             <wp:simplePos x="0" y="0"/>
             <wp:positionH relativeFrom="column">
               <wp:posOffset>1314450</wp:posOffset>
@@ -7215,7 +7388,13 @@
         <w:rPr>
           <w:color w:val="000000"/>
         </w:rPr>
-        <w:t>This diagram shows the sequence for account creation. Whenever a user creates an</w:t>
+        <w:t>This diagram</w:t>
+      </w:r>
+      <w:r>
+        <w:rPr>
+          <w:color w:val="000000"/>
+        </w:rPr>
+        <w:t xml:space="preserve"> shows the sequence for account creation. Whenever a user creates an</w:t>
       </w:r>
     </w:p>
     <w:p>
@@ -7255,7 +7434,7 @@
         </w:rPr>
         <w:tab/>
       </w:r>
-      <w:bookmarkStart w:id="56" w:name="_Toc226576885"/>
+      <w:bookmarkStart w:id="56" w:name="_Toc226577326"/>
       <w:r>
         <w:rPr>
           <w:color w:val="000000"/>
@@ -7282,7 +7461,7 @@
           <w:color w:val="000000"/>
         </w:rPr>
         <w:drawing>
-          <wp:anchor distT="0" distB="0" distL="0" distR="0" simplePos="0" relativeHeight="251648000" behindDoc="0" locked="0" layoutInCell="0" allowOverlap="1" wp14:anchorId="1231BB1A" wp14:editId="18E3A1D9">
+          <wp:anchor distT="0" distB="0" distL="0" distR="0" simplePos="0" relativeHeight="251649536" behindDoc="0" locked="0" layoutInCell="0" allowOverlap="1" wp14:anchorId="1231BB1A" wp14:editId="18E3A1D9">
             <wp:simplePos x="0" y="0"/>
             <wp:positionH relativeFrom="column">
               <wp:posOffset>457200</wp:posOffset>
@@ -7373,14 +7552,14 @@
           <w:color w:val="000000"/>
         </w:rPr>
       </w:pPr>
-      <w:bookmarkStart w:id="60" w:name="_Toc226576886"/>
+      <w:bookmarkStart w:id="60" w:name="_Toc226577327"/>
       <w:r>
         <w:rPr>
           <w:noProof/>
           <w:color w:val="000000"/>
         </w:rPr>
         <w:drawing>
-          <wp:anchor distT="0" distB="0" distL="0" distR="0" simplePos="0" relativeHeight="251639808" behindDoc="0" locked="0" layoutInCell="0" allowOverlap="1" wp14:anchorId="6FC4CDA8" wp14:editId="59574811">
+          <wp:anchor distT="0" distB="0" distL="0" distR="0" simplePos="0" relativeHeight="251639296" behindDoc="0" locked="0" layoutInCell="0" allowOverlap="1" wp14:anchorId="6FC4CDA8" wp14:editId="59574811">
             <wp:simplePos x="0" y="0"/>
             <wp:positionH relativeFrom="column">
               <wp:posOffset>504825</wp:posOffset>
@@ -7517,7 +7696,7 @@
           <w:color w:val="000000"/>
         </w:rPr>
       </w:pPr>
-      <w:bookmarkStart w:id="61" w:name="_Toc226576887"/>
+      <w:bookmarkStart w:id="61" w:name="_Toc226577328"/>
       <w:r>
         <w:rPr>
           <w:noProof/>
@@ -7525,7 +7704,7 @@
         </w:rPr>
         <w:lastRenderedPageBreak/>
         <w:drawing>
-          <wp:anchor distT="0" distB="0" distL="0" distR="0" simplePos="0" relativeHeight="251665408" behindDoc="0" locked="0" layoutInCell="0" allowOverlap="1" wp14:anchorId="2177A972" wp14:editId="37E2D351">
+          <wp:anchor distT="0" distB="0" distL="0" distR="0" simplePos="0" relativeHeight="251667968" behindDoc="0" locked="0" layoutInCell="0" allowOverlap="1" wp14:anchorId="2177A972" wp14:editId="37E2D351">
             <wp:simplePos x="0" y="0"/>
             <wp:positionH relativeFrom="column">
               <wp:posOffset>95250</wp:posOffset>
@@ -7577,15 +7756,19 @@
         </w:rPr>
         <w:t xml:space="preserve">4.2.4: Dealer pre-game </w:t>
       </w:r>
-      <w:bookmarkStart w:id="62" w:name="_Toc226576888"/>
+      <w:r>
+        <w:rPr>
+          <w:color w:val="000000"/>
+        </w:rPr>
+        <w:t>Sequence</w:t>
+      </w:r>
       <w:bookmarkEnd w:id="61"/>
       <w:r>
         <w:rPr>
           <w:color w:val="000000"/>
         </w:rPr>
-        <w:t xml:space="preserve">Sequence </w:t>
-      </w:r>
-      <w:bookmarkEnd w:id="62"/>
+        <w:t xml:space="preserve"> </w:t>
+      </w:r>
     </w:p>
     <w:p>
       <w:pPr>
@@ -7596,7 +7779,6 @@
           <w:sz w:val="24"/>
         </w:rPr>
       </w:pPr>
-      <w:bookmarkStart w:id="63" w:name="_Toc226576890"/>
       <w:r>
         <w:rPr>
           <w:color w:val="000000"/>
@@ -7616,13 +7798,14 @@
           <w:color w:val="000000"/>
         </w:rPr>
       </w:pPr>
+      <w:bookmarkStart w:id="62" w:name="_Toc226577329"/>
       <w:r>
         <w:rPr>
           <w:noProof/>
         </w:rPr>
         <w:lastRenderedPageBreak/>
         <w:drawing>
-          <wp:anchor distT="0" distB="0" distL="114300" distR="114300" simplePos="0" relativeHeight="251685888" behindDoc="0" locked="0" layoutInCell="0" allowOverlap="1" wp14:anchorId="16B9D1E2" wp14:editId="7BC92EFE">
+          <wp:anchor distT="0" distB="0" distL="114300" distR="114300" simplePos="0" relativeHeight="251690496" behindDoc="0" locked="0" layoutInCell="0" allowOverlap="1" wp14:anchorId="16B9D1E2" wp14:editId="7BC92EFE">
             <wp:simplePos x="0" y="0"/>
             <wp:positionH relativeFrom="column">
               <wp:posOffset>760095</wp:posOffset>
@@ -7680,7 +7863,7 @@
         </w:rPr>
         <w:t>4.2.5: Dealer in-game Sequence</w:t>
       </w:r>
-      <w:bookmarkEnd w:id="63"/>
+      <w:bookmarkEnd w:id="62"/>
     </w:p>
     <w:p/>
     <w:p/>
@@ -7744,7 +7927,7 @@
           <w:color w:val="000000"/>
         </w:rPr>
       </w:pPr>
-      <w:bookmarkStart w:id="64" w:name="_Toc226576891"/>
+      <w:bookmarkStart w:id="63" w:name="_Toc226577330"/>
       <w:r>
         <w:rPr>
           <w:color w:val="000000"/>
@@ -7765,7 +7948,7 @@
         </w:rPr>
         <w:t>ommon &amp; Intended User Interfacing Flow</w:t>
       </w:r>
-      <w:bookmarkEnd w:id="64"/>
+      <w:bookmarkEnd w:id="63"/>
       <w:r>
         <w:rPr>
           <w:color w:val="000000"/>
@@ -7784,7 +7967,21 @@
         <w:rPr>
           <w:color w:val="000000"/>
         </w:rPr>
-        <w:t>While identifying the main user sequences and common use cases, we put the primary game loop/sequence as our priority. In addressing that design in conjunction with the primary goal of approaching the client/server structure problem, we felt it was necessary to keep the most consistently accessed set of actions and outcomes at the top of our minds while moving towards implementation to ensure the smoothness and real-time responsiveness the program aims to deliver on.</w:t>
+        <w:t xml:space="preserve">While identifying the main user sequences and common use cases, we put the primary game loop/sequence as our priority. In addressing that design in conjunction with the primary goal of approaching the client/server structure problem, we felt it was necessary to keep the most consistently accessed set of actions and outcomes at the top of our minds while moving towards implementation to ensure </w:t>
+      </w:r>
+      <w:proofErr w:type="gramStart"/>
+      <w:r>
+        <w:rPr>
+          <w:color w:val="000000"/>
+        </w:rPr>
+        <w:t>the smoothness</w:t>
+      </w:r>
+      <w:proofErr w:type="gramEnd"/>
+      <w:r>
+        <w:rPr>
+          <w:color w:val="000000"/>
+        </w:rPr>
+        <w:t xml:space="preserve"> and real-time responsiveness the program aims to deliver on.</w:t>
       </w:r>
     </w:p>
     <w:p>
@@ -7799,7 +7996,35 @@
           <w:color w:val="000000"/>
         </w:rPr>
         <w:tab/>
-        <w:t>For future considerations and the development of this Blackjack Handling System, on top of solidifying the game logic according to standard casino rules, the program design will be built upon with considerations to efficiently and seamlessly providing a multi-threaded server to clients gameplay experience.</w:t>
+        <w:t xml:space="preserve">For future considerations and the development of this Blackjack Handling System, on top of solidifying the game logic according to standard casino rules, the program design will be built upon with considerations to efficiently and seamlessly </w:t>
+      </w:r>
+      <w:proofErr w:type="gramStart"/>
+      <w:r>
+        <w:rPr>
+          <w:color w:val="000000"/>
+        </w:rPr>
+        <w:t>providing</w:t>
+      </w:r>
+      <w:proofErr w:type="gramEnd"/>
+      <w:r>
+        <w:rPr>
+          <w:color w:val="000000"/>
+        </w:rPr>
+        <w:t xml:space="preserve"> a multi-threaded server to </w:t>
+      </w:r>
+      <w:proofErr w:type="gramStart"/>
+      <w:r>
+        <w:rPr>
+          <w:color w:val="000000"/>
+        </w:rPr>
+        <w:t>clients</w:t>
+      </w:r>
+      <w:proofErr w:type="gramEnd"/>
+      <w:r>
+        <w:rPr>
+          <w:color w:val="000000"/>
+        </w:rPr>
+        <w:t xml:space="preserve"> gameplay experience.</w:t>
       </w:r>
     </w:p>
     <w:p>

</xml_diff>